<commit_message>
add instructions on how to conduct a full code review
</commit_message>
<xml_diff>
--- a/Push-Swap Workflow.docx
+++ b/Push-Swap Workflow.docx
@@ -699,7 +699,7 @@
           <w14:ligatures w14:val="standardContextual"/>
         </w:rPr>
         <w:pict>
-          <v:rect id="_x0000_i1038" alt="" style="width:453.6pt;height:.05pt;mso-width-percent:0;mso-height-percent:0;mso-width-percent:0;mso-height-percent:0" o:hralign="center" o:hrstd="t" o:hr="t" fillcolor="#a0a0a0" stroked="f"/>
+          <v:rect id="_x0000_i1039" alt="" style="width:453.6pt;height:.05pt;mso-width-percent:0;mso-height-percent:0;mso-width-percent:0;mso-height-percent:0" o:hralign="center" o:hrstd="t" o:hr="t" fillcolor="#a0a0a0" stroked="f"/>
         </w:pict>
       </w:r>
     </w:p>
@@ -1311,7 +1311,7 @@
           <w14:ligatures w14:val="standardContextual"/>
         </w:rPr>
         <w:pict>
-          <v:rect id="_x0000_i1037" alt="" style="width:453.6pt;height:.05pt;mso-width-percent:0;mso-height-percent:0;mso-width-percent:0;mso-height-percent:0" o:hralign="center" o:hrstd="t" o:hr="t" fillcolor="#a0a0a0" stroked="f"/>
+          <v:rect id="_x0000_i1038" alt="" style="width:453.6pt;height:.05pt;mso-width-percent:0;mso-height-percent:0;mso-width-percent:0;mso-height-percent:0" o:hralign="center" o:hrstd="t" o:hr="t" fillcolor="#a0a0a0" stroked="f"/>
         </w:pict>
       </w:r>
     </w:p>
@@ -1728,7 +1728,7 @@
           <w14:ligatures w14:val="standardContextual"/>
         </w:rPr>
         <w:pict>
-          <v:rect id="_x0000_i1036" alt="" style="width:453.6pt;height:.05pt;mso-width-percent:0;mso-height-percent:0;mso-width-percent:0;mso-height-percent:0" o:hralign="center" o:hrstd="t" o:hr="t" fillcolor="#a0a0a0" stroked="f"/>
+          <v:rect id="_x0000_i1037" alt="" style="width:453.6pt;height:.05pt;mso-width-percent:0;mso-height-percent:0;mso-width-percent:0;mso-height-percent:0" o:hralign="center" o:hrstd="t" o:hr="t" fillcolor="#a0a0a0" stroked="f"/>
         </w:pict>
       </w:r>
     </w:p>
@@ -2399,7 +2399,7 @@
           <w14:ligatures w14:val="standardContextual"/>
         </w:rPr>
         <w:pict>
-          <v:rect id="_x0000_i1035" alt="" style="width:453.6pt;height:.05pt;mso-width-percent:0;mso-height-percent:0;mso-width-percent:0;mso-height-percent:0" o:hralign="center" o:hrstd="t" o:hr="t" fillcolor="#a0a0a0" stroked="f"/>
+          <v:rect id="_x0000_i1036" alt="" style="width:453.6pt;height:.05pt;mso-width-percent:0;mso-height-percent:0;mso-width-percent:0;mso-height-percent:0" o:hralign="center" o:hrstd="t" o:hr="t" fillcolor="#a0a0a0" stroked="f"/>
         </w:pict>
       </w:r>
     </w:p>
@@ -2601,7 +2601,7 @@
           <w14:ligatures w14:val="standardContextual"/>
         </w:rPr>
         <w:pict>
-          <v:rect id="_x0000_i1034" alt="" style="width:453.6pt;height:.05pt;mso-width-percent:0;mso-height-percent:0;mso-width-percent:0;mso-height-percent:0" o:hralign="center" o:hrstd="t" o:hr="t" fillcolor="#a0a0a0" stroked="f"/>
+          <v:rect id="_x0000_i1035" alt="" style="width:453.6pt;height:.05pt;mso-width-percent:0;mso-height-percent:0;mso-width-percent:0;mso-height-percent:0" o:hralign="center" o:hrstd="t" o:hr="t" fillcolor="#a0a0a0" stroked="f"/>
         </w:pict>
       </w:r>
     </w:p>
@@ -3237,7 +3237,7 @@
         </w:rPr>
         <w:lastRenderedPageBreak/>
         <w:pict>
-          <v:rect id="_x0000_i1033" alt="" style="width:453.6pt;height:.05pt;mso-width-percent:0;mso-height-percent:0;mso-width-percent:0;mso-height-percent:0" o:hralign="center" o:hrstd="t" o:hr="t" fillcolor="#a0a0a0" stroked="f"/>
+          <v:rect id="_x0000_i1034" alt="" style="width:453.6pt;height:.05pt;mso-width-percent:0;mso-height-percent:0;mso-width-percent:0;mso-height-percent:0" o:hralign="center" o:hrstd="t" o:hr="t" fillcolor="#a0a0a0" stroked="f"/>
         </w:pict>
       </w:r>
     </w:p>
@@ -4062,14 +4062,7 @@
           <w:rStyle w:val="KdHTML"/>
           <w:color w:val="000000"/>
         </w:rPr>
-        <w:t xml:space="preserve"> </w:t>
-      </w:r>
-      <w:r>
-        <w:rPr>
-          <w:rStyle w:val="KdHTML"/>
-          <w:color w:val="000000"/>
-        </w:rPr>
-        <w:t>add .</w:t>
+        <w:t xml:space="preserve"> add .</w:t>
       </w:r>
     </w:p>
     <w:p>
@@ -4093,14 +4086,7 @@
           <w:rStyle w:val="KdHTML"/>
           <w:color w:val="000000"/>
         </w:rPr>
-        <w:t xml:space="preserve"> </w:t>
-      </w:r>
-      <w:r>
-        <w:rPr>
-          <w:rStyle w:val="KdHTML"/>
-          <w:color w:val="000000"/>
-        </w:rPr>
-        <w:t>commit</w:t>
+        <w:t xml:space="preserve"> commit</w:t>
       </w:r>
     </w:p>
     <w:p>
@@ -4366,13 +4352,7 @@
         <w:rPr>
           <w:color w:val="000000"/>
         </w:rPr>
-        <w:t>If not, it’s enough to use</w:t>
-      </w:r>
-      <w:r>
-        <w:rPr>
-          <w:color w:val="000000"/>
-        </w:rPr>
-        <w:t>:</w:t>
+        <w:t>If not, it’s enough to use:</w:t>
       </w:r>
     </w:p>
     <w:p>
@@ -5152,13 +5132,7 @@
         <w:rPr>
           <w:color w:val="000000"/>
         </w:rPr>
-        <w:t xml:space="preserve"> to </w:t>
-      </w:r>
-      <w:r>
-        <w:rPr>
-          <w:color w:val="000000"/>
-        </w:rPr>
-        <w:t>your feature branch</w:t>
+        <w:t xml:space="preserve"> to your feature branch</w:t>
       </w:r>
       <w:r>
         <w:rPr>
@@ -5209,25 +5183,7 @@
         <w:rPr>
           <w:color w:val="000000"/>
         </w:rPr>
-        <w:t xml:space="preserve"> </w:t>
-      </w:r>
-      <w:r>
-        <w:rPr>
-          <w:color w:val="000000"/>
-        </w:rPr>
-        <w:t>the refactor branch</w:t>
-      </w:r>
-      <w:r>
-        <w:rPr>
-          <w:color w:val="000000"/>
-        </w:rPr>
-        <w:t xml:space="preserve"> with </w:t>
-      </w:r>
-      <w:r>
-        <w:rPr>
-          <w:color w:val="000000"/>
-        </w:rPr>
-        <w:t>your feature branch</w:t>
+        <w:t xml:space="preserve"> the refactor branch with your feature branch</w:t>
       </w:r>
       <w:r>
         <w:rPr>
@@ -5306,13 +5262,7 @@
         <w:rPr>
           <w:color w:val="000000"/>
         </w:rPr>
-        <w:t>your feature branch</w:t>
-      </w:r>
-      <w:r>
-        <w:rPr>
-          <w:color w:val="000000"/>
-        </w:rPr>
-        <w:t xml:space="preserve"> </w:t>
+        <w:t xml:space="preserve">your feature branch </w:t>
       </w:r>
       <w:r>
         <w:rPr>
@@ -5372,13 +5322,7 @@
         <w:rPr>
           <w:color w:val="000000"/>
         </w:rPr>
-        <w:t>your feature branch</w:t>
-      </w:r>
-      <w:r>
-        <w:rPr>
-          <w:color w:val="000000"/>
-        </w:rPr>
-        <w:t xml:space="preserve"> </w:t>
+        <w:t xml:space="preserve">your feature branch </w:t>
       </w:r>
       <w:r>
         <w:rPr>
@@ -6735,7 +6679,19 @@
         <w:rPr>
           <w:color w:val="000000"/>
         </w:rPr>
-        <w:t xml:space="preserve">Now Carlotta </w:t>
+        <w:t xml:space="preserve">Now </w:t>
+      </w:r>
+      <w:r>
+        <w:rPr>
+          <w:color w:val="000000"/>
+        </w:rPr>
+        <w:t>your teammate</w:t>
+      </w:r>
+      <w:r>
+        <w:rPr>
+          <w:color w:val="000000"/>
+        </w:rPr>
+        <w:t xml:space="preserve"> </w:t>
       </w:r>
       <w:r>
         <w:rPr>
@@ -6775,13 +6731,19 @@
         <w:rPr>
           <w:color w:val="000000"/>
         </w:rPr>
-        <w:t>On GitHub s</w:t>
-      </w:r>
-      <w:r>
-        <w:rPr>
-          <w:color w:val="000000"/>
-        </w:rPr>
-        <w:t>he opens:</w:t>
+        <w:t xml:space="preserve">On GitHub </w:t>
+      </w:r>
+      <w:r>
+        <w:rPr>
+          <w:color w:val="000000"/>
+        </w:rPr>
+        <w:t>they</w:t>
+      </w:r>
+      <w:r>
+        <w:rPr>
+          <w:color w:val="000000"/>
+        </w:rPr>
+        <w:t xml:space="preserve"> open:</w:t>
       </w:r>
     </w:p>
     <w:p>
@@ -6813,7 +6775,13 @@
         <w:rPr>
           <w:color w:val="000000"/>
         </w:rPr>
-        <w:t>Selects your Pull Request.</w:t>
+        <w:t>and s</w:t>
+      </w:r>
+      <w:r>
+        <w:rPr>
+          <w:color w:val="000000"/>
+        </w:rPr>
+        <w:t>elect your Pull Request.</w:t>
       </w:r>
     </w:p>
     <w:p>
@@ -6829,7 +6797,13 @@
         <w:rPr>
           <w:color w:val="000000"/>
         </w:rPr>
-        <w:t>She can inspect:</w:t>
+        <w:t>There they</w:t>
+      </w:r>
+      <w:r>
+        <w:rPr>
+          <w:color w:val="000000"/>
+        </w:rPr>
+        <w:t xml:space="preserve"> can inspect:</w:t>
       </w:r>
     </w:p>
     <w:p>
@@ -6861,7 +6835,19 @@
         <w:rPr>
           <w:color w:val="000000"/>
         </w:rPr>
-        <w:t>Every modified line is shown.</w:t>
+        <w:t>where e</w:t>
+      </w:r>
+      <w:r>
+        <w:rPr>
+          <w:color w:val="000000"/>
+        </w:rPr>
+        <w:t>very modified line is shown.</w:t>
+      </w:r>
+      <w:r>
+        <w:rPr>
+          <w:color w:val="000000"/>
+        </w:rPr>
+        <w:t xml:space="preserve"> For some simple features that alone can be enough. For more complex features they may need to do a Full Code Review detailed in the next topic. </w:t>
       </w:r>
     </w:p>
     <w:p>
@@ -6877,7 +6863,13 @@
         <w:rPr>
           <w:color w:val="000000"/>
         </w:rPr>
-        <w:t>She can leave comments such as:</w:t>
+        <w:t>After the code has been inspected, they</w:t>
+      </w:r>
+      <w:r>
+        <w:rPr>
+          <w:color w:val="000000"/>
+        </w:rPr>
+        <w:t xml:space="preserve"> can leave comments such as:</w:t>
       </w:r>
     </w:p>
     <w:p>
@@ -7011,19 +7003,7 @@
         <w:rPr>
           <w:color w:val="000000"/>
         </w:rPr>
-        <w:t xml:space="preserve"> a bug</w:t>
-      </w:r>
-      <w:r>
-        <w:rPr>
-          <w:color w:val="000000"/>
-        </w:rPr>
-        <w:t xml:space="preserve"> in your implementation</w:t>
-      </w:r>
-      <w:r>
-        <w:rPr>
-          <w:color w:val="000000"/>
-        </w:rPr>
-        <w:t>.</w:t>
+        <w:t xml:space="preserve"> a bug in your implementation.</w:t>
       </w:r>
     </w:p>
     <w:p>
@@ -7055,31 +7035,7 @@
         <w:rPr>
           <w:color w:val="000000"/>
         </w:rPr>
-        <w:t>Instead</w:t>
-      </w:r>
-      <w:r>
-        <w:rPr>
-          <w:color w:val="000000"/>
-        </w:rPr>
-        <w:t>, on your computer, you r</w:t>
-      </w:r>
-      <w:r>
-        <w:rPr>
-          <w:color w:val="000000"/>
-        </w:rPr>
-        <w:t>eturn to your</w:t>
-      </w:r>
-      <w:r>
-        <w:rPr>
-          <w:color w:val="000000"/>
-        </w:rPr>
-        <w:t xml:space="preserve"> feature</w:t>
-      </w:r>
-      <w:r>
-        <w:rPr>
-          <w:color w:val="000000"/>
-        </w:rPr>
-        <w:t xml:space="preserve"> branch:</w:t>
+        <w:t>Instead, on your computer, you return to your feature branch:</w:t>
       </w:r>
     </w:p>
     <w:p>
@@ -7118,25 +7074,7 @@
         <w:rPr>
           <w:color w:val="000000"/>
         </w:rPr>
-        <w:t>You f</w:t>
-      </w:r>
-      <w:r>
-        <w:rPr>
-          <w:color w:val="000000"/>
-        </w:rPr>
-        <w:t>ix</w:t>
-      </w:r>
-      <w:r>
-        <w:rPr>
-          <w:color w:val="000000"/>
-        </w:rPr>
-        <w:t xml:space="preserve"> the</w:t>
-      </w:r>
-      <w:r>
-        <w:rPr>
-          <w:color w:val="000000"/>
-        </w:rPr>
-        <w:t xml:space="preserve"> bug.</w:t>
+        <w:t>You fix the bug.</w:t>
       </w:r>
     </w:p>
     <w:p>
@@ -7152,13 +7090,7 @@
         <w:rPr>
           <w:color w:val="000000"/>
         </w:rPr>
-        <w:t>You c</w:t>
-      </w:r>
-      <w:r>
-        <w:rPr>
-          <w:color w:val="000000"/>
-        </w:rPr>
-        <w:t>ommit:</w:t>
+        <w:t>You commit:</w:t>
       </w:r>
     </w:p>
     <w:p>
@@ -7467,13 +7399,7 @@
         <w:rPr>
           <w:color w:val="000000"/>
         </w:rPr>
-        <w:t xml:space="preserve"> </w:t>
-      </w:r>
-      <w:r>
-        <w:rPr>
-          <w:color w:val="000000"/>
-        </w:rPr>
-        <w:t>(no matter if Roman does it or Carlotta does it)</w:t>
+        <w:t xml:space="preserve"> (no matter if Roman does it or Carlotta does it)</w:t>
       </w:r>
       <w:r>
         <w:rPr>
@@ -7529,6 +7455,7 @@
           <w:rStyle w:val="KdHTML"/>
           <w:color w:val="000000"/>
         </w:rPr>
+        <w:lastRenderedPageBreak/>
         <w:t>Merge pull request</w:t>
       </w:r>
     </w:p>
@@ -7573,7 +7500,6 @@
           <w:rStyle w:val="KdHTML"/>
           <w:color w:val="000000"/>
         </w:rPr>
-        <w:lastRenderedPageBreak/>
         <w:t>Confirm merge</w:t>
       </w:r>
     </w:p>
@@ -7882,492 +7808,447 @@
           <w:szCs w:val="24"/>
           <w:u w:val="single"/>
         </w:rPr>
-        <w:t xml:space="preserve">STEP 15: Synchronize </w:t>
-      </w:r>
-      <w:r>
+        <w:t>STEP 15: Synchronize your local repository with the GitHub repository</w:t>
+      </w:r>
+    </w:p>
+    <w:p>
+      <w:pPr>
+        <w:pStyle w:val="Normlnweb"/>
+        <w:spacing w:before="0" w:beforeAutospacing="0" w:after="0" w:afterAutospacing="0"/>
+        <w:ind w:left="284"/>
+        <w:rPr>
+          <w:color w:val="000000"/>
+        </w:rPr>
+      </w:pPr>
+      <w:r>
+        <w:rPr>
+          <w:b/>
+          <w:bCs/>
+          <w:color w:val="000000"/>
+        </w:rPr>
+        <w:t>Super important!</w:t>
+      </w:r>
+      <w:r>
+        <w:rPr>
+          <w:color w:val="000000"/>
+        </w:rPr>
+        <w:t xml:space="preserve"> </w:t>
+      </w:r>
+      <w:r>
+        <w:rPr>
+          <w:color w:val="000000"/>
+        </w:rPr>
+        <w:t>Now your laptop still has the old view of the world.</w:t>
+      </w:r>
+    </w:p>
+    <w:p>
+      <w:pPr>
+        <w:pStyle w:val="Normlnweb"/>
+        <w:spacing w:before="0" w:beforeAutospacing="0" w:after="0" w:afterAutospacing="0"/>
+        <w:ind w:left="284"/>
+        <w:rPr>
+          <w:b/>
+          <w:bCs/>
+          <w:color w:val="000000"/>
+        </w:rPr>
+      </w:pPr>
+      <w:r>
+        <w:rPr>
+          <w:b/>
+          <w:bCs/>
+          <w:color w:val="000000"/>
+        </w:rPr>
+        <w:t>Update it</w:t>
+      </w:r>
+      <w:r>
+        <w:rPr>
+          <w:b/>
+          <w:bCs/>
+          <w:color w:val="000000"/>
+        </w:rPr>
+        <w:t>!</w:t>
+      </w:r>
+    </w:p>
+    <w:p>
+      <w:pPr>
+        <w:pStyle w:val="Normlnweb"/>
+        <w:spacing w:before="0" w:beforeAutospacing="0" w:after="0" w:afterAutospacing="0"/>
+        <w:ind w:left="284"/>
+        <w:rPr>
+          <w:color w:val="000000"/>
+        </w:rPr>
+      </w:pPr>
+      <w:r>
+        <w:rPr>
+          <w:color w:val="000000"/>
+        </w:rPr>
+        <w:t>On your computer, s</w:t>
+      </w:r>
+      <w:r>
+        <w:rPr>
+          <w:color w:val="000000"/>
+        </w:rPr>
+        <w:t>witch</w:t>
+      </w:r>
+      <w:r>
+        <w:rPr>
+          <w:color w:val="000000"/>
+        </w:rPr>
+        <w:t xml:space="preserve"> to the refactor branch</w:t>
+      </w:r>
+      <w:r>
+        <w:rPr>
+          <w:color w:val="000000"/>
+        </w:rPr>
+        <w:t>:</w:t>
+      </w:r>
+    </w:p>
+    <w:p>
+      <w:pPr>
+        <w:pStyle w:val="FormtovanvHTML"/>
+        <w:ind w:left="567"/>
+        <w:rPr>
+          <w:color w:val="000000"/>
+        </w:rPr>
+      </w:pPr>
+      <w:r>
+        <w:rPr>
+          <w:rStyle w:val="l"/>
+          <w:color w:val="000000"/>
+        </w:rPr>
+        <w:t>git</w:t>
+      </w:r>
+      <w:r>
+        <w:rPr>
+          <w:rStyle w:val="KdHTML"/>
+          <w:color w:val="000000"/>
+        </w:rPr>
+        <w:t xml:space="preserve"> checkout refactor</w:t>
+      </w:r>
+    </w:p>
+    <w:p>
+      <w:pPr>
+        <w:pStyle w:val="Normlnweb"/>
+        <w:spacing w:before="0" w:beforeAutospacing="0" w:after="0" w:afterAutospacing="0"/>
+        <w:ind w:left="284"/>
+        <w:rPr>
+          <w:color w:val="000000"/>
+        </w:rPr>
+      </w:pPr>
+      <w:r>
+        <w:rPr>
+          <w:color w:val="000000"/>
+        </w:rPr>
+        <w:t>Fetch</w:t>
+      </w:r>
+      <w:r>
+        <w:rPr>
+          <w:color w:val="000000"/>
+        </w:rPr>
+        <w:t xml:space="preserve"> updates from GitHub</w:t>
+      </w:r>
+      <w:r>
+        <w:rPr>
+          <w:color w:val="000000"/>
+        </w:rPr>
+        <w:t>:</w:t>
+      </w:r>
+    </w:p>
+    <w:p>
+      <w:pPr>
+        <w:pStyle w:val="FormtovanvHTML"/>
+        <w:ind w:left="567"/>
+        <w:rPr>
+          <w:color w:val="000000"/>
+        </w:rPr>
+      </w:pPr>
+      <w:r>
+        <w:rPr>
+          <w:rStyle w:val="l"/>
+          <w:color w:val="000000"/>
+        </w:rPr>
+        <w:t>git</w:t>
+      </w:r>
+      <w:r>
+        <w:rPr>
+          <w:rStyle w:val="KdHTML"/>
+          <w:color w:val="000000"/>
+        </w:rPr>
+        <w:t xml:space="preserve"> fetch origin</w:t>
+      </w:r>
+    </w:p>
+    <w:p>
+      <w:pPr>
+        <w:pStyle w:val="Normlnweb"/>
+        <w:spacing w:before="0" w:beforeAutospacing="0" w:after="0" w:afterAutospacing="0"/>
+        <w:ind w:left="284"/>
+        <w:rPr>
+          <w:color w:val="000000"/>
+        </w:rPr>
+      </w:pPr>
+      <w:r>
+        <w:rPr>
+          <w:color w:val="000000"/>
+        </w:rPr>
+        <w:t>Update</w:t>
+      </w:r>
+      <w:r>
+        <w:rPr>
+          <w:color w:val="000000"/>
+        </w:rPr>
+        <w:t xml:space="preserve"> your local repository</w:t>
+      </w:r>
+      <w:r>
+        <w:rPr>
+          <w:color w:val="000000"/>
+        </w:rPr>
+        <w:t>:</w:t>
+      </w:r>
+    </w:p>
+    <w:p>
+      <w:pPr>
+        <w:pStyle w:val="FormtovanvHTML"/>
+        <w:ind w:left="567"/>
+        <w:rPr>
+          <w:color w:val="000000"/>
+        </w:rPr>
+      </w:pPr>
+      <w:r>
+        <w:rPr>
+          <w:rStyle w:val="l"/>
+          <w:color w:val="000000"/>
+        </w:rPr>
+        <w:t>git</w:t>
+      </w:r>
+      <w:r>
+        <w:rPr>
+          <w:rStyle w:val="KdHTML"/>
+          <w:color w:val="000000"/>
+        </w:rPr>
+        <w:t xml:space="preserve"> merge origin/refactor</w:t>
+      </w:r>
+    </w:p>
+    <w:p>
+      <w:pPr>
+        <w:pStyle w:val="Normlnweb"/>
+        <w:spacing w:before="0" w:beforeAutospacing="0" w:after="0" w:afterAutospacing="0"/>
+        <w:ind w:left="284"/>
+        <w:rPr>
+          <w:color w:val="000000"/>
+        </w:rPr>
+      </w:pPr>
+      <w:r>
+        <w:rPr>
+          <w:color w:val="000000"/>
+        </w:rPr>
+        <w:t>(or</w:t>
+      </w:r>
+      <w:r>
+        <w:rPr>
+          <w:color w:val="000000"/>
+        </w:rPr>
+        <w:t>,</w:t>
+      </w:r>
+      <w:r>
+        <w:rPr>
+          <w:color w:val="000000"/>
+        </w:rPr>
+        <w:t xml:space="preserve"> </w:t>
+      </w:r>
+      <w:r>
+        <w:rPr>
+          <w:color w:val="000000"/>
+        </w:rPr>
+        <w:t xml:space="preserve">instead of </w:t>
+      </w:r>
+      <w:r>
+        <w:rPr>
+          <w:color w:val="000000"/>
+        </w:rPr>
+        <w:t xml:space="preserve">the </w:t>
+      </w:r>
+      <w:r>
+        <w:rPr>
+          <w:color w:val="000000"/>
+        </w:rPr>
+        <w:t xml:space="preserve">Fetch/Update combination, </w:t>
+      </w:r>
+      <w:r>
+        <w:rPr>
+          <w:color w:val="000000"/>
+        </w:rPr>
+        <w:t>simply</w:t>
+      </w:r>
+      <w:r>
+        <w:rPr>
+          <w:color w:val="000000"/>
+        </w:rPr>
+        <w:t xml:space="preserve"> call</w:t>
+      </w:r>
+      <w:r>
+        <w:rPr>
+          <w:color w:val="000000"/>
+        </w:rPr>
+        <w:t>)</w:t>
+      </w:r>
+    </w:p>
+    <w:p>
+      <w:pPr>
+        <w:pStyle w:val="FormtovanvHTML"/>
+        <w:ind w:left="567"/>
+        <w:rPr>
+          <w:color w:val="000000"/>
+        </w:rPr>
+      </w:pPr>
+      <w:r>
+        <w:rPr>
+          <w:rStyle w:val="l"/>
+          <w:color w:val="000000"/>
+        </w:rPr>
+        <w:t>git</w:t>
+      </w:r>
+      <w:r>
+        <w:rPr>
+          <w:rStyle w:val="KdHTML"/>
+          <w:color w:val="000000"/>
+        </w:rPr>
+        <w:t xml:space="preserve"> pull origin refactor</w:t>
+      </w:r>
+    </w:p>
+    <w:p>
+      <w:pPr>
+        <w:pStyle w:val="Normlnweb"/>
+        <w:spacing w:before="0" w:beforeAutospacing="0" w:after="0" w:afterAutospacing="0"/>
+        <w:ind w:left="284"/>
+        <w:rPr>
+          <w:color w:val="000000"/>
+        </w:rPr>
+      </w:pPr>
+      <w:r>
+        <w:rPr>
+          <w:color w:val="000000"/>
+        </w:rPr>
+        <w:t>Now your local</w:t>
+      </w:r>
+      <w:r>
+        <w:rPr>
+          <w:rStyle w:val="apple-converted-space"/>
+          <w:color w:val="000000"/>
+        </w:rPr>
+        <w:t> </w:t>
+      </w:r>
+      <w:r>
+        <w:rPr>
+          <w:rStyle w:val="KdHTML"/>
+          <w:color w:val="000000"/>
+        </w:rPr>
+        <w:t>refactor</w:t>
+      </w:r>
+      <w:r>
+        <w:rPr>
+          <w:rStyle w:val="apple-converted-space"/>
+          <w:color w:val="000000"/>
+        </w:rPr>
+        <w:t> </w:t>
+      </w:r>
+      <w:r>
+        <w:rPr>
+          <w:rStyle w:val="apple-converted-space"/>
+          <w:color w:val="000000"/>
+        </w:rPr>
+        <w:t xml:space="preserve">branch </w:t>
+      </w:r>
+      <w:r>
+        <w:rPr>
+          <w:color w:val="000000"/>
+        </w:rPr>
+        <w:t>contains the merged feature.</w:t>
+      </w:r>
+    </w:p>
+    <w:p>
+      <w:pPr>
+        <w:pStyle w:val="Normlnweb"/>
+        <w:spacing w:before="0" w:beforeAutospacing="0" w:after="0" w:afterAutospacing="0"/>
+        <w:ind w:left="284"/>
+        <w:rPr>
+          <w:color w:val="000000"/>
+        </w:rPr>
+      </w:pPr>
+    </w:p>
+    <w:p>
+      <w:pPr>
+        <w:pStyle w:val="Normlnweb"/>
+        <w:spacing w:before="0" w:beforeAutospacing="0" w:after="0" w:afterAutospacing="0"/>
+        <w:ind w:left="284"/>
+        <w:rPr>
+          <w:color w:val="000000"/>
+        </w:rPr>
+      </w:pPr>
+      <w:r>
+        <w:rPr>
+          <w:color w:val="000000"/>
+        </w:rPr>
+        <w:t xml:space="preserve">Should you notify other developers on the project to </w:t>
+      </w:r>
+      <w:r>
+        <w:rPr>
+          <w:color w:val="000000"/>
+        </w:rPr>
+        <w:t>synchronize their local repositories with GitHub? Generally, no. If they follow the steps described in the „</w:t>
+      </w:r>
+      <w:r>
+        <w:rPr>
+          <w:color w:val="000000"/>
+        </w:rPr>
+        <w:t>Typical Real-Life Work Day</w:t>
+      </w:r>
+      <w:r>
+        <w:rPr>
+          <w:color w:val="000000"/>
+        </w:rPr>
+        <w:t xml:space="preserve">“ </w:t>
+      </w:r>
+      <w:r>
+        <w:rPr>
+          <w:color w:val="000000"/>
+        </w:rPr>
+        <w:t xml:space="preserve">as they should (see </w:t>
+      </w:r>
+      <w:r>
+        <w:rPr>
+          <w:color w:val="000000"/>
+        </w:rPr>
+        <w:t>further down in the text</w:t>
+      </w:r>
+      <w:r>
+        <w:rPr>
+          <w:color w:val="000000"/>
+        </w:rPr>
+        <w:t>),</w:t>
+      </w:r>
+      <w:r>
+        <w:rPr>
+          <w:color w:val="000000"/>
+        </w:rPr>
+        <w:t xml:space="preserve"> they will get all of your updates themselves.</w:t>
+      </w:r>
+    </w:p>
+    <w:p/>
+    <w:p>
+      <w:pPr>
+        <w:pStyle w:val="Nadpis1"/>
+        <w:spacing w:before="0" w:beforeAutospacing="0" w:after="0" w:afterAutospacing="0"/>
         <w:rPr>
           <w:kern w:val="0"/>
           <w:sz w:val="24"/>
           <w:szCs w:val="24"/>
-          <w:u w:val="single"/>
-        </w:rPr>
-        <w:t>your l</w:t>
-      </w:r>
+        </w:rPr>
+      </w:pPr>
       <w:r>
         <w:rPr>
           <w:kern w:val="0"/>
           <w:sz w:val="24"/>
           <w:szCs w:val="24"/>
-          <w:u w:val="single"/>
-        </w:rPr>
-        <w:t xml:space="preserve">ocal </w:t>
-      </w:r>
-      <w:r>
-        <w:rPr>
-          <w:kern w:val="0"/>
-          <w:sz w:val="24"/>
-          <w:szCs w:val="24"/>
-          <w:u w:val="single"/>
-        </w:rPr>
-        <w:t>r</w:t>
-      </w:r>
-      <w:r>
-        <w:rPr>
-          <w:kern w:val="0"/>
-          <w:sz w:val="24"/>
-          <w:szCs w:val="24"/>
-          <w:u w:val="single"/>
-        </w:rPr>
-        <w:t>epository</w:t>
-      </w:r>
-      <w:r>
-        <w:rPr>
-          <w:kern w:val="0"/>
-          <w:sz w:val="24"/>
-          <w:szCs w:val="24"/>
-          <w:u w:val="single"/>
-        </w:rPr>
-        <w:t xml:space="preserve"> with the GitHub repository</w:t>
-      </w:r>
-    </w:p>
-    <w:p>
-      <w:pPr>
-        <w:pStyle w:val="Normlnweb"/>
-        <w:spacing w:before="0" w:beforeAutospacing="0" w:after="0" w:afterAutospacing="0"/>
-        <w:ind w:left="284"/>
-        <w:rPr>
-          <w:color w:val="000000"/>
-        </w:rPr>
-      </w:pPr>
-      <w:r>
-        <w:rPr>
-          <w:b/>
-          <w:bCs/>
-          <w:color w:val="000000"/>
-        </w:rPr>
-        <w:t>Super important!</w:t>
-      </w:r>
-      <w:r>
-        <w:rPr>
-          <w:color w:val="000000"/>
-        </w:rPr>
-        <w:t xml:space="preserve"> </w:t>
-      </w:r>
-      <w:r>
-        <w:rPr>
-          <w:color w:val="000000"/>
-        </w:rPr>
-        <w:t>Now your laptop still has the old view of the world.</w:t>
-      </w:r>
-    </w:p>
-    <w:p>
-      <w:pPr>
-        <w:pStyle w:val="Normlnweb"/>
-        <w:spacing w:before="0" w:beforeAutospacing="0" w:after="0" w:afterAutospacing="0"/>
-        <w:ind w:left="284"/>
-        <w:rPr>
-          <w:b/>
-          <w:bCs/>
-          <w:color w:val="000000"/>
-        </w:rPr>
-      </w:pPr>
-      <w:r>
-        <w:rPr>
-          <w:b/>
-          <w:bCs/>
-          <w:color w:val="000000"/>
-        </w:rPr>
-        <w:t>Update it</w:t>
-      </w:r>
-      <w:r>
-        <w:rPr>
-          <w:b/>
-          <w:bCs/>
-          <w:color w:val="000000"/>
-        </w:rPr>
-        <w:t>!</w:t>
-      </w:r>
-    </w:p>
-    <w:p>
-      <w:pPr>
-        <w:pStyle w:val="Normlnweb"/>
-        <w:spacing w:before="0" w:beforeAutospacing="0" w:after="0" w:afterAutospacing="0"/>
-        <w:ind w:left="284"/>
-        <w:rPr>
-          <w:color w:val="000000"/>
-        </w:rPr>
-      </w:pPr>
-      <w:r>
-        <w:rPr>
-          <w:color w:val="000000"/>
-        </w:rPr>
-        <w:t>On your computer, s</w:t>
-      </w:r>
-      <w:r>
-        <w:rPr>
-          <w:color w:val="000000"/>
-        </w:rPr>
-        <w:t>witch</w:t>
-      </w:r>
-      <w:r>
-        <w:rPr>
-          <w:color w:val="000000"/>
-        </w:rPr>
-        <w:t xml:space="preserve"> to the refactor branch</w:t>
-      </w:r>
-      <w:r>
-        <w:rPr>
-          <w:color w:val="000000"/>
-        </w:rPr>
-        <w:t>:</w:t>
-      </w:r>
-    </w:p>
-    <w:p>
-      <w:pPr>
-        <w:pStyle w:val="FormtovanvHTML"/>
-        <w:ind w:left="567"/>
-        <w:rPr>
-          <w:color w:val="000000"/>
-        </w:rPr>
-      </w:pPr>
-      <w:r>
-        <w:rPr>
-          <w:rStyle w:val="l"/>
-          <w:color w:val="000000"/>
-        </w:rPr>
-        <w:t>git</w:t>
-      </w:r>
-      <w:r>
-        <w:rPr>
-          <w:rStyle w:val="KdHTML"/>
-          <w:color w:val="000000"/>
-        </w:rPr>
-        <w:t xml:space="preserve"> checkout refactor</w:t>
-      </w:r>
-    </w:p>
-    <w:p>
-      <w:pPr>
-        <w:pStyle w:val="Normlnweb"/>
-        <w:spacing w:before="0" w:beforeAutospacing="0" w:after="0" w:afterAutospacing="0"/>
-        <w:ind w:left="284"/>
-        <w:rPr>
-          <w:color w:val="000000"/>
-        </w:rPr>
-      </w:pPr>
-      <w:r>
-        <w:rPr>
-          <w:color w:val="000000"/>
-        </w:rPr>
-        <w:t>Fetch</w:t>
-      </w:r>
-      <w:r>
-        <w:rPr>
-          <w:color w:val="000000"/>
-        </w:rPr>
-        <w:t xml:space="preserve"> updates from GitHub</w:t>
-      </w:r>
-      <w:r>
-        <w:rPr>
-          <w:color w:val="000000"/>
-        </w:rPr>
-        <w:t>:</w:t>
-      </w:r>
-    </w:p>
-    <w:p>
-      <w:pPr>
-        <w:pStyle w:val="FormtovanvHTML"/>
-        <w:ind w:left="567"/>
-        <w:rPr>
-          <w:color w:val="000000"/>
-        </w:rPr>
-      </w:pPr>
-      <w:r>
-        <w:rPr>
-          <w:rStyle w:val="l"/>
-          <w:color w:val="000000"/>
-        </w:rPr>
-        <w:t>git</w:t>
-      </w:r>
-      <w:r>
-        <w:rPr>
-          <w:rStyle w:val="KdHTML"/>
-          <w:color w:val="000000"/>
-        </w:rPr>
-        <w:t xml:space="preserve"> fetch origin</w:t>
-      </w:r>
-    </w:p>
-    <w:p>
-      <w:pPr>
-        <w:pStyle w:val="Normlnweb"/>
-        <w:spacing w:before="0" w:beforeAutospacing="0" w:after="0" w:afterAutospacing="0"/>
-        <w:ind w:left="284"/>
-        <w:rPr>
-          <w:color w:val="000000"/>
-        </w:rPr>
-      </w:pPr>
-      <w:r>
-        <w:rPr>
-          <w:color w:val="000000"/>
-        </w:rPr>
-        <w:t>Update</w:t>
-      </w:r>
-      <w:r>
-        <w:rPr>
-          <w:color w:val="000000"/>
-        </w:rPr>
-        <w:t xml:space="preserve"> your local repository</w:t>
-      </w:r>
-      <w:r>
-        <w:rPr>
-          <w:color w:val="000000"/>
-        </w:rPr>
-        <w:t>:</w:t>
-      </w:r>
-    </w:p>
-    <w:p>
-      <w:pPr>
-        <w:pStyle w:val="FormtovanvHTML"/>
-        <w:ind w:left="567"/>
-        <w:rPr>
-          <w:color w:val="000000"/>
-        </w:rPr>
-      </w:pPr>
-      <w:r>
-        <w:rPr>
-          <w:rStyle w:val="l"/>
-          <w:color w:val="000000"/>
-        </w:rPr>
-        <w:t>git</w:t>
-      </w:r>
-      <w:r>
-        <w:rPr>
-          <w:rStyle w:val="KdHTML"/>
-          <w:color w:val="000000"/>
-        </w:rPr>
-        <w:t xml:space="preserve"> merge origin/refactor</w:t>
-      </w:r>
-    </w:p>
-    <w:p>
-      <w:pPr>
-        <w:pStyle w:val="Normlnweb"/>
-        <w:spacing w:before="0" w:beforeAutospacing="0" w:after="0" w:afterAutospacing="0"/>
-        <w:ind w:left="284"/>
-        <w:rPr>
-          <w:color w:val="000000"/>
-        </w:rPr>
-      </w:pPr>
-      <w:r>
-        <w:rPr>
-          <w:color w:val="000000"/>
-        </w:rPr>
-        <w:t>(or</w:t>
-      </w:r>
-      <w:r>
-        <w:rPr>
-          <w:color w:val="000000"/>
-        </w:rPr>
-        <w:t>,</w:t>
-      </w:r>
-      <w:r>
-        <w:rPr>
-          <w:color w:val="000000"/>
-        </w:rPr>
-        <w:t xml:space="preserve"> </w:t>
-      </w:r>
-      <w:r>
-        <w:rPr>
-          <w:color w:val="000000"/>
-        </w:rPr>
-        <w:t xml:space="preserve">instead of </w:t>
-      </w:r>
-      <w:r>
-        <w:rPr>
-          <w:color w:val="000000"/>
-        </w:rPr>
-        <w:t xml:space="preserve">the </w:t>
-      </w:r>
-      <w:r>
-        <w:rPr>
-          <w:color w:val="000000"/>
-        </w:rPr>
-        <w:t xml:space="preserve">Fetch/Update combination, </w:t>
-      </w:r>
-      <w:r>
-        <w:rPr>
-          <w:color w:val="000000"/>
-        </w:rPr>
-        <w:t>simply</w:t>
-      </w:r>
-      <w:r>
-        <w:rPr>
-          <w:color w:val="000000"/>
-        </w:rPr>
-        <w:t xml:space="preserve"> call</w:t>
-      </w:r>
-      <w:r>
-        <w:rPr>
-          <w:color w:val="000000"/>
-        </w:rPr>
-        <w:t>)</w:t>
-      </w:r>
-    </w:p>
-    <w:p>
-      <w:pPr>
-        <w:pStyle w:val="FormtovanvHTML"/>
-        <w:ind w:left="567"/>
-        <w:rPr>
-          <w:color w:val="000000"/>
-        </w:rPr>
-      </w:pPr>
-      <w:r>
-        <w:rPr>
-          <w:rStyle w:val="l"/>
-          <w:color w:val="000000"/>
-        </w:rPr>
-        <w:t>git</w:t>
-      </w:r>
-      <w:r>
-        <w:rPr>
-          <w:rStyle w:val="KdHTML"/>
-          <w:color w:val="000000"/>
-        </w:rPr>
-        <w:t xml:space="preserve"> pull origin refactor</w:t>
-      </w:r>
-    </w:p>
-    <w:p>
-      <w:pPr>
-        <w:pStyle w:val="Normlnweb"/>
-        <w:spacing w:before="0" w:beforeAutospacing="0" w:after="0" w:afterAutospacing="0"/>
-        <w:ind w:left="284"/>
-        <w:rPr>
-          <w:color w:val="000000"/>
-        </w:rPr>
-      </w:pPr>
-      <w:r>
-        <w:rPr>
-          <w:color w:val="000000"/>
-        </w:rPr>
-        <w:t>Now your local</w:t>
-      </w:r>
-      <w:r>
-        <w:rPr>
-          <w:rStyle w:val="apple-converted-space"/>
-          <w:color w:val="000000"/>
-        </w:rPr>
-        <w:t> </w:t>
-      </w:r>
-      <w:r>
-        <w:rPr>
-          <w:rStyle w:val="KdHTML"/>
-          <w:color w:val="000000"/>
-        </w:rPr>
-        <w:t>refactor</w:t>
-      </w:r>
-      <w:r>
-        <w:rPr>
-          <w:rStyle w:val="apple-converted-space"/>
-          <w:color w:val="000000"/>
-        </w:rPr>
-        <w:t> </w:t>
-      </w:r>
-      <w:r>
-        <w:rPr>
-          <w:rStyle w:val="apple-converted-space"/>
-          <w:color w:val="000000"/>
-        </w:rPr>
-        <w:t xml:space="preserve">branch </w:t>
-      </w:r>
-      <w:r>
-        <w:rPr>
-          <w:color w:val="000000"/>
-        </w:rPr>
-        <w:t>contains the merged feature.</w:t>
-      </w:r>
-    </w:p>
-    <w:p>
-      <w:pPr>
-        <w:pStyle w:val="Normlnweb"/>
-        <w:spacing w:before="0" w:beforeAutospacing="0" w:after="0" w:afterAutospacing="0"/>
-        <w:ind w:left="284"/>
-        <w:rPr>
-          <w:color w:val="000000"/>
-        </w:rPr>
-      </w:pPr>
-    </w:p>
-    <w:p>
-      <w:pPr>
-        <w:pStyle w:val="Normlnweb"/>
-        <w:spacing w:before="0" w:beforeAutospacing="0" w:after="0" w:afterAutospacing="0"/>
-        <w:ind w:left="284"/>
-        <w:rPr>
-          <w:color w:val="000000"/>
-        </w:rPr>
-      </w:pPr>
-      <w:r>
-        <w:rPr>
-          <w:color w:val="000000"/>
-        </w:rPr>
-        <w:t xml:space="preserve">Should you notify other developers on the project to </w:t>
-      </w:r>
-      <w:r>
-        <w:rPr>
-          <w:color w:val="000000"/>
-        </w:rPr>
-        <w:t>synchronize their local repositories with GitHub? Generally, no. If they follow the steps described in the „</w:t>
-      </w:r>
-      <w:r>
-        <w:rPr>
-          <w:color w:val="000000"/>
-        </w:rPr>
-        <w:t>Typical Real-Life Work Day</w:t>
-      </w:r>
-      <w:r>
-        <w:rPr>
-          <w:color w:val="000000"/>
-        </w:rPr>
-        <w:t xml:space="preserve">“ </w:t>
-      </w:r>
-      <w:r>
-        <w:rPr>
-          <w:color w:val="000000"/>
-        </w:rPr>
-        <w:t xml:space="preserve">as they should (see </w:t>
-      </w:r>
-      <w:r>
-        <w:rPr>
-          <w:color w:val="000000"/>
-        </w:rPr>
-        <w:t>further down in the text</w:t>
-      </w:r>
-      <w:r>
-        <w:rPr>
-          <w:color w:val="000000"/>
-        </w:rPr>
-        <w:t>),</w:t>
-      </w:r>
-      <w:r>
-        <w:rPr>
-          <w:color w:val="000000"/>
-        </w:rPr>
-        <w:t xml:space="preserve"> they will get all of your updates themselves.</w:t>
-      </w:r>
-    </w:p>
-    <w:p/>
-    <w:p>
-      <w:pPr>
-        <w:pStyle w:val="Nadpis1"/>
-        <w:spacing w:before="0" w:beforeAutospacing="0" w:after="0" w:afterAutospacing="0"/>
-        <w:rPr>
-          <w:kern w:val="0"/>
-          <w:sz w:val="24"/>
-          <w:szCs w:val="24"/>
-        </w:rPr>
-      </w:pPr>
-      <w:r>
-        <w:rPr>
-          <w:kern w:val="0"/>
-          <w:sz w:val="24"/>
-          <w:szCs w:val="24"/>
         </w:rPr>
         <w:t>STEP 16: Delete Local Feature Branch</w:t>
       </w:r>
@@ -8548,10 +8429,1272 @@
           <w:noProof/>
           <w14:ligatures w14:val="standardContextual"/>
         </w:rPr>
+        <w:lastRenderedPageBreak/>
+        <w:pict>
+          <v:rect id="_x0000_i1033" alt="" style="width:453.6pt;height:.05pt;mso-width-percent:0;mso-height-percent:0;mso-width-percent:0;mso-height-percent:0" o:hralign="center" o:hrstd="t" o:hr="t" fillcolor="#a0a0a0" stroked="f"/>
+        </w:pict>
+      </w:r>
+    </w:p>
+    <w:p>
+      <w:pPr>
+        <w:outlineLvl w:val="0"/>
+        <w:rPr>
+          <w:b/>
+          <w:bCs/>
+          <w:color w:val="000000"/>
+          <w:kern w:val="36"/>
+          <w:sz w:val="48"/>
+          <w:szCs w:val="48"/>
+        </w:rPr>
+      </w:pPr>
+    </w:p>
+    <w:p>
+      <w:pPr>
+        <w:outlineLvl w:val="0"/>
+        <w:rPr>
+          <w:b/>
+          <w:bCs/>
+          <w:color w:val="000000"/>
+          <w:kern w:val="36"/>
+          <w:sz w:val="48"/>
+          <w:szCs w:val="48"/>
+        </w:rPr>
+      </w:pPr>
+      <w:r>
+        <w:rPr>
+          <w:b/>
+          <w:bCs/>
+          <w:color w:val="000000"/>
+          <w:kern w:val="36"/>
+          <w:sz w:val="48"/>
+          <w:szCs w:val="48"/>
+        </w:rPr>
+        <w:t>Full Code Review</w:t>
+      </w:r>
+    </w:p>
+    <w:p>
+      <w:pPr>
+        <w:outlineLvl w:val="0"/>
+      </w:pPr>
+    </w:p>
+    <w:p>
+      <w:pPr>
+        <w:outlineLvl w:val="0"/>
+      </w:pPr>
+      <w:r>
+        <w:t xml:space="preserve">Sometimes the </w:t>
+      </w:r>
+      <w:r>
+        <w:t>P</w:t>
+      </w:r>
+      <w:r>
+        <w:t xml:space="preserve">ull </w:t>
+      </w:r>
+      <w:r>
+        <w:t>R</w:t>
+      </w:r>
+      <w:r>
+        <w:t>equest page</w:t>
+      </w:r>
+      <w:r>
+        <w:t xml:space="preserve"> on GitHub</w:t>
+      </w:r>
+      <w:r>
+        <w:t xml:space="preserve"> is not enough </w:t>
+      </w:r>
+      <w:r>
+        <w:t xml:space="preserve">for you </w:t>
+      </w:r>
+      <w:r>
+        <w:t xml:space="preserve">to make the whole picture about </w:t>
+      </w:r>
+      <w:r>
+        <w:t xml:space="preserve">a </w:t>
+      </w:r>
+      <w:r>
+        <w:t>newly implemented feature. You want to see the whole thing, to try compiling it, running it, testing it. And you absolutely can do that!</w:t>
+      </w:r>
+    </w:p>
+    <w:p>
+      <w:pPr>
+        <w:outlineLvl w:val="0"/>
+      </w:pPr>
+    </w:p>
+    <w:p>
+      <w:pPr>
+        <w:pStyle w:val="Normlnweb"/>
+        <w:spacing w:before="0" w:beforeAutospacing="0"/>
+        <w:rPr>
+          <w:color w:val="000000"/>
+        </w:rPr>
+      </w:pPr>
+      <w:r>
+        <w:rPr>
+          <w:color w:val="000000"/>
+        </w:rPr>
+        <w:t xml:space="preserve">A common workflow </w:t>
+      </w:r>
+      <w:r>
+        <w:rPr>
+          <w:color w:val="000000"/>
+        </w:rPr>
+        <w:t>would be this</w:t>
+      </w:r>
+      <w:r>
+        <w:rPr>
+          <w:color w:val="000000"/>
+        </w:rPr>
+        <w:t>:</w:t>
+      </w:r>
+    </w:p>
+    <w:p>
+      <w:pPr>
+        <w:numPr>
+          <w:ilvl w:val="0"/>
+          <w:numId w:val="14"/>
+        </w:numPr>
+        <w:spacing w:before="100" w:beforeAutospacing="1" w:after="100" w:afterAutospacing="1"/>
+        <w:rPr>
+          <w:color w:val="000000"/>
+        </w:rPr>
+      </w:pPr>
+      <w:r>
+        <w:rPr>
+          <w:color w:val="000000"/>
+        </w:rPr>
+        <w:t>Fetch your teammate's branch locally</w:t>
+      </w:r>
+      <w:r>
+        <w:rPr>
+          <w:color w:val="000000"/>
+        </w:rPr>
+        <w:t xml:space="preserve"> onto your computer</w:t>
+      </w:r>
+      <w:r>
+        <w:rPr>
+          <w:color w:val="000000"/>
+        </w:rPr>
+        <w:t>.</w:t>
+      </w:r>
+    </w:p>
+    <w:p>
+      <w:pPr>
+        <w:numPr>
+          <w:ilvl w:val="0"/>
+          <w:numId w:val="14"/>
+        </w:numPr>
+        <w:spacing w:before="100" w:beforeAutospacing="1" w:after="100" w:afterAutospacing="1"/>
+        <w:rPr>
+          <w:color w:val="000000"/>
+        </w:rPr>
+      </w:pPr>
+      <w:r>
+        <w:rPr>
+          <w:color w:val="000000"/>
+        </w:rPr>
+        <w:t>Check it out.</w:t>
+      </w:r>
+    </w:p>
+    <w:p>
+      <w:pPr>
+        <w:numPr>
+          <w:ilvl w:val="0"/>
+          <w:numId w:val="14"/>
+        </w:numPr>
+        <w:spacing w:before="100" w:beforeAutospacing="1" w:after="100" w:afterAutospacing="1"/>
+        <w:rPr>
+          <w:color w:val="000000"/>
+        </w:rPr>
+      </w:pPr>
+      <w:r>
+        <w:rPr>
+          <w:color w:val="000000"/>
+        </w:rPr>
+        <w:t>Build the project.</w:t>
+      </w:r>
+    </w:p>
+    <w:p>
+      <w:pPr>
+        <w:numPr>
+          <w:ilvl w:val="0"/>
+          <w:numId w:val="14"/>
+        </w:numPr>
+        <w:spacing w:before="100" w:beforeAutospacing="1" w:after="100" w:afterAutospacing="1"/>
+        <w:rPr>
+          <w:color w:val="000000"/>
+        </w:rPr>
+      </w:pPr>
+      <w:r>
+        <w:rPr>
+          <w:color w:val="000000"/>
+        </w:rPr>
+        <w:t>Run tests.</w:t>
+      </w:r>
+    </w:p>
+    <w:p>
+      <w:pPr>
+        <w:numPr>
+          <w:ilvl w:val="0"/>
+          <w:numId w:val="14"/>
+        </w:numPr>
+        <w:spacing w:before="100" w:beforeAutospacing="1" w:after="100" w:afterAutospacing="1"/>
+        <w:rPr>
+          <w:color w:val="000000"/>
+        </w:rPr>
+      </w:pPr>
+      <w:r>
+        <w:rPr>
+          <w:color w:val="000000"/>
+        </w:rPr>
+        <w:t>Read the code in your editor.</w:t>
+      </w:r>
+    </w:p>
+    <w:p>
+      <w:pPr>
+        <w:numPr>
+          <w:ilvl w:val="0"/>
+          <w:numId w:val="14"/>
+        </w:numPr>
+        <w:spacing w:before="100" w:beforeAutospacing="1" w:after="100" w:afterAutospacing="1"/>
+        <w:rPr>
+          <w:color w:val="000000"/>
+        </w:rPr>
+      </w:pPr>
+      <w:r>
+        <w:rPr>
+          <w:color w:val="000000"/>
+        </w:rPr>
+        <w:t>Compare it with the target branch if needed.</w:t>
+      </w:r>
+    </w:p>
+    <w:p>
+      <w:pPr>
+        <w:numPr>
+          <w:ilvl w:val="0"/>
+          <w:numId w:val="14"/>
+        </w:numPr>
+        <w:spacing w:before="100" w:beforeAutospacing="1" w:after="100" w:afterAutospacing="1"/>
+        <w:rPr>
+          <w:color w:val="000000"/>
+        </w:rPr>
+      </w:pPr>
+      <w:r>
+        <w:rPr>
+          <w:color w:val="000000"/>
+        </w:rPr>
+        <w:t>Go back to GitHub to l</w:t>
+      </w:r>
+      <w:r>
+        <w:rPr>
+          <w:color w:val="000000"/>
+        </w:rPr>
+        <w:t>eave review comments and approve</w:t>
+      </w:r>
+      <w:r>
+        <w:rPr>
+          <w:color w:val="000000"/>
+        </w:rPr>
+        <w:t xml:space="preserve"> the merge or </w:t>
+      </w:r>
+      <w:r>
+        <w:rPr>
+          <w:color w:val="000000"/>
+        </w:rPr>
+        <w:t>request changes.</w:t>
+      </w:r>
+    </w:p>
+    <w:p>
+      <w:pPr>
+        <w:outlineLvl w:val="0"/>
+      </w:pPr>
+    </w:p>
+    <w:p>
+      <w:pPr>
+        <w:pStyle w:val="Normlnweb"/>
+        <w:rPr>
+          <w:color w:val="000000"/>
+        </w:rPr>
+      </w:pPr>
+      <w:r>
+        <w:rPr>
+          <w:color w:val="000000"/>
+        </w:rPr>
+        <w:t>Absolutely. In fact, reviewing a pull request by only looking at the diff is usually not enough for anything non-trivial.</w:t>
+      </w:r>
+    </w:p>
+    <w:p>
+      <w:pPr>
+        <w:pStyle w:val="Normlnweb"/>
+        <w:rPr>
+          <w:color w:val="000000"/>
+        </w:rPr>
+      </w:pPr>
+      <w:r>
+        <w:rPr>
+          <w:color w:val="000000"/>
+        </w:rPr>
+        <w:t>A common workflow is:</w:t>
+      </w:r>
+    </w:p>
+    <w:p>
+      <w:pPr>
+        <w:pStyle w:val="Normlnweb"/>
+        <w:numPr>
+          <w:ilvl w:val="0"/>
+          <w:numId w:val="15"/>
+        </w:numPr>
+        <w:rPr>
+          <w:color w:val="000000"/>
+        </w:rPr>
+      </w:pPr>
+      <w:r>
+        <w:rPr>
+          <w:color w:val="000000"/>
+        </w:rPr>
+        <w:t>Fetch your teammate's branch locally.</w:t>
+      </w:r>
+    </w:p>
+    <w:p>
+      <w:pPr>
+        <w:pStyle w:val="Normlnweb"/>
+        <w:numPr>
+          <w:ilvl w:val="0"/>
+          <w:numId w:val="15"/>
+        </w:numPr>
+        <w:rPr>
+          <w:color w:val="000000"/>
+        </w:rPr>
+      </w:pPr>
+      <w:r>
+        <w:rPr>
+          <w:color w:val="000000"/>
+        </w:rPr>
+        <w:t>Check it out.</w:t>
+      </w:r>
+    </w:p>
+    <w:p>
+      <w:pPr>
+        <w:pStyle w:val="Normlnweb"/>
+        <w:numPr>
+          <w:ilvl w:val="0"/>
+          <w:numId w:val="15"/>
+        </w:numPr>
+        <w:rPr>
+          <w:color w:val="000000"/>
+        </w:rPr>
+      </w:pPr>
+      <w:r>
+        <w:rPr>
+          <w:color w:val="000000"/>
+        </w:rPr>
+        <w:t>Build the project.</w:t>
+      </w:r>
+    </w:p>
+    <w:p>
+      <w:pPr>
+        <w:pStyle w:val="Normlnweb"/>
+        <w:numPr>
+          <w:ilvl w:val="0"/>
+          <w:numId w:val="15"/>
+        </w:numPr>
+        <w:rPr>
+          <w:color w:val="000000"/>
+        </w:rPr>
+      </w:pPr>
+      <w:r>
+        <w:rPr>
+          <w:color w:val="000000"/>
+        </w:rPr>
+        <w:t>Run tests.</w:t>
+      </w:r>
+    </w:p>
+    <w:p>
+      <w:pPr>
+        <w:pStyle w:val="Normlnweb"/>
+        <w:numPr>
+          <w:ilvl w:val="0"/>
+          <w:numId w:val="15"/>
+        </w:numPr>
+        <w:rPr>
+          <w:color w:val="000000"/>
+        </w:rPr>
+      </w:pPr>
+      <w:r>
+        <w:rPr>
+          <w:color w:val="000000"/>
+        </w:rPr>
+        <w:t>Read the code in your editor.</w:t>
+      </w:r>
+    </w:p>
+    <w:p>
+      <w:pPr>
+        <w:pStyle w:val="Normlnweb"/>
+        <w:numPr>
+          <w:ilvl w:val="0"/>
+          <w:numId w:val="15"/>
+        </w:numPr>
+        <w:rPr>
+          <w:color w:val="000000"/>
+        </w:rPr>
+      </w:pPr>
+      <w:r>
+        <w:rPr>
+          <w:color w:val="000000"/>
+        </w:rPr>
+        <w:t>Compare it with the target branch if needed.</w:t>
+      </w:r>
+    </w:p>
+    <w:p>
+      <w:pPr>
+        <w:pStyle w:val="Normlnweb"/>
+        <w:numPr>
+          <w:ilvl w:val="0"/>
+          <w:numId w:val="15"/>
+        </w:numPr>
+        <w:rPr>
+          <w:color w:val="000000"/>
+        </w:rPr>
+      </w:pPr>
+      <w:r>
+        <w:rPr>
+          <w:color w:val="000000"/>
+        </w:rPr>
+        <w:t>Leave review comments and approve/request changes.</w:t>
+      </w:r>
+    </w:p>
+    <w:p>
+      <w:pPr>
+        <w:pStyle w:val="Nadpis3"/>
+        <w:rPr>
+          <w:color w:val="000000"/>
+        </w:rPr>
+      </w:pPr>
+      <w:r>
+        <w:rPr>
+          <w:color w:val="000000"/>
+        </w:rPr>
+        <w:t>If the P</w:t>
+      </w:r>
+      <w:r>
+        <w:rPr>
+          <w:color w:val="000000"/>
+        </w:rPr>
+        <w:t xml:space="preserve">ull </w:t>
+      </w:r>
+      <w:r>
+        <w:rPr>
+          <w:color w:val="000000"/>
+        </w:rPr>
+        <w:t>R</w:t>
+      </w:r>
+      <w:r>
+        <w:rPr>
+          <w:color w:val="000000"/>
+        </w:rPr>
+        <w:t>equest</w:t>
+      </w:r>
+      <w:r>
+        <w:rPr>
+          <w:color w:val="000000"/>
+        </w:rPr>
+        <w:t xml:space="preserve"> comes from a branch in the same repository</w:t>
+      </w:r>
+    </w:p>
+    <w:p>
+      <w:pPr>
+        <w:pStyle w:val="Normlnweb"/>
+        <w:rPr>
+          <w:color w:val="000000"/>
+        </w:rPr>
+      </w:pPr>
+      <w:r>
+        <w:rPr>
+          <w:color w:val="000000"/>
+        </w:rPr>
+        <w:t>Suppose the P</w:t>
+      </w:r>
+      <w:r>
+        <w:rPr>
+          <w:color w:val="000000"/>
+        </w:rPr>
+        <w:t xml:space="preserve">ull </w:t>
+      </w:r>
+      <w:r>
+        <w:rPr>
+          <w:color w:val="000000"/>
+        </w:rPr>
+        <w:t>R</w:t>
+      </w:r>
+      <w:r>
+        <w:rPr>
+          <w:color w:val="000000"/>
+        </w:rPr>
+        <w:t>equest</w:t>
+      </w:r>
+      <w:r>
+        <w:rPr>
+          <w:color w:val="000000"/>
+        </w:rPr>
+        <w:t xml:space="preserve"> is</w:t>
+      </w:r>
+      <w:r>
+        <w:rPr>
+          <w:color w:val="000000"/>
+        </w:rPr>
+        <w:t xml:space="preserve"> to merge a feature branch into the development branch like this</w:t>
+      </w:r>
+      <w:r>
+        <w:rPr>
+          <w:color w:val="000000"/>
+        </w:rPr>
+        <w:t>:</w:t>
+      </w:r>
+    </w:p>
+    <w:p>
+      <w:pPr>
+        <w:pStyle w:val="FormtovanvHTML"/>
+        <w:ind w:left="284"/>
+        <w:rPr>
+          <w:rStyle w:val="KdHTML"/>
+          <w:color w:val="000000"/>
+        </w:rPr>
+      </w:pPr>
+      <w:r>
+        <w:rPr>
+          <w:rStyle w:val="KdHTML"/>
+          <w:color w:val="000000"/>
+        </w:rPr>
+        <w:t>refactor</w:t>
+      </w:r>
+      <w:r>
+        <w:rPr>
+          <w:rStyle w:val="KdHTML"/>
+          <w:color w:val="000000"/>
+        </w:rPr>
+        <w:t xml:space="preserve"> &lt;- teammate_</w:t>
+      </w:r>
+      <w:r>
+        <w:rPr>
+          <w:rStyle w:val="KdHTML"/>
+          <w:color w:val="000000"/>
+        </w:rPr>
+        <w:t>###0_</w:t>
+      </w:r>
+      <w:r>
+        <w:rPr>
+          <w:rStyle w:val="KdHTML"/>
+          <w:color w:val="000000"/>
+        </w:rPr>
+        <w:t>feature</w:t>
+      </w:r>
+    </w:p>
+    <w:p>
+      <w:pPr>
+        <w:pStyle w:val="Normlnweb"/>
+        <w:rPr>
+          <w:color w:val="000000"/>
+        </w:rPr>
+      </w:pPr>
+      <w:r>
+        <w:rPr>
+          <w:color w:val="000000"/>
+        </w:rPr>
+        <w:t>First</w:t>
+      </w:r>
+      <w:r>
+        <w:rPr>
+          <w:color w:val="000000"/>
+        </w:rPr>
+        <w:t>,</w:t>
+      </w:r>
+      <w:r>
+        <w:rPr>
+          <w:color w:val="000000"/>
+        </w:rPr>
+        <w:t xml:space="preserve"> fetch everything</w:t>
+      </w:r>
+      <w:r>
+        <w:rPr>
+          <w:color w:val="000000"/>
+        </w:rPr>
+        <w:t xml:space="preserve"> onto your computer</w:t>
+      </w:r>
+      <w:r>
+        <w:rPr>
+          <w:color w:val="000000"/>
+        </w:rPr>
+        <w:t>:</w:t>
+      </w:r>
+    </w:p>
+    <w:p>
+      <w:pPr>
+        <w:pStyle w:val="FormtovanvHTML"/>
+        <w:ind w:left="284"/>
+        <w:rPr>
+          <w:rStyle w:val="KdHTML"/>
+          <w:color w:val="000000"/>
+        </w:rPr>
+      </w:pPr>
+      <w:r>
+        <w:rPr>
+          <w:rStyle w:val="KdHTML"/>
+          <w:color w:val="000000"/>
+        </w:rPr>
+        <w:t>git fetch origin</w:t>
+      </w:r>
+    </w:p>
+    <w:p>
+      <w:pPr>
+        <w:pStyle w:val="Normlnweb"/>
+        <w:rPr>
+          <w:color w:val="000000"/>
+        </w:rPr>
+      </w:pPr>
+      <w:r>
+        <w:rPr>
+          <w:color w:val="000000"/>
+        </w:rPr>
+        <w:t>See available branches:</w:t>
+      </w:r>
+    </w:p>
+    <w:p>
+      <w:pPr>
+        <w:pStyle w:val="FormtovanvHTML"/>
+        <w:ind w:left="284"/>
+        <w:rPr>
+          <w:rStyle w:val="KdHTML"/>
+          <w:color w:val="000000"/>
+        </w:rPr>
+      </w:pPr>
+      <w:r>
+        <w:rPr>
+          <w:rStyle w:val="KdHTML"/>
+          <w:color w:val="000000"/>
+        </w:rPr>
+        <w:t>git branch -r</w:t>
+      </w:r>
+    </w:p>
+    <w:p>
+      <w:pPr>
+        <w:pStyle w:val="Normlnweb"/>
+        <w:rPr>
+          <w:color w:val="000000"/>
+        </w:rPr>
+      </w:pPr>
+      <w:r>
+        <w:rPr>
+          <w:color w:val="000000"/>
+        </w:rPr>
+        <w:lastRenderedPageBreak/>
+        <w:t xml:space="preserve">Then create a local branch tracking </w:t>
+      </w:r>
+      <w:r>
+        <w:rPr>
+          <w:color w:val="000000"/>
+        </w:rPr>
+        <w:t>the teammate’s branch</w:t>
+      </w:r>
+      <w:r>
+        <w:rPr>
+          <w:color w:val="000000"/>
+        </w:rPr>
+        <w:t>:</w:t>
+      </w:r>
+    </w:p>
+    <w:p>
+      <w:pPr>
+        <w:pStyle w:val="FormtovanvHTML"/>
+        <w:ind w:left="284"/>
+        <w:rPr>
+          <w:rStyle w:val="KdHTML"/>
+          <w:color w:val="000000"/>
+        </w:rPr>
+      </w:pPr>
+      <w:r>
+        <w:rPr>
+          <w:rStyle w:val="KdHTML"/>
+          <w:color w:val="000000"/>
+        </w:rPr>
+        <w:t>git checkout -b teammate_###0_feature origin/teammate_###0_feature</w:t>
+      </w:r>
+    </w:p>
+    <w:p>
+      <w:pPr>
+        <w:pStyle w:val="Normlnweb"/>
+        <w:rPr>
+          <w:color w:val="000000"/>
+        </w:rPr>
+      </w:pPr>
+      <w:r>
+        <w:rPr>
+          <w:color w:val="000000"/>
+        </w:rPr>
+        <w:t>Or with newer Git:</w:t>
+      </w:r>
+    </w:p>
+    <w:p>
+      <w:pPr>
+        <w:pStyle w:val="FormtovanvHTML"/>
+        <w:ind w:left="284"/>
+        <w:rPr>
+          <w:rStyle w:val="KdHTML"/>
+          <w:color w:val="000000"/>
+        </w:rPr>
+      </w:pPr>
+      <w:r>
+        <w:rPr>
+          <w:rStyle w:val="KdHTML"/>
+          <w:color w:val="000000"/>
+        </w:rPr>
+        <w:t>git switch --track origin/teammate_###0_feature</w:t>
+      </w:r>
+    </w:p>
+    <w:p>
+      <w:pPr>
+        <w:pStyle w:val="Normlnweb"/>
+        <w:rPr>
+          <w:color w:val="000000"/>
+        </w:rPr>
+      </w:pPr>
+      <w:r>
+        <w:rPr>
+          <w:color w:val="000000"/>
+        </w:rPr>
+        <w:t>Now you have their entire codebase locally.</w:t>
+      </w:r>
+      <w:r>
+        <w:rPr>
+          <w:color w:val="000000"/>
+        </w:rPr>
+        <w:t xml:space="preserve"> </w:t>
+      </w:r>
+      <w:r>
+        <w:rPr>
+          <w:color w:val="000000"/>
+        </w:rPr>
+        <w:t>You can</w:t>
+      </w:r>
+      <w:r>
+        <w:rPr>
+          <w:color w:val="000000"/>
+        </w:rPr>
+        <w:t xml:space="preserve"> open it in</w:t>
+      </w:r>
+      <w:r>
+        <w:rPr>
+          <w:color w:val="000000"/>
+        </w:rPr>
+        <w:t xml:space="preserve"> your IDE, read, modify,</w:t>
+      </w:r>
+      <w:r>
+        <w:rPr>
+          <w:color w:val="000000"/>
+        </w:rPr>
+        <w:t xml:space="preserve"> </w:t>
+      </w:r>
+      <w:r>
+        <w:rPr>
+          <w:color w:val="000000"/>
+        </w:rPr>
+        <w:t>run</w:t>
+      </w:r>
+      <w:r>
+        <w:rPr>
+          <w:color w:val="000000"/>
+        </w:rPr>
+        <w:t>,</w:t>
+      </w:r>
+      <w:r>
+        <w:rPr>
+          <w:color w:val="000000"/>
+        </w:rPr>
+        <w:t xml:space="preserve"> test, debug, etc.</w:t>
+      </w:r>
+    </w:p>
+    <w:p/>
+    <w:p>
+      <w:pPr>
+        <w:pStyle w:val="Nadpis3"/>
+        <w:rPr>
+          <w:color w:val="000000"/>
+        </w:rPr>
+      </w:pPr>
+    </w:p>
+    <w:p>
+      <w:pPr>
+        <w:pStyle w:val="Nadpis3"/>
+        <w:rPr>
+          <w:color w:val="000000"/>
+        </w:rPr>
+      </w:pPr>
+      <w:r>
+        <w:rPr>
+          <w:color w:val="000000"/>
+        </w:rPr>
+        <w:t>For a 42</w:t>
+      </w:r>
+      <w:r>
+        <w:rPr>
+          <w:color w:val="000000"/>
+        </w:rPr>
+        <w:t xml:space="preserve"> School</w:t>
+      </w:r>
+      <w:r>
+        <w:rPr>
+          <w:color w:val="000000"/>
+        </w:rPr>
+        <w:t xml:space="preserve"> project</w:t>
+      </w:r>
+    </w:p>
+    <w:p>
+      <w:pPr>
+        <w:pStyle w:val="Normlnweb"/>
+        <w:rPr>
+          <w:color w:val="000000"/>
+        </w:rPr>
+      </w:pPr>
+      <w:r>
+        <w:rPr>
+          <w:color w:val="000000"/>
+        </w:rPr>
+        <w:t>A recommend</w:t>
+      </w:r>
+      <w:r>
+        <w:rPr>
+          <w:color w:val="000000"/>
+        </w:rPr>
+        <w:t xml:space="preserve"> </w:t>
+      </w:r>
+      <w:r>
+        <w:rPr>
+          <w:color w:val="000000"/>
+        </w:rPr>
+        <w:t xml:space="preserve">workflow </w:t>
+      </w:r>
+      <w:r>
+        <w:rPr>
+          <w:color w:val="000000"/>
+        </w:rPr>
+        <w:t>would be the following</w:t>
+      </w:r>
+      <w:r>
+        <w:rPr>
+          <w:color w:val="000000"/>
+        </w:rPr>
+        <w:t>:</w:t>
+      </w:r>
+    </w:p>
+    <w:p>
+      <w:pPr>
+        <w:pStyle w:val="FormtovanvHTML"/>
+        <w:ind w:left="284"/>
+        <w:rPr>
+          <w:rStyle w:val="KdHTML"/>
+          <w:color w:val="000000"/>
+        </w:rPr>
+      </w:pPr>
+      <w:r>
+        <w:rPr>
+          <w:rStyle w:val="KdHTML"/>
+          <w:color w:val="000000"/>
+        </w:rPr>
+        <w:t>git fetch origin</w:t>
+      </w:r>
+    </w:p>
+    <w:p>
+      <w:pPr>
+        <w:pStyle w:val="FormtovanvHTML"/>
+        <w:ind w:left="284"/>
+        <w:rPr>
+          <w:rStyle w:val="KdHTML"/>
+          <w:color w:val="000000"/>
+        </w:rPr>
+      </w:pPr>
+      <w:r>
+        <w:rPr>
+          <w:rStyle w:val="KdHTML"/>
+          <w:color w:val="000000"/>
+        </w:rPr>
+        <w:t xml:space="preserve">git switch </w:t>
+      </w:r>
+      <w:r>
+        <w:rPr>
+          <w:rStyle w:val="KdHTML"/>
+          <w:color w:val="000000"/>
+        </w:rPr>
+        <w:t>teammate_###0_feature</w:t>
+      </w:r>
+    </w:p>
+    <w:p>
+      <w:pPr>
+        <w:pStyle w:val="FormtovanvHTML"/>
+        <w:ind w:left="284"/>
+        <w:rPr>
+          <w:rStyle w:val="KdHTML"/>
+          <w:color w:val="000000"/>
+        </w:rPr>
+      </w:pPr>
+    </w:p>
+    <w:p>
+      <w:pPr>
+        <w:pStyle w:val="FormtovanvHTML"/>
+        <w:ind w:left="284"/>
+        <w:rPr>
+          <w:rStyle w:val="KdHTML"/>
+          <w:color w:val="000000"/>
+        </w:rPr>
+      </w:pPr>
+      <w:r>
+        <w:rPr>
+          <w:rStyle w:val="KdHTML"/>
+          <w:color w:val="000000"/>
+        </w:rPr>
+        <w:t>make</w:t>
+      </w:r>
+    </w:p>
+    <w:p>
+      <w:pPr>
+        <w:pStyle w:val="FormtovanvHTML"/>
+        <w:ind w:left="284"/>
+        <w:rPr>
+          <w:rStyle w:val="KdHTML"/>
+          <w:color w:val="000000"/>
+        </w:rPr>
+      </w:pPr>
+      <w:r>
+        <w:rPr>
+          <w:rStyle w:val="KdHTML"/>
+          <w:color w:val="000000"/>
+        </w:rPr>
+        <w:t>norminette</w:t>
+      </w:r>
+    </w:p>
+    <w:p>
+      <w:pPr>
+        <w:pStyle w:val="FormtovanvHTML"/>
+        <w:ind w:left="284"/>
+        <w:rPr>
+          <w:rStyle w:val="KdHTML"/>
+          <w:color w:val="000000"/>
+        </w:rPr>
+      </w:pPr>
+      <w:r>
+        <w:rPr>
+          <w:rStyle w:val="KdHTML"/>
+          <w:color w:val="000000"/>
+        </w:rPr>
+        <w:t>valgrind ...</w:t>
+      </w:r>
+    </w:p>
+    <w:p>
+      <w:pPr>
+        <w:pStyle w:val="Normlnweb"/>
+        <w:rPr>
+          <w:color w:val="000000"/>
+        </w:rPr>
+      </w:pPr>
+      <w:r>
+        <w:rPr>
+          <w:color w:val="000000"/>
+        </w:rPr>
+        <w:t>Then compare against the target branch:</w:t>
+      </w:r>
+    </w:p>
+    <w:p>
+      <w:pPr>
+        <w:pStyle w:val="FormtovanvHTML"/>
+        <w:ind w:left="284"/>
+        <w:rPr>
+          <w:rStyle w:val="KdHTML"/>
+          <w:color w:val="000000"/>
+        </w:rPr>
+      </w:pPr>
+      <w:r>
+        <w:rPr>
+          <w:rStyle w:val="KdHTML"/>
+          <w:color w:val="000000"/>
+        </w:rPr>
+        <w:t xml:space="preserve">git diff </w:t>
+      </w:r>
+      <w:r>
+        <w:rPr>
+          <w:rStyle w:val="KdHTML"/>
+          <w:color w:val="000000"/>
+        </w:rPr>
+        <w:t>refactor</w:t>
+      </w:r>
+    </w:p>
+    <w:p>
+      <w:pPr>
+        <w:pStyle w:val="Normlnweb"/>
+        <w:rPr>
+          <w:color w:val="000000"/>
+        </w:rPr>
+      </w:pPr>
+      <w:r>
+        <w:rPr>
+          <w:color w:val="000000"/>
+        </w:rPr>
+        <w:t>or</w:t>
+      </w:r>
+    </w:p>
+    <w:p>
+      <w:pPr>
+        <w:pStyle w:val="FormtovanvHTML"/>
+        <w:ind w:left="284"/>
+        <w:rPr>
+          <w:rStyle w:val="KdHTML"/>
+          <w:color w:val="000000"/>
+        </w:rPr>
+      </w:pPr>
+      <w:r>
+        <w:rPr>
+          <w:rStyle w:val="KdHTML"/>
+          <w:color w:val="000000"/>
+        </w:rPr>
+        <w:t xml:space="preserve">git diff </w:t>
+      </w:r>
+      <w:r>
+        <w:rPr>
+          <w:rStyle w:val="KdHTML"/>
+          <w:color w:val="000000"/>
+        </w:rPr>
+        <w:t>refactor</w:t>
+      </w:r>
+      <w:r>
+        <w:rPr>
+          <w:rStyle w:val="KdHTML"/>
+          <w:color w:val="000000"/>
+        </w:rPr>
+        <w:t>...</w:t>
+      </w:r>
+      <w:r>
+        <w:rPr>
+          <w:rStyle w:val="KdHTML"/>
+          <w:color w:val="000000"/>
+        </w:rPr>
+        <w:t>teammate_###0_feature</w:t>
+      </w:r>
+    </w:p>
+    <w:p>
+      <w:pPr>
+        <w:pStyle w:val="Normlnweb"/>
+        <w:rPr>
+          <w:color w:val="000000"/>
+        </w:rPr>
+      </w:pPr>
+      <w:r>
+        <w:rPr>
+          <w:color w:val="000000"/>
+        </w:rPr>
+        <w:t>This lets you:</w:t>
+      </w:r>
+    </w:p>
+    <w:p>
+      <w:pPr>
+        <w:pStyle w:val="Normlnweb"/>
+        <w:numPr>
+          <w:ilvl w:val="0"/>
+          <w:numId w:val="16"/>
+        </w:numPr>
+        <w:rPr>
+          <w:color w:val="000000"/>
+        </w:rPr>
+      </w:pPr>
+      <w:r>
+        <w:rPr>
+          <w:color w:val="000000"/>
+        </w:rPr>
+        <w:t>inspect the code in your editor,</w:t>
+      </w:r>
+    </w:p>
+    <w:p>
+      <w:pPr>
+        <w:pStyle w:val="Normlnweb"/>
+        <w:numPr>
+          <w:ilvl w:val="0"/>
+          <w:numId w:val="16"/>
+        </w:numPr>
+        <w:rPr>
+          <w:color w:val="000000"/>
+        </w:rPr>
+      </w:pPr>
+      <w:r>
+        <w:rPr>
+          <w:color w:val="000000"/>
+        </w:rPr>
+        <w:t>search through the whole project,</w:t>
+      </w:r>
+    </w:p>
+    <w:p>
+      <w:pPr>
+        <w:pStyle w:val="Normlnweb"/>
+        <w:numPr>
+          <w:ilvl w:val="0"/>
+          <w:numId w:val="16"/>
+        </w:numPr>
+        <w:rPr>
+          <w:color w:val="000000"/>
+        </w:rPr>
+      </w:pPr>
+      <w:r>
+        <w:rPr>
+          <w:color w:val="000000"/>
+        </w:rPr>
+        <w:t>compile and run it,</w:t>
+      </w:r>
+    </w:p>
+    <w:p>
+      <w:pPr>
+        <w:pStyle w:val="Normlnweb"/>
+        <w:numPr>
+          <w:ilvl w:val="0"/>
+          <w:numId w:val="16"/>
+        </w:numPr>
+        <w:rPr>
+          <w:color w:val="000000"/>
+        </w:rPr>
+      </w:pPr>
+      <w:r>
+        <w:rPr>
+          <w:color w:val="000000"/>
+        </w:rPr>
+        <w:t>check for memory leaks,</w:t>
+      </w:r>
+    </w:p>
+    <w:p>
+      <w:pPr>
+        <w:pStyle w:val="Normlnweb"/>
+        <w:numPr>
+          <w:ilvl w:val="0"/>
+          <w:numId w:val="16"/>
+        </w:numPr>
+        <w:rPr>
+          <w:color w:val="000000"/>
+        </w:rPr>
+      </w:pPr>
+      <w:r>
+        <w:rPr>
+          <w:color w:val="000000"/>
+        </w:rPr>
+        <w:t>test edge cases,</w:t>
+      </w:r>
+    </w:p>
+    <w:p>
+      <w:pPr>
+        <w:pStyle w:val="Normlnweb"/>
+        <w:rPr>
+          <w:color w:val="000000"/>
+        </w:rPr>
+      </w:pPr>
+      <w:r>
+        <w:rPr>
+          <w:color w:val="000000"/>
+        </w:rPr>
+        <w:t>before deciding whether to approve the P</w:t>
+      </w:r>
+      <w:r>
+        <w:rPr>
+          <w:color w:val="000000"/>
+        </w:rPr>
+        <w:t xml:space="preserve">ull </w:t>
+      </w:r>
+      <w:r>
+        <w:rPr>
+          <w:color w:val="000000"/>
+        </w:rPr>
+        <w:t>R</w:t>
+      </w:r>
+      <w:r>
+        <w:rPr>
+          <w:color w:val="000000"/>
+        </w:rPr>
+        <w:t>equest</w:t>
+      </w:r>
+      <w:r>
+        <w:rPr>
+          <w:color w:val="000000"/>
+        </w:rPr>
+        <w:t>.</w:t>
+      </w:r>
+    </w:p>
+    <w:p>
+      <w:pPr>
+        <w:pStyle w:val="Normlnweb"/>
+        <w:rPr>
+          <w:color w:val="000000"/>
+        </w:rPr>
+      </w:pPr>
+      <w:r>
+        <w:rPr>
+          <w:color w:val="000000"/>
+        </w:rPr>
+        <w:t>That</w:t>
+      </w:r>
+      <w:r>
+        <w:rPr>
+          <w:color w:val="000000"/>
+        </w:rPr>
+        <w:t xml:space="preserve"> i</w:t>
+      </w:r>
+      <w:r>
+        <w:rPr>
+          <w:color w:val="000000"/>
+        </w:rPr>
+        <w:t xml:space="preserve">s much closer to how </w:t>
+      </w:r>
+      <w:r>
+        <w:rPr>
+          <w:color w:val="000000"/>
+        </w:rPr>
+        <w:t>Pull Request</w:t>
+      </w:r>
+      <w:r>
+        <w:rPr>
+          <w:color w:val="000000"/>
+        </w:rPr>
+        <w:t xml:space="preserve"> reviews are typically done in professional software teams than relying only on the "Files changed" tab.</w:t>
+      </w:r>
+    </w:p>
+    <w:p>
+      <w:pPr>
+        <w:outlineLvl w:val="0"/>
+      </w:pPr>
+    </w:p>
+    <w:p>
+      <w:pPr>
+        <w:outlineLvl w:val="0"/>
+        <w:rPr>
+          <w:b/>
+          <w:bCs/>
+          <w:color w:val="000000"/>
+          <w:kern w:val="36"/>
+          <w:sz w:val="48"/>
+          <w:szCs w:val="48"/>
+        </w:rPr>
+      </w:pPr>
+      <w:r>
+        <w:rPr>
+          <w:noProof/>
+          <w14:ligatures w14:val="standardContextual"/>
+        </w:rPr>
         <w:pict>
           <v:rect id="_x0000_i1032" alt="" style="width:453.6pt;height:.05pt;mso-width-percent:0;mso-height-percent:0;mso-width-percent:0;mso-height-percent:0" o:hralign="center" o:hrstd="t" o:hr="t" fillcolor="#a0a0a0" stroked="f"/>
         </w:pict>
       </w:r>
+    </w:p>
+    <w:p>
+      <w:pPr>
+        <w:outlineLvl w:val="0"/>
+        <w:rPr>
+          <w:b/>
+          <w:bCs/>
+          <w:color w:val="000000"/>
+          <w:kern w:val="36"/>
+          <w:sz w:val="48"/>
+          <w:szCs w:val="48"/>
+        </w:rPr>
+      </w:pPr>
     </w:p>
     <w:p>
       <w:pPr>
@@ -11741,9 +12884,122 @@
     </w:lvl>
   </w:abstractNum>
   <w:abstractNum w:abstractNumId="3" w15:restartNumberingAfterBreak="0">
-    <w:nsid w:val="30154975"/>
+    <w:nsid w:val="1834253A"/>
     <w:multiLevelType w:val="multilevel"/>
-    <w:tmpl w:val="84E611A0"/>
+    <w:tmpl w:val="CF86E46E"/>
+    <w:lvl w:ilvl="0">
+      <w:start w:val="1"/>
+      <w:numFmt w:val="decimal"/>
+      <w:lvlText w:val="%1."/>
+      <w:lvlJc w:val="left"/>
+      <w:pPr>
+        <w:tabs>
+          <w:tab w:val="num" w:pos="720"/>
+        </w:tabs>
+        <w:ind w:left="720" w:hanging="360"/>
+      </w:pPr>
+    </w:lvl>
+    <w:lvl w:ilvl="1" w:tentative="1">
+      <w:start w:val="1"/>
+      <w:numFmt w:val="decimal"/>
+      <w:lvlText w:val="%2."/>
+      <w:lvlJc w:val="left"/>
+      <w:pPr>
+        <w:tabs>
+          <w:tab w:val="num" w:pos="1440"/>
+        </w:tabs>
+        <w:ind w:left="1440" w:hanging="360"/>
+      </w:pPr>
+    </w:lvl>
+    <w:lvl w:ilvl="2" w:tentative="1">
+      <w:start w:val="1"/>
+      <w:numFmt w:val="decimal"/>
+      <w:lvlText w:val="%3."/>
+      <w:lvlJc w:val="left"/>
+      <w:pPr>
+        <w:tabs>
+          <w:tab w:val="num" w:pos="2160"/>
+        </w:tabs>
+        <w:ind w:left="2160" w:hanging="360"/>
+      </w:pPr>
+    </w:lvl>
+    <w:lvl w:ilvl="3" w:tentative="1">
+      <w:start w:val="1"/>
+      <w:numFmt w:val="decimal"/>
+      <w:lvlText w:val="%4."/>
+      <w:lvlJc w:val="left"/>
+      <w:pPr>
+        <w:tabs>
+          <w:tab w:val="num" w:pos="2880"/>
+        </w:tabs>
+        <w:ind w:left="2880" w:hanging="360"/>
+      </w:pPr>
+    </w:lvl>
+    <w:lvl w:ilvl="4" w:tentative="1">
+      <w:start w:val="1"/>
+      <w:numFmt w:val="decimal"/>
+      <w:lvlText w:val="%5."/>
+      <w:lvlJc w:val="left"/>
+      <w:pPr>
+        <w:tabs>
+          <w:tab w:val="num" w:pos="3600"/>
+        </w:tabs>
+        <w:ind w:left="3600" w:hanging="360"/>
+      </w:pPr>
+    </w:lvl>
+    <w:lvl w:ilvl="5" w:tentative="1">
+      <w:start w:val="1"/>
+      <w:numFmt w:val="decimal"/>
+      <w:lvlText w:val="%6."/>
+      <w:lvlJc w:val="left"/>
+      <w:pPr>
+        <w:tabs>
+          <w:tab w:val="num" w:pos="4320"/>
+        </w:tabs>
+        <w:ind w:left="4320" w:hanging="360"/>
+      </w:pPr>
+    </w:lvl>
+    <w:lvl w:ilvl="6" w:tentative="1">
+      <w:start w:val="1"/>
+      <w:numFmt w:val="decimal"/>
+      <w:lvlText w:val="%7."/>
+      <w:lvlJc w:val="left"/>
+      <w:pPr>
+        <w:tabs>
+          <w:tab w:val="num" w:pos="5040"/>
+        </w:tabs>
+        <w:ind w:left="5040" w:hanging="360"/>
+      </w:pPr>
+    </w:lvl>
+    <w:lvl w:ilvl="7" w:tentative="1">
+      <w:start w:val="1"/>
+      <w:numFmt w:val="decimal"/>
+      <w:lvlText w:val="%8."/>
+      <w:lvlJc w:val="left"/>
+      <w:pPr>
+        <w:tabs>
+          <w:tab w:val="num" w:pos="5760"/>
+        </w:tabs>
+        <w:ind w:left="5760" w:hanging="360"/>
+      </w:pPr>
+    </w:lvl>
+    <w:lvl w:ilvl="8" w:tentative="1">
+      <w:start w:val="1"/>
+      <w:numFmt w:val="decimal"/>
+      <w:lvlText w:val="%9."/>
+      <w:lvlJc w:val="left"/>
+      <w:pPr>
+        <w:tabs>
+          <w:tab w:val="num" w:pos="6480"/>
+        </w:tabs>
+        <w:ind w:left="6480" w:hanging="360"/>
+      </w:pPr>
+    </w:lvl>
+  </w:abstractNum>
+  <w:abstractNum w:abstractNumId="4" w15:restartNumberingAfterBreak="0">
+    <w:nsid w:val="21F02AAE"/>
+    <w:multiLevelType w:val="multilevel"/>
+    <w:tmpl w:val="11984862"/>
     <w:lvl w:ilvl="0">
       <w:start w:val="1"/>
       <w:numFmt w:val="bullet"/>
@@ -11889,10 +13145,10 @@
       </w:rPr>
     </w:lvl>
   </w:abstractNum>
-  <w:abstractNum w:abstractNumId="4" w15:restartNumberingAfterBreak="0">
-    <w:nsid w:val="319857C4"/>
+  <w:abstractNum w:abstractNumId="5" w15:restartNumberingAfterBreak="0">
+    <w:nsid w:val="30154975"/>
     <w:multiLevelType w:val="multilevel"/>
-    <w:tmpl w:val="A1281EFA"/>
+    <w:tmpl w:val="84E611A0"/>
     <w:lvl w:ilvl="0">
       <w:start w:val="1"/>
       <w:numFmt w:val="bullet"/>
@@ -12038,10 +13294,10 @@
       </w:rPr>
     </w:lvl>
   </w:abstractNum>
-  <w:abstractNum w:abstractNumId="5" w15:restartNumberingAfterBreak="0">
-    <w:nsid w:val="42AD30F7"/>
+  <w:abstractNum w:abstractNumId="6" w15:restartNumberingAfterBreak="0">
+    <w:nsid w:val="319857C4"/>
     <w:multiLevelType w:val="multilevel"/>
-    <w:tmpl w:val="52ACE54E"/>
+    <w:tmpl w:val="A1281EFA"/>
     <w:lvl w:ilvl="0">
       <w:start w:val="1"/>
       <w:numFmt w:val="bullet"/>
@@ -12187,10 +13443,10 @@
       </w:rPr>
     </w:lvl>
   </w:abstractNum>
-  <w:abstractNum w:abstractNumId="6" w15:restartNumberingAfterBreak="0">
-    <w:nsid w:val="43A67E29"/>
+  <w:abstractNum w:abstractNumId="7" w15:restartNumberingAfterBreak="0">
+    <w:nsid w:val="42AD30F7"/>
     <w:multiLevelType w:val="multilevel"/>
-    <w:tmpl w:val="63D66ACC"/>
+    <w:tmpl w:val="52ACE54E"/>
     <w:lvl w:ilvl="0">
       <w:start w:val="1"/>
       <w:numFmt w:val="bullet"/>
@@ -12336,10 +13592,10 @@
       </w:rPr>
     </w:lvl>
   </w:abstractNum>
-  <w:abstractNum w:abstractNumId="7" w15:restartNumberingAfterBreak="0">
-    <w:nsid w:val="4D2C5492"/>
+  <w:abstractNum w:abstractNumId="8" w15:restartNumberingAfterBreak="0">
+    <w:nsid w:val="43A67E29"/>
     <w:multiLevelType w:val="multilevel"/>
-    <w:tmpl w:val="45567942"/>
+    <w:tmpl w:val="63D66ACC"/>
     <w:lvl w:ilvl="0">
       <w:start w:val="1"/>
       <w:numFmt w:val="bullet"/>
@@ -12485,10 +13741,10 @@
       </w:rPr>
     </w:lvl>
   </w:abstractNum>
-  <w:abstractNum w:abstractNumId="8" w15:restartNumberingAfterBreak="0">
-    <w:nsid w:val="55446516"/>
+  <w:abstractNum w:abstractNumId="9" w15:restartNumberingAfterBreak="0">
+    <w:nsid w:val="4D2C5492"/>
     <w:multiLevelType w:val="multilevel"/>
-    <w:tmpl w:val="B922DF9E"/>
+    <w:tmpl w:val="45567942"/>
     <w:lvl w:ilvl="0">
       <w:start w:val="1"/>
       <w:numFmt w:val="bullet"/>
@@ -12634,10 +13890,10 @@
       </w:rPr>
     </w:lvl>
   </w:abstractNum>
-  <w:abstractNum w:abstractNumId="9" w15:restartNumberingAfterBreak="0">
-    <w:nsid w:val="55904237"/>
+  <w:abstractNum w:abstractNumId="10" w15:restartNumberingAfterBreak="0">
+    <w:nsid w:val="55446516"/>
     <w:multiLevelType w:val="multilevel"/>
-    <w:tmpl w:val="12BADA70"/>
+    <w:tmpl w:val="B922DF9E"/>
     <w:lvl w:ilvl="0">
       <w:start w:val="1"/>
       <w:numFmt w:val="bullet"/>
@@ -12783,10 +14039,10 @@
       </w:rPr>
     </w:lvl>
   </w:abstractNum>
-  <w:abstractNum w:abstractNumId="10" w15:restartNumberingAfterBreak="0">
-    <w:nsid w:val="5CFF691B"/>
+  <w:abstractNum w:abstractNumId="11" w15:restartNumberingAfterBreak="0">
+    <w:nsid w:val="55904237"/>
     <w:multiLevelType w:val="multilevel"/>
-    <w:tmpl w:val="DC16CEE6"/>
+    <w:tmpl w:val="12BADA70"/>
     <w:lvl w:ilvl="0">
       <w:start w:val="1"/>
       <w:numFmt w:val="bullet"/>
@@ -12932,10 +14188,123 @@
       </w:rPr>
     </w:lvl>
   </w:abstractNum>
-  <w:abstractNum w:abstractNumId="11" w15:restartNumberingAfterBreak="0">
-    <w:nsid w:val="6E1F6E4C"/>
+  <w:abstractNum w:abstractNumId="12" w15:restartNumberingAfterBreak="0">
+    <w:nsid w:val="5BAD4098"/>
     <w:multiLevelType w:val="multilevel"/>
-    <w:tmpl w:val="5E48611C"/>
+    <w:tmpl w:val="80769DCC"/>
+    <w:lvl w:ilvl="0">
+      <w:start w:val="1"/>
+      <w:numFmt w:val="decimal"/>
+      <w:lvlText w:val="%1."/>
+      <w:lvlJc w:val="left"/>
+      <w:pPr>
+        <w:tabs>
+          <w:tab w:val="num" w:pos="720"/>
+        </w:tabs>
+        <w:ind w:left="720" w:hanging="360"/>
+      </w:pPr>
+    </w:lvl>
+    <w:lvl w:ilvl="1" w:tentative="1">
+      <w:start w:val="1"/>
+      <w:numFmt w:val="decimal"/>
+      <w:lvlText w:val="%2."/>
+      <w:lvlJc w:val="left"/>
+      <w:pPr>
+        <w:tabs>
+          <w:tab w:val="num" w:pos="1440"/>
+        </w:tabs>
+        <w:ind w:left="1440" w:hanging="360"/>
+      </w:pPr>
+    </w:lvl>
+    <w:lvl w:ilvl="2" w:tentative="1">
+      <w:start w:val="1"/>
+      <w:numFmt w:val="decimal"/>
+      <w:lvlText w:val="%3."/>
+      <w:lvlJc w:val="left"/>
+      <w:pPr>
+        <w:tabs>
+          <w:tab w:val="num" w:pos="2160"/>
+        </w:tabs>
+        <w:ind w:left="2160" w:hanging="360"/>
+      </w:pPr>
+    </w:lvl>
+    <w:lvl w:ilvl="3" w:tentative="1">
+      <w:start w:val="1"/>
+      <w:numFmt w:val="decimal"/>
+      <w:lvlText w:val="%4."/>
+      <w:lvlJc w:val="left"/>
+      <w:pPr>
+        <w:tabs>
+          <w:tab w:val="num" w:pos="2880"/>
+        </w:tabs>
+        <w:ind w:left="2880" w:hanging="360"/>
+      </w:pPr>
+    </w:lvl>
+    <w:lvl w:ilvl="4" w:tentative="1">
+      <w:start w:val="1"/>
+      <w:numFmt w:val="decimal"/>
+      <w:lvlText w:val="%5."/>
+      <w:lvlJc w:val="left"/>
+      <w:pPr>
+        <w:tabs>
+          <w:tab w:val="num" w:pos="3600"/>
+        </w:tabs>
+        <w:ind w:left="3600" w:hanging="360"/>
+      </w:pPr>
+    </w:lvl>
+    <w:lvl w:ilvl="5" w:tentative="1">
+      <w:start w:val="1"/>
+      <w:numFmt w:val="decimal"/>
+      <w:lvlText w:val="%6."/>
+      <w:lvlJc w:val="left"/>
+      <w:pPr>
+        <w:tabs>
+          <w:tab w:val="num" w:pos="4320"/>
+        </w:tabs>
+        <w:ind w:left="4320" w:hanging="360"/>
+      </w:pPr>
+    </w:lvl>
+    <w:lvl w:ilvl="6" w:tentative="1">
+      <w:start w:val="1"/>
+      <w:numFmt w:val="decimal"/>
+      <w:lvlText w:val="%7."/>
+      <w:lvlJc w:val="left"/>
+      <w:pPr>
+        <w:tabs>
+          <w:tab w:val="num" w:pos="5040"/>
+        </w:tabs>
+        <w:ind w:left="5040" w:hanging="360"/>
+      </w:pPr>
+    </w:lvl>
+    <w:lvl w:ilvl="7" w:tentative="1">
+      <w:start w:val="1"/>
+      <w:numFmt w:val="decimal"/>
+      <w:lvlText w:val="%8."/>
+      <w:lvlJc w:val="left"/>
+      <w:pPr>
+        <w:tabs>
+          <w:tab w:val="num" w:pos="5760"/>
+        </w:tabs>
+        <w:ind w:left="5760" w:hanging="360"/>
+      </w:pPr>
+    </w:lvl>
+    <w:lvl w:ilvl="8" w:tentative="1">
+      <w:start w:val="1"/>
+      <w:numFmt w:val="decimal"/>
+      <w:lvlText w:val="%9."/>
+      <w:lvlJc w:val="left"/>
+      <w:pPr>
+        <w:tabs>
+          <w:tab w:val="num" w:pos="6480"/>
+        </w:tabs>
+        <w:ind w:left="6480" w:hanging="360"/>
+      </w:pPr>
+    </w:lvl>
+  </w:abstractNum>
+  <w:abstractNum w:abstractNumId="13" w15:restartNumberingAfterBreak="0">
+    <w:nsid w:val="5CFF691B"/>
+    <w:multiLevelType w:val="multilevel"/>
+    <w:tmpl w:val="DC16CEE6"/>
     <w:lvl w:ilvl="0">
       <w:start w:val="1"/>
       <w:numFmt w:val="bullet"/>
@@ -13081,7 +14450,156 @@
       </w:rPr>
     </w:lvl>
   </w:abstractNum>
-  <w:abstractNum w:abstractNumId="12" w15:restartNumberingAfterBreak="0">
+  <w:abstractNum w:abstractNumId="14" w15:restartNumberingAfterBreak="0">
+    <w:nsid w:val="6E1F6E4C"/>
+    <w:multiLevelType w:val="multilevel"/>
+    <w:tmpl w:val="5E48611C"/>
+    <w:lvl w:ilvl="0">
+      <w:start w:val="1"/>
+      <w:numFmt w:val="bullet"/>
+      <w:lvlText w:val=""/>
+      <w:lvlJc w:val="left"/>
+      <w:pPr>
+        <w:tabs>
+          <w:tab w:val="num" w:pos="720"/>
+        </w:tabs>
+        <w:ind w:left="720" w:hanging="360"/>
+      </w:pPr>
+      <w:rPr>
+        <w:rFonts w:ascii="Symbol" w:hAnsi="Symbol" w:hint="default"/>
+        <w:sz w:val="20"/>
+      </w:rPr>
+    </w:lvl>
+    <w:lvl w:ilvl="1" w:tentative="1">
+      <w:start w:val="1"/>
+      <w:numFmt w:val="bullet"/>
+      <w:lvlText w:val="o"/>
+      <w:lvlJc w:val="left"/>
+      <w:pPr>
+        <w:tabs>
+          <w:tab w:val="num" w:pos="1440"/>
+        </w:tabs>
+        <w:ind w:left="1440" w:hanging="360"/>
+      </w:pPr>
+      <w:rPr>
+        <w:rFonts w:ascii="Courier New" w:hAnsi="Courier New" w:hint="default"/>
+        <w:sz w:val="20"/>
+      </w:rPr>
+    </w:lvl>
+    <w:lvl w:ilvl="2" w:tentative="1">
+      <w:start w:val="1"/>
+      <w:numFmt w:val="bullet"/>
+      <w:lvlText w:val=""/>
+      <w:lvlJc w:val="left"/>
+      <w:pPr>
+        <w:tabs>
+          <w:tab w:val="num" w:pos="2160"/>
+        </w:tabs>
+        <w:ind w:left="2160" w:hanging="360"/>
+      </w:pPr>
+      <w:rPr>
+        <w:rFonts w:ascii="Wingdings" w:hAnsi="Wingdings" w:hint="default"/>
+        <w:sz w:val="20"/>
+      </w:rPr>
+    </w:lvl>
+    <w:lvl w:ilvl="3" w:tentative="1">
+      <w:start w:val="1"/>
+      <w:numFmt w:val="bullet"/>
+      <w:lvlText w:val=""/>
+      <w:lvlJc w:val="left"/>
+      <w:pPr>
+        <w:tabs>
+          <w:tab w:val="num" w:pos="2880"/>
+        </w:tabs>
+        <w:ind w:left="2880" w:hanging="360"/>
+      </w:pPr>
+      <w:rPr>
+        <w:rFonts w:ascii="Wingdings" w:hAnsi="Wingdings" w:hint="default"/>
+        <w:sz w:val="20"/>
+      </w:rPr>
+    </w:lvl>
+    <w:lvl w:ilvl="4" w:tentative="1">
+      <w:start w:val="1"/>
+      <w:numFmt w:val="bullet"/>
+      <w:lvlText w:val=""/>
+      <w:lvlJc w:val="left"/>
+      <w:pPr>
+        <w:tabs>
+          <w:tab w:val="num" w:pos="3600"/>
+        </w:tabs>
+        <w:ind w:left="3600" w:hanging="360"/>
+      </w:pPr>
+      <w:rPr>
+        <w:rFonts w:ascii="Wingdings" w:hAnsi="Wingdings" w:hint="default"/>
+        <w:sz w:val="20"/>
+      </w:rPr>
+    </w:lvl>
+    <w:lvl w:ilvl="5" w:tentative="1">
+      <w:start w:val="1"/>
+      <w:numFmt w:val="bullet"/>
+      <w:lvlText w:val=""/>
+      <w:lvlJc w:val="left"/>
+      <w:pPr>
+        <w:tabs>
+          <w:tab w:val="num" w:pos="4320"/>
+        </w:tabs>
+        <w:ind w:left="4320" w:hanging="360"/>
+      </w:pPr>
+      <w:rPr>
+        <w:rFonts w:ascii="Wingdings" w:hAnsi="Wingdings" w:hint="default"/>
+        <w:sz w:val="20"/>
+      </w:rPr>
+    </w:lvl>
+    <w:lvl w:ilvl="6" w:tentative="1">
+      <w:start w:val="1"/>
+      <w:numFmt w:val="bullet"/>
+      <w:lvlText w:val=""/>
+      <w:lvlJc w:val="left"/>
+      <w:pPr>
+        <w:tabs>
+          <w:tab w:val="num" w:pos="5040"/>
+        </w:tabs>
+        <w:ind w:left="5040" w:hanging="360"/>
+      </w:pPr>
+      <w:rPr>
+        <w:rFonts w:ascii="Wingdings" w:hAnsi="Wingdings" w:hint="default"/>
+        <w:sz w:val="20"/>
+      </w:rPr>
+    </w:lvl>
+    <w:lvl w:ilvl="7" w:tentative="1">
+      <w:start w:val="1"/>
+      <w:numFmt w:val="bullet"/>
+      <w:lvlText w:val=""/>
+      <w:lvlJc w:val="left"/>
+      <w:pPr>
+        <w:tabs>
+          <w:tab w:val="num" w:pos="5760"/>
+        </w:tabs>
+        <w:ind w:left="5760" w:hanging="360"/>
+      </w:pPr>
+      <w:rPr>
+        <w:rFonts w:ascii="Wingdings" w:hAnsi="Wingdings" w:hint="default"/>
+        <w:sz w:val="20"/>
+      </w:rPr>
+    </w:lvl>
+    <w:lvl w:ilvl="8" w:tentative="1">
+      <w:start w:val="1"/>
+      <w:numFmt w:val="bullet"/>
+      <w:lvlText w:val=""/>
+      <w:lvlJc w:val="left"/>
+      <w:pPr>
+        <w:tabs>
+          <w:tab w:val="num" w:pos="6480"/>
+        </w:tabs>
+        <w:ind w:left="6480" w:hanging="360"/>
+      </w:pPr>
+      <w:rPr>
+        <w:rFonts w:ascii="Wingdings" w:hAnsi="Wingdings" w:hint="default"/>
+        <w:sz w:val="20"/>
+      </w:rPr>
+    </w:lvl>
+  </w:abstractNum>
+  <w:abstractNum w:abstractNumId="15" w15:restartNumberingAfterBreak="0">
     <w:nsid w:val="7A641D98"/>
     <w:multiLevelType w:val="hybridMultilevel"/>
     <w:tmpl w:val="C45CB6F2"/>
@@ -13174,40 +14692,49 @@
     <w:abstractNumId w:val="0"/>
   </w:num>
   <w:num w:numId="2" w16cid:durableId="819615453">
-    <w:abstractNumId w:val="7"/>
+    <w:abstractNumId w:val="9"/>
   </w:num>
   <w:num w:numId="3" w16cid:durableId="1529876881">
-    <w:abstractNumId w:val="4"/>
+    <w:abstractNumId w:val="6"/>
   </w:num>
   <w:num w:numId="4" w16cid:durableId="256251990">
     <w:abstractNumId w:val="1"/>
   </w:num>
   <w:num w:numId="5" w16cid:durableId="432669033">
+    <w:abstractNumId w:val="10"/>
+  </w:num>
+  <w:num w:numId="6" w16cid:durableId="843864044">
+    <w:abstractNumId w:val="5"/>
+  </w:num>
+  <w:num w:numId="7" w16cid:durableId="1246576682">
     <w:abstractNumId w:val="8"/>
   </w:num>
-  <w:num w:numId="6" w16cid:durableId="843864044">
-    <w:abstractNumId w:val="3"/>
-  </w:num>
-  <w:num w:numId="7" w16cid:durableId="1246576682">
-    <w:abstractNumId w:val="6"/>
-  </w:num>
   <w:num w:numId="8" w16cid:durableId="1310285969">
-    <w:abstractNumId w:val="5"/>
+    <w:abstractNumId w:val="7"/>
   </w:num>
   <w:num w:numId="9" w16cid:durableId="1813252098">
-    <w:abstractNumId w:val="11"/>
+    <w:abstractNumId w:val="14"/>
   </w:num>
   <w:num w:numId="10" w16cid:durableId="1747995714">
-    <w:abstractNumId w:val="10"/>
+    <w:abstractNumId w:val="13"/>
   </w:num>
   <w:num w:numId="11" w16cid:durableId="646082709">
-    <w:abstractNumId w:val="12"/>
+    <w:abstractNumId w:val="15"/>
   </w:num>
   <w:num w:numId="12" w16cid:durableId="1565677331">
-    <w:abstractNumId w:val="9"/>
+    <w:abstractNumId w:val="11"/>
   </w:num>
   <w:num w:numId="13" w16cid:durableId="960263906">
     <w:abstractNumId w:val="2"/>
+  </w:num>
+  <w:num w:numId="14" w16cid:durableId="460422398">
+    <w:abstractNumId w:val="12"/>
+  </w:num>
+  <w:num w:numId="15" w16cid:durableId="1825272573">
+    <w:abstractNumId w:val="3"/>
+  </w:num>
+  <w:num w:numId="16" w16cid:durableId="491411117">
+    <w:abstractNumId w:val="4"/>
   </w:num>
 </w:numbering>
 </file>
@@ -13608,7 +15135,7 @@
   <w:style w:type="paragraph" w:default="1" w:styleId="Normln">
     <w:name w:val="Normal"/>
     <w:qFormat/>
-    <w:rsid w:val="00F1641D"/>
+    <w:rsid w:val="00630C39"/>
     <w:rPr>
       <w:rFonts w:ascii="Times New Roman" w:eastAsia="Times New Roman" w:hAnsi="Times New Roman" w:cs="Times New Roman"/>
       <w:kern w:val="0"/>
@@ -13674,7 +15201,6 @@
   <w:style w:type="character" w:default="1" w:styleId="Standardnpsmoodstavce">
     <w:name w:val="Default Paragraph Font"/>
     <w:uiPriority w:val="1"/>
-    <w:semiHidden/>
     <w:unhideWhenUsed/>
   </w:style>
   <w:style w:type="table" w:default="1" w:styleId="Normlntabulka">
@@ -13786,7 +15312,6 @@
     <w:name w:val="Normal (Web)"/>
     <w:basedOn w:val="Normln"/>
     <w:uiPriority w:val="99"/>
-    <w:semiHidden/>
     <w:unhideWhenUsed/>
     <w:rsid w:val="00472814"/>
     <w:pPr>

</xml_diff>

<commit_message>
add explanation of different Merge pull request options
</commit_message>
<xml_diff>
--- a/Push-Swap Workflow.docx
+++ b/Push-Swap Workflow.docx
@@ -699,7 +699,7 @@
           <w14:ligatures w14:val="standardContextual"/>
         </w:rPr>
         <w:pict>
-          <v:rect id="_x0000_i1039" alt="" style="width:453.6pt;height:.05pt;mso-width-percent:0;mso-height-percent:0;mso-width-percent:0;mso-height-percent:0" o:hralign="center" o:hrstd="t" o:hr="t" fillcolor="#a0a0a0" stroked="f"/>
+          <v:rect id="_x0000_i1040" alt="" style="width:453.6pt;height:.05pt;mso-width-percent:0;mso-height-percent:0;mso-width-percent:0;mso-height-percent:0" o:hralign="center" o:hrstd="t" o:hr="t" fillcolor="#a0a0a0" stroked="f"/>
         </w:pict>
       </w:r>
     </w:p>
@@ -1311,7 +1311,7 @@
           <w14:ligatures w14:val="standardContextual"/>
         </w:rPr>
         <w:pict>
-          <v:rect id="_x0000_i1038" alt="" style="width:453.6pt;height:.05pt;mso-width-percent:0;mso-height-percent:0;mso-width-percent:0;mso-height-percent:0" o:hralign="center" o:hrstd="t" o:hr="t" fillcolor="#a0a0a0" stroked="f"/>
+          <v:rect id="_x0000_i1039" alt="" style="width:453.6pt;height:.05pt;mso-width-percent:0;mso-height-percent:0;mso-width-percent:0;mso-height-percent:0" o:hralign="center" o:hrstd="t" o:hr="t" fillcolor="#a0a0a0" stroked="f"/>
         </w:pict>
       </w:r>
     </w:p>
@@ -1728,7 +1728,7 @@
           <w14:ligatures w14:val="standardContextual"/>
         </w:rPr>
         <w:pict>
-          <v:rect id="_x0000_i1037" alt="" style="width:453.6pt;height:.05pt;mso-width-percent:0;mso-height-percent:0;mso-width-percent:0;mso-height-percent:0" o:hralign="center" o:hrstd="t" o:hr="t" fillcolor="#a0a0a0" stroked="f"/>
+          <v:rect id="_x0000_i1038" alt="" style="width:453.6pt;height:.05pt;mso-width-percent:0;mso-height-percent:0;mso-width-percent:0;mso-height-percent:0" o:hralign="center" o:hrstd="t" o:hr="t" fillcolor="#a0a0a0" stroked="f"/>
         </w:pict>
       </w:r>
     </w:p>
@@ -2399,7 +2399,7 @@
           <w14:ligatures w14:val="standardContextual"/>
         </w:rPr>
         <w:pict>
-          <v:rect id="_x0000_i1036" alt="" style="width:453.6pt;height:.05pt;mso-width-percent:0;mso-height-percent:0;mso-width-percent:0;mso-height-percent:0" o:hralign="center" o:hrstd="t" o:hr="t" fillcolor="#a0a0a0" stroked="f"/>
+          <v:rect id="_x0000_i1037" alt="" style="width:453.6pt;height:.05pt;mso-width-percent:0;mso-height-percent:0;mso-width-percent:0;mso-height-percent:0" o:hralign="center" o:hrstd="t" o:hr="t" fillcolor="#a0a0a0" stroked="f"/>
         </w:pict>
       </w:r>
     </w:p>
@@ -2601,7 +2601,7 @@
           <w14:ligatures w14:val="standardContextual"/>
         </w:rPr>
         <w:pict>
-          <v:rect id="_x0000_i1035" alt="" style="width:453.6pt;height:.05pt;mso-width-percent:0;mso-height-percent:0;mso-width-percent:0;mso-height-percent:0" o:hralign="center" o:hrstd="t" o:hr="t" fillcolor="#a0a0a0" stroked="f"/>
+          <v:rect id="_x0000_i1036" alt="" style="width:453.6pt;height:.05pt;mso-width-percent:0;mso-height-percent:0;mso-width-percent:0;mso-height-percent:0" o:hralign="center" o:hrstd="t" o:hr="t" fillcolor="#a0a0a0" stroked="f"/>
         </w:pict>
       </w:r>
     </w:p>
@@ -3237,7 +3237,7 @@
         </w:rPr>
         <w:lastRenderedPageBreak/>
         <w:pict>
-          <v:rect id="_x0000_i1034" alt="" style="width:453.6pt;height:.05pt;mso-width-percent:0;mso-height-percent:0;mso-width-percent:0;mso-height-percent:0" o:hralign="center" o:hrstd="t" o:hr="t" fillcolor="#a0a0a0" stroked="f"/>
+          <v:rect id="_x0000_i1035" alt="" style="width:453.6pt;height:.05pt;mso-width-percent:0;mso-height-percent:0;mso-width-percent:0;mso-height-percent:0" o:hralign="center" o:hrstd="t" o:hr="t" fillcolor="#a0a0a0" stroked="f"/>
         </w:pict>
       </w:r>
     </w:p>
@@ -7472,6 +7472,22 @@
         <w:rPr>
           <w:color w:val="000000"/>
         </w:rPr>
+        <w:t>(there is a detailed explanation of the 3 types of Merges that GitHub provides in a separate topic further down the file)</w:t>
+      </w:r>
+    </w:p>
+    <w:p>
+      <w:pPr>
+        <w:pStyle w:val="Normlnweb"/>
+        <w:spacing w:before="0" w:beforeAutospacing="0" w:after="0" w:afterAutospacing="0"/>
+        <w:ind w:left="284"/>
+        <w:rPr>
+          <w:color w:val="000000"/>
+        </w:rPr>
+      </w:pPr>
+      <w:r>
+        <w:rPr>
+          <w:color w:val="000000"/>
+        </w:rPr>
         <w:t>Then</w:t>
       </w:r>
       <w:r>
@@ -8408,6 +8424,7 @@
     </w:p>
     <w:p>
       <w:r>
+        <w:lastRenderedPageBreak/>
         <w:t xml:space="preserve">You have just successfully finished developing </w:t>
       </w:r>
       <w:r>
@@ -8429,9 +8446,8 @@
           <w:noProof/>
           <w14:ligatures w14:val="standardContextual"/>
         </w:rPr>
-        <w:lastRenderedPageBreak/>
         <w:pict>
-          <v:rect id="_x0000_i1033" alt="" style="width:453.6pt;height:.05pt;mso-width-percent:0;mso-height-percent:0;mso-width-percent:0;mso-height-percent:0" o:hralign="center" o:hrstd="t" o:hr="t" fillcolor="#a0a0a0" stroked="f"/>
+          <v:rect id="_x0000_i1034" alt="" style="width:453.6pt;height:.05pt;mso-width-percent:0;mso-height-percent:0;mso-width-percent:0;mso-height-percent:0" o:hralign="center" o:hrstd="t" o:hr="t" fillcolor="#a0a0a0" stroked="f"/>
         </w:pict>
       </w:r>
     </w:p>
@@ -8893,7 +8909,6 @@
         <w:rPr>
           <w:color w:val="000000"/>
         </w:rPr>
-        <w:lastRenderedPageBreak/>
         <w:t>For a 42 School project</w:t>
       </w:r>
     </w:p>
@@ -9247,6 +9262,104 @@
       </w:r>
     </w:p>
     <w:p>
+      <w:r>
+        <w:rPr>
+          <w:color w:val="000000"/>
+        </w:rPr>
+        <w:t>That</w:t>
+      </w:r>
+      <w:r>
+        <w:rPr>
+          <w:color w:val="000000"/>
+        </w:rPr>
+        <w:t xml:space="preserve"> i</w:t>
+      </w:r>
+      <w:r>
+        <w:rPr>
+          <w:color w:val="000000"/>
+        </w:rPr>
+        <w:t xml:space="preserve">s much closer to how </w:t>
+      </w:r>
+      <w:r>
+        <w:rPr>
+          <w:color w:val="000000"/>
+        </w:rPr>
+        <w:t>Pull Request</w:t>
+      </w:r>
+      <w:r>
+        <w:rPr>
+          <w:color w:val="000000"/>
+        </w:rPr>
+        <w:t xml:space="preserve"> reviews are typically done in professional software teams than relying only on the "Files changed" tab.</w:t>
+      </w:r>
+    </w:p>
+    <w:p>
+      <w:r>
+        <w:rPr>
+          <w:noProof/>
+          <w14:ligatures w14:val="standardContextual"/>
+        </w:rPr>
+        <w:pict>
+          <v:rect id="_x0000_i1033" alt="" style="width:453.6pt;height:.05pt;mso-width-percent:0;mso-height-percent:0;mso-width-percent:0;mso-height-percent:0" o:hralign="center" o:hrstd="t" o:hr="t" fillcolor="#a0a0a0" stroked="f"/>
+        </w:pict>
+      </w:r>
+    </w:p>
+    <w:p>
+      <w:pPr>
+        <w:outlineLvl w:val="0"/>
+        <w:rPr>
+          <w:b/>
+          <w:bCs/>
+          <w:color w:val="000000"/>
+          <w:kern w:val="36"/>
+          <w:sz w:val="48"/>
+          <w:szCs w:val="48"/>
+        </w:rPr>
+      </w:pPr>
+    </w:p>
+    <w:p>
+      <w:pPr>
+        <w:outlineLvl w:val="0"/>
+        <w:rPr>
+          <w:b/>
+          <w:bCs/>
+          <w:color w:val="000000"/>
+          <w:kern w:val="36"/>
+          <w:sz w:val="48"/>
+          <w:szCs w:val="48"/>
+        </w:rPr>
+      </w:pPr>
+    </w:p>
+    <w:p>
+      <w:pPr>
+        <w:outlineLvl w:val="0"/>
+        <w:rPr>
+          <w:b/>
+          <w:bCs/>
+          <w:color w:val="000000"/>
+          <w:kern w:val="36"/>
+          <w:sz w:val="48"/>
+          <w:szCs w:val="48"/>
+        </w:rPr>
+      </w:pPr>
+      <w:r>
+        <w:rPr>
+          <w:b/>
+          <w:bCs/>
+          <w:color w:val="000000"/>
+          <w:kern w:val="36"/>
+          <w:sz w:val="48"/>
+          <w:szCs w:val="48"/>
+        </w:rPr>
+        <w:t>Merge pull request Options</w:t>
+      </w:r>
+    </w:p>
+    <w:p>
+      <w:pPr>
+        <w:outlineLvl w:val="0"/>
+      </w:pPr>
+    </w:p>
+    <w:p>
       <w:pPr>
         <w:pStyle w:val="Normlnweb"/>
         <w:rPr>
@@ -9254,34 +9367,2353 @@
         </w:rPr>
       </w:pPr>
       <w:r>
-        <w:rPr>
-          <w:color w:val="000000"/>
-        </w:rPr>
-        <w:t>That</w:t>
-      </w:r>
-      <w:r>
-        <w:rPr>
-          <w:color w:val="000000"/>
-        </w:rPr>
-        <w:t xml:space="preserve"> i</w:t>
-      </w:r>
-      <w:r>
-        <w:rPr>
-          <w:color w:val="000000"/>
-        </w:rPr>
-        <w:t xml:space="preserve">s much closer to how </w:t>
-      </w:r>
-      <w:r>
-        <w:rPr>
-          <w:color w:val="000000"/>
-        </w:rPr>
-        <w:t>Pull Request</w:t>
-      </w:r>
-      <w:r>
-        <w:rPr>
-          <w:color w:val="000000"/>
-        </w:rPr>
-        <w:t xml:space="preserve"> reviews are typically done in professional software teams than relying only on the "Files changed" tab.</w:t>
+        <w:t xml:space="preserve">The </w:t>
+      </w:r>
+      <w:r>
+        <w:t>green "Merge pull request" button</w:t>
+      </w:r>
+      <w:r>
+        <w:t xml:space="preserve"> on the Pull Request page on GitHub </w:t>
+      </w:r>
+      <w:r>
+        <w:t>has a little arrow on it</w:t>
+      </w:r>
+      <w:r>
+        <w:t xml:space="preserve">. If you click on that little arrow, you will see 3 Merge options: </w:t>
+      </w:r>
+      <w:r>
+        <w:t>Merge Pull Request</w:t>
+      </w:r>
+      <w:r>
+        <w:t xml:space="preserve">, </w:t>
+      </w:r>
+      <w:r>
+        <w:t>Squash and Merge</w:t>
+      </w:r>
+      <w:r>
+        <w:t xml:space="preserve">, </w:t>
+      </w:r>
+      <w:r>
+        <w:t>Rebase and Merge</w:t>
+      </w:r>
+      <w:r>
+        <w:t>. Here’s what they are all about.</w:t>
+      </w:r>
+      <w:r>
+        <w:br/>
+      </w:r>
+      <w:r>
+        <w:br/>
+      </w:r>
+      <w:r>
+        <w:rPr>
+          <w:color w:val="000000"/>
+        </w:rPr>
+        <w:t>Those three options determine</w:t>
+      </w:r>
+      <w:r>
+        <w:rPr>
+          <w:rStyle w:val="apple-converted-space"/>
+          <w:color w:val="000000"/>
+        </w:rPr>
+        <w:t> </w:t>
+      </w:r>
+      <w:r>
+        <w:rPr>
+          <w:rStyle w:val="Siln"/>
+          <w:color w:val="000000"/>
+        </w:rPr>
+        <w:t>how the commit history will look after the P</w:t>
+      </w:r>
+      <w:r>
+        <w:rPr>
+          <w:rStyle w:val="Siln"/>
+          <w:color w:val="000000"/>
+        </w:rPr>
+        <w:t xml:space="preserve">ull </w:t>
+      </w:r>
+      <w:r>
+        <w:rPr>
+          <w:rStyle w:val="Siln"/>
+          <w:color w:val="000000"/>
+        </w:rPr>
+        <w:t>R</w:t>
+      </w:r>
+      <w:r>
+        <w:rPr>
+          <w:rStyle w:val="Siln"/>
+          <w:color w:val="000000"/>
+        </w:rPr>
+        <w:t>equest</w:t>
+      </w:r>
+      <w:r>
+        <w:rPr>
+          <w:rStyle w:val="Siln"/>
+          <w:color w:val="000000"/>
+        </w:rPr>
+        <w:t xml:space="preserve"> is integrated</w:t>
+      </w:r>
+      <w:r>
+        <w:rPr>
+          <w:color w:val="000000"/>
+        </w:rPr>
+        <w:t>. The code ends up in the target branch either way, but the Git history can be very different.</w:t>
+      </w:r>
+    </w:p>
+    <w:p>
+      <w:pPr>
+        <w:pStyle w:val="Normlnweb"/>
+        <w:rPr>
+          <w:color w:val="000000"/>
+        </w:rPr>
+      </w:pPr>
+      <w:r>
+        <w:rPr>
+          <w:color w:val="000000"/>
+        </w:rPr>
+        <w:t>Let's imagine this situation:</w:t>
+      </w:r>
+    </w:p>
+    <w:p>
+      <w:pPr>
+        <w:pStyle w:val="FormtovanvHTML"/>
+        <w:rPr>
+          <w:rStyle w:val="KdHTML"/>
+          <w:color w:val="000000"/>
+        </w:rPr>
+      </w:pPr>
+      <w:r>
+        <w:rPr>
+          <w:rStyle w:val="KdHTML"/>
+          <w:color w:val="000000"/>
+        </w:rPr>
+        <w:lastRenderedPageBreak/>
+        <w:t xml:space="preserve">   </w:t>
+      </w:r>
+      <w:r>
+        <w:rPr>
+          <w:rStyle w:val="KdHTML"/>
+          <w:color w:val="000000"/>
+        </w:rPr>
+        <w:t>refactor branch</w:t>
+      </w:r>
+    </w:p>
+    <w:p>
+      <w:pPr>
+        <w:pStyle w:val="FormtovanvHTML"/>
+        <w:rPr>
+          <w:rStyle w:val="KdHTML"/>
+          <w:color w:val="000000"/>
+        </w:rPr>
+      </w:pPr>
+      <w:r>
+        <w:rPr>
+          <w:rStyle w:val="KdHTML"/>
+          <w:color w:val="000000"/>
+        </w:rPr>
+        <w:t xml:space="preserve">   </w:t>
+      </w:r>
+      <w:r>
+        <w:rPr>
+          <w:rStyle w:val="KdHTML"/>
+          <w:color w:val="000000"/>
+        </w:rPr>
+        <w:t xml:space="preserve">          </w:t>
+      </w:r>
+      <w:r>
+        <w:rPr>
+          <w:rStyle w:val="KdHTML"/>
+          <w:color w:val="000000"/>
+        </w:rPr>
+        <w:t>A --- B --- C</w:t>
+      </w:r>
+    </w:p>
+    <w:p>
+      <w:pPr>
+        <w:pStyle w:val="FormtovanvHTML"/>
+        <w:rPr>
+          <w:rStyle w:val="KdHTML"/>
+          <w:color w:val="000000"/>
+        </w:rPr>
+      </w:pPr>
+      <w:r>
+        <w:rPr>
+          <w:rStyle w:val="KdHTML"/>
+          <w:color w:val="000000"/>
+        </w:rPr>
+        <w:t xml:space="preserve">   </w:t>
+      </w:r>
+      <w:r>
+        <w:rPr>
+          <w:rStyle w:val="KdHTML"/>
+          <w:color w:val="000000"/>
+        </w:rPr>
+        <w:t xml:space="preserve">          </w:t>
+      </w:r>
+      <w:r>
+        <w:rPr>
+          <w:rStyle w:val="KdHTML"/>
+          <w:color w:val="000000"/>
+        </w:rPr>
+        <w:t xml:space="preserve">   </w:t>
+      </w:r>
+      <w:r>
+        <w:rPr>
+          <w:rStyle w:val="KdHTML"/>
+          <w:color w:val="000000"/>
+        </w:rPr>
+        <w:t xml:space="preserve"> </w:t>
+      </w:r>
+      <w:r>
+        <w:rPr>
+          <w:rStyle w:val="KdHTML"/>
+          <w:color w:val="000000"/>
+        </w:rPr>
+        <w:t xml:space="preserve">         </w:t>
+      </w:r>
+      <w:r>
+        <w:rPr>
+          <w:rStyle w:val="KdHTML"/>
+          <w:color w:val="000000"/>
+        </w:rPr>
+        <w:t>\</w:t>
+      </w:r>
+    </w:p>
+    <w:p>
+      <w:pPr>
+        <w:pStyle w:val="FormtovanvHTML"/>
+        <w:rPr>
+          <w:rStyle w:val="KdHTML"/>
+          <w:color w:val="000000"/>
+        </w:rPr>
+      </w:pPr>
+      <w:r>
+        <w:rPr>
+          <w:rStyle w:val="KdHTML"/>
+          <w:color w:val="000000"/>
+        </w:rPr>
+        <w:t xml:space="preserve">   </w:t>
+      </w:r>
+      <w:r>
+        <w:rPr>
+          <w:rStyle w:val="KdHTML"/>
+          <w:color w:val="000000"/>
+        </w:rPr>
+        <w:t>feature</w:t>
+      </w:r>
+      <w:r>
+        <w:rPr>
+          <w:rStyle w:val="KdHTML"/>
+          <w:color w:val="000000"/>
+        </w:rPr>
+        <w:t xml:space="preserve"> branch</w:t>
+      </w:r>
+      <w:r>
+        <w:rPr>
+          <w:rStyle w:val="KdHTML"/>
+          <w:color w:val="000000"/>
+        </w:rPr>
+        <w:t xml:space="preserve">       </w:t>
+      </w:r>
+      <w:r>
+        <w:rPr>
+          <w:rStyle w:val="KdHTML"/>
+          <w:color w:val="000000"/>
+        </w:rPr>
+        <w:t xml:space="preserve">   </w:t>
+      </w:r>
+      <w:r>
+        <w:rPr>
+          <w:rStyle w:val="KdHTML"/>
+          <w:color w:val="000000"/>
+        </w:rPr>
+        <w:t>D --- E --- F</w:t>
+      </w:r>
+    </w:p>
+    <w:p>
+      <w:pPr>
+        <w:pStyle w:val="Normlnweb"/>
+        <w:rPr>
+          <w:color w:val="000000"/>
+        </w:rPr>
+      </w:pPr>
+      <w:r>
+        <w:rPr>
+          <w:color w:val="000000"/>
+        </w:rPr>
+        <w:t>Your teammate made commits D, E, and F on their feature branch.</w:t>
+      </w:r>
+    </w:p>
+    <w:p/>
+    <w:p>
+      <w:pPr>
+        <w:pStyle w:val="Nadpis2"/>
+        <w:rPr>
+          <w:color w:val="000000"/>
+        </w:rPr>
+      </w:pPr>
+      <w:r>
+        <w:rPr>
+          <w:color w:val="000000"/>
+        </w:rPr>
+        <w:t>1. Merge Pull Request (Merge Commit)</w:t>
+      </w:r>
+    </w:p>
+    <w:p>
+      <w:pPr>
+        <w:pStyle w:val="Normlnweb"/>
+        <w:rPr>
+          <w:color w:val="000000"/>
+        </w:rPr>
+      </w:pPr>
+      <w:r>
+        <w:rPr>
+          <w:color w:val="000000"/>
+        </w:rPr>
+        <w:t>This is the classic Git merge.</w:t>
+      </w:r>
+      <w:r>
+        <w:rPr>
+          <w:color w:val="000000"/>
+        </w:rPr>
+        <w:t xml:space="preserve"> It is the default one if you simply click the „Merge pull request“ button.</w:t>
+      </w:r>
+    </w:p>
+    <w:p>
+      <w:pPr>
+        <w:pStyle w:val="Normlnweb"/>
+        <w:rPr>
+          <w:color w:val="000000"/>
+        </w:rPr>
+      </w:pPr>
+      <w:r>
+        <w:rPr>
+          <w:color w:val="000000"/>
+        </w:rPr>
+        <w:t>Before:</w:t>
+      </w:r>
+    </w:p>
+    <w:p>
+      <w:pPr>
+        <w:pStyle w:val="FormtovanvHTML"/>
+        <w:rPr>
+          <w:rStyle w:val="KdHTML"/>
+          <w:color w:val="000000"/>
+        </w:rPr>
+      </w:pPr>
+      <w:r>
+        <w:rPr>
+          <w:rStyle w:val="KdHTML"/>
+          <w:color w:val="000000"/>
+        </w:rPr>
+        <w:t xml:space="preserve">   refactor branch</w:t>
+      </w:r>
+    </w:p>
+    <w:p>
+      <w:pPr>
+        <w:pStyle w:val="FormtovanvHTML"/>
+        <w:rPr>
+          <w:rStyle w:val="KdHTML"/>
+          <w:color w:val="000000"/>
+        </w:rPr>
+      </w:pPr>
+      <w:r>
+        <w:rPr>
+          <w:rStyle w:val="KdHTML"/>
+          <w:color w:val="000000"/>
+        </w:rPr>
+        <w:t xml:space="preserve">             A --- B --- C</w:t>
+      </w:r>
+    </w:p>
+    <w:p>
+      <w:pPr>
+        <w:pStyle w:val="FormtovanvHTML"/>
+        <w:rPr>
+          <w:rStyle w:val="KdHTML"/>
+          <w:color w:val="000000"/>
+        </w:rPr>
+      </w:pPr>
+      <w:r>
+        <w:rPr>
+          <w:rStyle w:val="KdHTML"/>
+          <w:color w:val="000000"/>
+        </w:rPr>
+        <w:t xml:space="preserve">                          \</w:t>
+      </w:r>
+    </w:p>
+    <w:p>
+      <w:pPr>
+        <w:pStyle w:val="FormtovanvHTML"/>
+        <w:rPr>
+          <w:rStyle w:val="KdHTML"/>
+          <w:color w:val="000000"/>
+        </w:rPr>
+      </w:pPr>
+      <w:r>
+        <w:rPr>
+          <w:rStyle w:val="KdHTML"/>
+          <w:color w:val="000000"/>
+        </w:rPr>
+        <w:t xml:space="preserve">   feature branch          D --- E --- F</w:t>
+      </w:r>
+    </w:p>
+    <w:p>
+      <w:pPr>
+        <w:pStyle w:val="Normlnweb"/>
+        <w:spacing w:after="240" w:afterAutospacing="0"/>
+        <w:rPr>
+          <w:color w:val="000000"/>
+        </w:rPr>
+      </w:pPr>
+      <w:r>
+        <w:rPr>
+          <w:color w:val="000000"/>
+        </w:rPr>
+        <w:t>After:</w:t>
+      </w:r>
+    </w:p>
+    <w:p>
+      <w:pPr>
+        <w:pStyle w:val="FormtovanvHTML"/>
+        <w:rPr>
+          <w:color w:val="000000"/>
+        </w:rPr>
+      </w:pPr>
+      <w:r>
+        <w:rPr>
+          <w:rStyle w:val="KdHTML"/>
+          <w:color w:val="000000"/>
+        </w:rPr>
+        <w:t xml:space="preserve">   refactor branch</w:t>
+      </w:r>
+    </w:p>
+    <w:p>
+      <w:pPr>
+        <w:pStyle w:val="FormtovanvHTML"/>
+        <w:rPr>
+          <w:rStyle w:val="KdHTML"/>
+          <w:color w:val="000000"/>
+        </w:rPr>
+      </w:pPr>
+      <w:r>
+        <w:rPr>
+          <w:rStyle w:val="KdHTML"/>
+          <w:color w:val="000000"/>
+        </w:rPr>
+        <w:t xml:space="preserve">             </w:t>
+      </w:r>
+      <w:r>
+        <w:rPr>
+          <w:rStyle w:val="KdHTML"/>
+          <w:color w:val="000000"/>
+        </w:rPr>
+        <w:t>A --- B --- C -----</w:t>
+      </w:r>
+      <w:r>
+        <w:rPr>
+          <w:rStyle w:val="KdHTML"/>
+          <w:color w:val="000000"/>
+        </w:rPr>
+        <w:t>----</w:t>
+      </w:r>
+      <w:r>
+        <w:rPr>
+          <w:rStyle w:val="KdHTML"/>
+          <w:color w:val="000000"/>
+        </w:rPr>
+        <w:t>-</w:t>
+      </w:r>
+      <w:r>
+        <w:rPr>
+          <w:rStyle w:val="KdHTML"/>
+          <w:color w:val="000000"/>
+        </w:rPr>
+        <w:t>-</w:t>
+      </w:r>
+      <w:r>
+        <w:rPr>
+          <w:rStyle w:val="KdHTML"/>
+          <w:color w:val="000000"/>
+        </w:rPr>
+        <w:t>-- M</w:t>
+      </w:r>
+    </w:p>
+    <w:p>
+      <w:pPr>
+        <w:pStyle w:val="FormtovanvHTML"/>
+        <w:rPr>
+          <w:rStyle w:val="KdHTML"/>
+          <w:color w:val="000000"/>
+        </w:rPr>
+      </w:pPr>
+      <w:r>
+        <w:rPr>
+          <w:rStyle w:val="KdHTML"/>
+          <w:color w:val="000000"/>
+        </w:rPr>
+        <w:t xml:space="preserve">   </w:t>
+      </w:r>
+      <w:r>
+        <w:rPr>
+          <w:rStyle w:val="KdHTML"/>
+          <w:color w:val="000000"/>
+        </w:rPr>
+        <w:t xml:space="preserve"> </w:t>
+      </w:r>
+      <w:r>
+        <w:rPr>
+          <w:rStyle w:val="KdHTML"/>
+          <w:color w:val="000000"/>
+        </w:rPr>
+        <w:t xml:space="preserve">          </w:t>
+      </w:r>
+      <w:r>
+        <w:rPr>
+          <w:rStyle w:val="KdHTML"/>
+          <w:color w:val="000000"/>
+        </w:rPr>
+        <w:t xml:space="preserve">            \      </w:t>
+      </w:r>
+      <w:r>
+        <w:rPr>
+          <w:rStyle w:val="KdHTML"/>
+          <w:color w:val="000000"/>
+        </w:rPr>
+        <w:t xml:space="preserve">     </w:t>
+      </w:r>
+      <w:r>
+        <w:rPr>
+          <w:rStyle w:val="KdHTML"/>
+          <w:color w:val="000000"/>
+        </w:rPr>
+        <w:t xml:space="preserve">  /</w:t>
+      </w:r>
+    </w:p>
+    <w:p>
+      <w:pPr>
+        <w:pStyle w:val="FormtovanvHTML"/>
+        <w:rPr>
+          <w:rStyle w:val="KdHTML"/>
+          <w:color w:val="000000"/>
+        </w:rPr>
+      </w:pPr>
+      <w:r>
+        <w:rPr>
+          <w:rStyle w:val="KdHTML"/>
+          <w:color w:val="000000"/>
+        </w:rPr>
+        <w:t xml:space="preserve">   feature branch</w:t>
+      </w:r>
+      <w:r>
+        <w:rPr>
+          <w:rStyle w:val="KdHTML"/>
+          <w:color w:val="000000"/>
+        </w:rPr>
+        <w:t xml:space="preserve"> </w:t>
+      </w:r>
+      <w:r>
+        <w:rPr>
+          <w:rStyle w:val="KdHTML"/>
+          <w:color w:val="000000"/>
+        </w:rPr>
+        <w:t xml:space="preserve">         D --- E --- F</w:t>
+      </w:r>
+    </w:p>
+    <w:p>
+      <w:pPr>
+        <w:pStyle w:val="Normlnweb"/>
+        <w:rPr>
+          <w:color w:val="000000"/>
+        </w:rPr>
+      </w:pPr>
+      <w:r>
+        <w:rPr>
+          <w:color w:val="000000"/>
+        </w:rPr>
+        <w:t>Git creates a new merge commit</w:t>
+      </w:r>
+      <w:r>
+        <w:rPr>
+          <w:rStyle w:val="apple-converted-space"/>
+          <w:color w:val="000000"/>
+        </w:rPr>
+        <w:t xml:space="preserve"> M</w:t>
+      </w:r>
+      <w:r>
+        <w:rPr>
+          <w:rStyle w:val="apple-converted-space"/>
+          <w:color w:val="000000"/>
+        </w:rPr>
+        <w:t xml:space="preserve"> on the refactor branch, but keeps visible, that D, E, F were made on a separate feature branch</w:t>
+      </w:r>
+      <w:r>
+        <w:rPr>
+          <w:color w:val="000000"/>
+        </w:rPr>
+        <w:t>.</w:t>
+      </w:r>
+    </w:p>
+    <w:p>
+      <w:pPr>
+        <w:pStyle w:val="Nadpis3"/>
+        <w:rPr>
+          <w:color w:val="000000"/>
+        </w:rPr>
+      </w:pPr>
+      <w:r>
+        <w:rPr>
+          <w:color w:val="000000"/>
+        </w:rPr>
+        <w:t>Advantages</w:t>
+      </w:r>
+    </w:p>
+    <w:p>
+      <w:pPr>
+        <w:pStyle w:val="Normlnweb"/>
+        <w:numPr>
+          <w:ilvl w:val="0"/>
+          <w:numId w:val="17"/>
+        </w:numPr>
+        <w:rPr>
+          <w:color w:val="000000"/>
+        </w:rPr>
+      </w:pPr>
+      <w:r>
+        <w:rPr>
+          <w:color w:val="000000"/>
+        </w:rPr>
+        <w:t>Preserves the true history.</w:t>
+      </w:r>
+    </w:p>
+    <w:p>
+      <w:pPr>
+        <w:pStyle w:val="Normlnweb"/>
+        <w:numPr>
+          <w:ilvl w:val="0"/>
+          <w:numId w:val="17"/>
+        </w:numPr>
+        <w:rPr>
+          <w:color w:val="000000"/>
+        </w:rPr>
+      </w:pPr>
+      <w:r>
+        <w:rPr>
+          <w:color w:val="000000"/>
+        </w:rPr>
+        <w:t>You can clearly see that a feature branch existed.</w:t>
+      </w:r>
+    </w:p>
+    <w:p>
+      <w:pPr>
+        <w:pStyle w:val="Normlnweb"/>
+        <w:numPr>
+          <w:ilvl w:val="0"/>
+          <w:numId w:val="17"/>
+        </w:numPr>
+        <w:rPr>
+          <w:color w:val="000000"/>
+        </w:rPr>
+      </w:pPr>
+      <w:r>
+        <w:rPr>
+          <w:color w:val="000000"/>
+        </w:rPr>
+        <w:t>Good for large projects where branches may live for weeks.</w:t>
+      </w:r>
+    </w:p>
+    <w:p>
+      <w:pPr>
+        <w:pStyle w:val="Nadpis3"/>
+        <w:rPr>
+          <w:color w:val="000000"/>
+        </w:rPr>
+      </w:pPr>
+      <w:r>
+        <w:rPr>
+          <w:color w:val="000000"/>
+        </w:rPr>
+        <w:t>Disadvantages</w:t>
+      </w:r>
+    </w:p>
+    <w:p>
+      <w:pPr>
+        <w:pStyle w:val="Normlnweb"/>
+        <w:numPr>
+          <w:ilvl w:val="0"/>
+          <w:numId w:val="18"/>
+        </w:numPr>
+        <w:rPr>
+          <w:color w:val="000000"/>
+        </w:rPr>
+      </w:pPr>
+      <w:r>
+        <w:rPr>
+          <w:color w:val="000000"/>
+        </w:rPr>
+        <w:t>History</w:t>
+      </w:r>
+      <w:r>
+        <w:rPr>
+          <w:color w:val="000000"/>
+        </w:rPr>
+        <w:t xml:space="preserve"> of the refactor</w:t>
+      </w:r>
+      <w:r>
+        <w:rPr>
+          <w:color w:val="000000"/>
+        </w:rPr>
+        <w:t xml:space="preserve"> becomes cluttered with</w:t>
+      </w:r>
+      <w:r>
+        <w:rPr>
+          <w:color w:val="000000"/>
+        </w:rPr>
+        <w:t xml:space="preserve"> </w:t>
+      </w:r>
+      <w:r>
+        <w:rPr>
+          <w:color w:val="000000"/>
+        </w:rPr>
+        <w:t>merge commits</w:t>
+      </w:r>
+      <w:r>
+        <w:rPr>
+          <w:color w:val="000000"/>
+        </w:rPr>
+        <w:t xml:space="preserve"> and all the commits from the merged feature branches</w:t>
+      </w:r>
+      <w:r>
+        <w:rPr>
+          <w:color w:val="000000"/>
+        </w:rPr>
+        <w:t>.</w:t>
+      </w:r>
+    </w:p>
+    <w:p>
+      <w:pPr>
+        <w:pStyle w:val="Normlnweb"/>
+        <w:spacing w:after="0" w:afterAutospacing="0"/>
+        <w:rPr>
+          <w:color w:val="000000"/>
+        </w:rPr>
+      </w:pPr>
+      <w:r>
+        <w:rPr>
+          <w:color w:val="000000"/>
+        </w:rPr>
+        <w:t>You often see</w:t>
+      </w:r>
+      <w:r>
+        <w:rPr>
+          <w:color w:val="000000"/>
+        </w:rPr>
+        <w:t xml:space="preserve"> </w:t>
+      </w:r>
+      <w:r>
+        <w:rPr>
+          <w:color w:val="000000"/>
+        </w:rPr>
+        <w:t>merge commits</w:t>
+      </w:r>
+      <w:r>
+        <w:rPr>
+          <w:color w:val="000000"/>
+        </w:rPr>
+        <w:t xml:space="preserve"> like this</w:t>
+      </w:r>
+      <w:r>
+        <w:rPr>
+          <w:color w:val="000000"/>
+        </w:rPr>
+        <w:t>:</w:t>
+      </w:r>
+    </w:p>
+    <w:p>
+      <w:pPr>
+        <w:pStyle w:val="FormtovanvHTML"/>
+        <w:ind w:left="284"/>
+        <w:rPr>
+          <w:rStyle w:val="KdHTML"/>
+          <w:color w:val="000000"/>
+        </w:rPr>
+      </w:pPr>
+      <w:r>
+        <w:rPr>
+          <w:rStyle w:val="KdHTML"/>
+          <w:color w:val="000000"/>
+        </w:rPr>
+        <w:t>Merge pull request #42 from roman/fix-parser</w:t>
+      </w:r>
+    </w:p>
+    <w:p>
+      <w:pPr>
+        <w:pStyle w:val="Normlnweb"/>
+        <w:spacing w:before="0" w:beforeAutospacing="0"/>
+        <w:rPr>
+          <w:color w:val="000000"/>
+        </w:rPr>
+      </w:pPr>
+      <w:r>
+        <w:rPr>
+          <w:color w:val="000000"/>
+        </w:rPr>
+        <w:t>all over the history</w:t>
+      </w:r>
+      <w:r>
+        <w:rPr>
+          <w:color w:val="000000"/>
+        </w:rPr>
+        <w:t xml:space="preserve"> of the refactor</w:t>
+      </w:r>
+      <w:r>
+        <w:rPr>
+          <w:color w:val="000000"/>
+        </w:rPr>
+        <w:t>.</w:t>
+      </w:r>
+    </w:p>
+    <w:p/>
+    <w:p>
+      <w:pPr>
+        <w:pStyle w:val="Nadpis2"/>
+        <w:rPr>
+          <w:color w:val="000000"/>
+        </w:rPr>
+      </w:pPr>
+      <w:r>
+        <w:rPr>
+          <w:color w:val="000000"/>
+        </w:rPr>
+        <w:t>2. Squash and Merge</w:t>
+      </w:r>
+    </w:p>
+    <w:p>
+      <w:pPr>
+        <w:pStyle w:val="Normlnweb"/>
+        <w:rPr>
+          <w:color w:val="000000"/>
+        </w:rPr>
+      </w:pPr>
+      <w:r>
+        <w:rPr>
+          <w:color w:val="000000"/>
+        </w:rPr>
+        <w:t>Git takes all commits from the PR and combines them into</w:t>
+      </w:r>
+      <w:r>
+        <w:rPr>
+          <w:rStyle w:val="apple-converted-space"/>
+          <w:color w:val="000000"/>
+        </w:rPr>
+        <w:t> </w:t>
+      </w:r>
+      <w:r>
+        <w:rPr>
+          <w:rStyle w:val="Siln"/>
+          <w:color w:val="000000"/>
+        </w:rPr>
+        <w:t>one single commit</w:t>
+      </w:r>
+      <w:r>
+        <w:rPr>
+          <w:color w:val="000000"/>
+        </w:rPr>
+        <w:t>.</w:t>
+      </w:r>
+    </w:p>
+    <w:p>
+      <w:pPr>
+        <w:pStyle w:val="Normlnweb"/>
+        <w:rPr>
+          <w:color w:val="000000"/>
+        </w:rPr>
+      </w:pPr>
+      <w:r>
+        <w:rPr>
+          <w:color w:val="000000"/>
+        </w:rPr>
+        <w:lastRenderedPageBreak/>
+        <w:t>Before</w:t>
+      </w:r>
+      <w:r>
+        <w:rPr>
+          <w:color w:val="000000"/>
+        </w:rPr>
+        <w:t xml:space="preserve"> the merge</w:t>
+      </w:r>
+      <w:r>
+        <w:rPr>
+          <w:color w:val="000000"/>
+        </w:rPr>
+        <w:t>:</w:t>
+      </w:r>
+    </w:p>
+    <w:p>
+      <w:pPr>
+        <w:pStyle w:val="FormtovanvHTML"/>
+        <w:rPr>
+          <w:rStyle w:val="KdHTML"/>
+          <w:color w:val="000000"/>
+        </w:rPr>
+      </w:pPr>
+      <w:r>
+        <w:rPr>
+          <w:rStyle w:val="KdHTML"/>
+          <w:color w:val="000000"/>
+        </w:rPr>
+        <w:t xml:space="preserve">   </w:t>
+      </w:r>
+      <w:r>
+        <w:rPr>
+          <w:rStyle w:val="KdHTML"/>
+          <w:color w:val="000000"/>
+        </w:rPr>
+        <w:t>refactor branch</w:t>
+      </w:r>
+    </w:p>
+    <w:p>
+      <w:pPr>
+        <w:pStyle w:val="FormtovanvHTML"/>
+        <w:rPr>
+          <w:rStyle w:val="KdHTML"/>
+          <w:color w:val="000000"/>
+        </w:rPr>
+      </w:pPr>
+      <w:r>
+        <w:rPr>
+          <w:rStyle w:val="KdHTML"/>
+          <w:color w:val="000000"/>
+        </w:rPr>
+        <w:t xml:space="preserve">             A --- B --- C</w:t>
+      </w:r>
+    </w:p>
+    <w:p>
+      <w:pPr>
+        <w:pStyle w:val="FormtovanvHTML"/>
+        <w:rPr>
+          <w:rStyle w:val="KdHTML"/>
+          <w:color w:val="000000"/>
+        </w:rPr>
+      </w:pPr>
+      <w:r>
+        <w:rPr>
+          <w:rStyle w:val="KdHTML"/>
+          <w:color w:val="000000"/>
+        </w:rPr>
+        <w:t xml:space="preserve">                          \</w:t>
+      </w:r>
+    </w:p>
+    <w:p>
+      <w:pPr>
+        <w:pStyle w:val="FormtovanvHTML"/>
+        <w:rPr>
+          <w:rStyle w:val="KdHTML"/>
+          <w:color w:val="000000"/>
+        </w:rPr>
+      </w:pPr>
+      <w:r>
+        <w:rPr>
+          <w:rStyle w:val="KdHTML"/>
+          <w:color w:val="000000"/>
+        </w:rPr>
+        <w:t xml:space="preserve">   feature branch          D --- E --- F</w:t>
+      </w:r>
+    </w:p>
+    <w:p>
+      <w:pPr>
+        <w:pStyle w:val="Normlnweb"/>
+        <w:rPr>
+          <w:color w:val="000000"/>
+        </w:rPr>
+      </w:pPr>
+      <w:r>
+        <w:rPr>
+          <w:color w:val="000000"/>
+        </w:rPr>
+        <w:t>After</w:t>
+      </w:r>
+      <w:r>
+        <w:rPr>
+          <w:color w:val="000000"/>
+        </w:rPr>
+        <w:t xml:space="preserve"> the merge</w:t>
+      </w:r>
+      <w:r>
+        <w:rPr>
+          <w:color w:val="000000"/>
+        </w:rPr>
+        <w:t>:</w:t>
+      </w:r>
+    </w:p>
+    <w:p>
+      <w:pPr>
+        <w:pStyle w:val="FormtovanvHTML"/>
+        <w:rPr>
+          <w:rStyle w:val="KdHTML"/>
+          <w:color w:val="000000"/>
+        </w:rPr>
+      </w:pPr>
+      <w:r>
+        <w:rPr>
+          <w:rStyle w:val="KdHTML"/>
+          <w:color w:val="000000"/>
+        </w:rPr>
+        <w:t xml:space="preserve">   </w:t>
+      </w:r>
+      <w:r>
+        <w:rPr>
+          <w:rStyle w:val="KdHTML"/>
+          <w:color w:val="000000"/>
+        </w:rPr>
+        <w:t>refactor</w:t>
+      </w:r>
+      <w:r>
+        <w:rPr>
+          <w:rStyle w:val="KdHTML"/>
+          <w:color w:val="000000"/>
+        </w:rPr>
+        <w:t xml:space="preserve"> branch:</w:t>
+      </w:r>
+    </w:p>
+    <w:p>
+      <w:pPr>
+        <w:pStyle w:val="FormtovanvHTML"/>
+        <w:rPr>
+          <w:rStyle w:val="KdHTML"/>
+          <w:color w:val="000000"/>
+        </w:rPr>
+      </w:pPr>
+      <w:r>
+        <w:rPr>
+          <w:rStyle w:val="KdHTML"/>
+          <w:color w:val="000000"/>
+        </w:rPr>
+        <w:t xml:space="preserve">             </w:t>
+      </w:r>
+      <w:r>
+        <w:rPr>
+          <w:rStyle w:val="KdHTML"/>
+          <w:color w:val="000000"/>
+        </w:rPr>
+        <w:t>A --- B --- C --- S</w:t>
+      </w:r>
+    </w:p>
+    <w:p>
+      <w:pPr>
+        <w:pStyle w:val="Normlnweb"/>
+        <w:rPr>
+          <w:color w:val="000000"/>
+        </w:rPr>
+      </w:pPr>
+      <w:r>
+        <w:rPr>
+          <w:color w:val="000000"/>
+        </w:rPr>
+        <w:t>where</w:t>
+      </w:r>
+      <w:r>
+        <w:rPr>
+          <w:rStyle w:val="apple-converted-space"/>
+          <w:color w:val="000000"/>
+        </w:rPr>
+        <w:t xml:space="preserve"> S </w:t>
+      </w:r>
+      <w:r>
+        <w:rPr>
+          <w:color w:val="000000"/>
+        </w:rPr>
+        <w:t>contains all changes from D+E+F</w:t>
+      </w:r>
+      <w:r>
+        <w:rPr>
+          <w:color w:val="000000"/>
+        </w:rPr>
+        <w:t xml:space="preserve"> and the history looks like the feature branch has never existed</w:t>
+      </w:r>
+      <w:r>
+        <w:rPr>
+          <w:color w:val="000000"/>
+        </w:rPr>
+        <w:t>.</w:t>
+      </w:r>
+    </w:p>
+    <w:p>
+      <w:pPr>
+        <w:pStyle w:val="Nadpis3"/>
+        <w:rPr>
+          <w:color w:val="000000"/>
+        </w:rPr>
+      </w:pPr>
+      <w:r>
+        <w:rPr>
+          <w:color w:val="000000"/>
+        </w:rPr>
+        <w:t>Advantages</w:t>
+      </w:r>
+    </w:p>
+    <w:p>
+      <w:pPr>
+        <w:pStyle w:val="Normlnweb"/>
+        <w:numPr>
+          <w:ilvl w:val="0"/>
+          <w:numId w:val="19"/>
+        </w:numPr>
+        <w:rPr>
+          <w:color w:val="000000"/>
+        </w:rPr>
+      </w:pPr>
+      <w:r>
+        <w:rPr>
+          <w:color w:val="000000"/>
+        </w:rPr>
+        <w:t>Clean history.</w:t>
+      </w:r>
+    </w:p>
+    <w:p>
+      <w:pPr>
+        <w:pStyle w:val="Normlnweb"/>
+        <w:numPr>
+          <w:ilvl w:val="0"/>
+          <w:numId w:val="19"/>
+        </w:numPr>
+        <w:rPr>
+          <w:color w:val="000000"/>
+        </w:rPr>
+      </w:pPr>
+      <w:r>
+        <w:rPr>
+          <w:color w:val="000000"/>
+        </w:rPr>
+        <w:t>One PR = one commit.</w:t>
+      </w:r>
+    </w:p>
+    <w:p>
+      <w:pPr>
+        <w:pStyle w:val="Normlnweb"/>
+        <w:numPr>
+          <w:ilvl w:val="0"/>
+          <w:numId w:val="19"/>
+        </w:numPr>
+        <w:rPr>
+          <w:color w:val="000000"/>
+        </w:rPr>
+      </w:pPr>
+      <w:r>
+        <w:rPr>
+          <w:color w:val="000000"/>
+        </w:rPr>
+        <w:t>No "Fix typo", "Oops", "Forgot file", "Really fixed it this time" commits.</w:t>
+      </w:r>
+    </w:p>
+    <w:p>
+      <w:pPr>
+        <w:pStyle w:val="Nadpis3"/>
+        <w:rPr>
+          <w:color w:val="000000"/>
+        </w:rPr>
+      </w:pPr>
+      <w:r>
+        <w:rPr>
+          <w:color w:val="000000"/>
+        </w:rPr>
+        <w:t>Disadvantages</w:t>
+      </w:r>
+    </w:p>
+    <w:p>
+      <w:pPr>
+        <w:pStyle w:val="Normlnweb"/>
+        <w:numPr>
+          <w:ilvl w:val="0"/>
+          <w:numId w:val="20"/>
+        </w:numPr>
+        <w:rPr>
+          <w:color w:val="000000"/>
+        </w:rPr>
+      </w:pPr>
+      <w:r>
+        <w:rPr>
+          <w:color w:val="000000"/>
+        </w:rPr>
+        <w:t>Original commit structure is lost.</w:t>
+      </w:r>
+    </w:p>
+    <w:p>
+      <w:pPr>
+        <w:pStyle w:val="Normlnweb"/>
+        <w:numPr>
+          <w:ilvl w:val="0"/>
+          <w:numId w:val="20"/>
+        </w:numPr>
+        <w:rPr>
+          <w:color w:val="000000"/>
+        </w:rPr>
+      </w:pPr>
+      <w:r>
+        <w:rPr>
+          <w:color w:val="000000"/>
+        </w:rPr>
+        <w:t>Harder to see how the work evolved.</w:t>
+      </w:r>
+    </w:p>
+    <w:p>
+      <w:pPr>
+        <w:pStyle w:val="Normlnweb"/>
+        <w:rPr>
+          <w:color w:val="000000"/>
+        </w:rPr>
+      </w:pPr>
+      <w:r>
+        <w:rPr>
+          <w:color w:val="000000"/>
+        </w:rPr>
+        <w:t>This is extremely popular in professional teams.</w:t>
+      </w:r>
+    </w:p>
+    <w:p/>
+    <w:p>
+      <w:pPr>
+        <w:pStyle w:val="Nadpis2"/>
+        <w:rPr>
+          <w:color w:val="000000"/>
+        </w:rPr>
+      </w:pPr>
+      <w:r>
+        <w:rPr>
+          <w:color w:val="000000"/>
+        </w:rPr>
+        <w:t>3. Rebase and Merge</w:t>
+      </w:r>
+    </w:p>
+    <w:p>
+      <w:pPr>
+        <w:pStyle w:val="Normlnweb"/>
+        <w:rPr>
+          <w:color w:val="000000"/>
+        </w:rPr>
+      </w:pPr>
+      <w:r>
+        <w:rPr>
+          <w:color w:val="000000"/>
+        </w:rPr>
+        <w:t>Git takes commits D, E, and F and pretends they were created directly on top of the latest</w:t>
+      </w:r>
+      <w:r>
+        <w:rPr>
+          <w:rStyle w:val="apple-converted-space"/>
+          <w:color w:val="000000"/>
+        </w:rPr>
+        <w:t> </w:t>
+      </w:r>
+      <w:r>
+        <w:rPr>
+          <w:rStyle w:val="KdHTML"/>
+          <w:color w:val="000000"/>
+        </w:rPr>
+        <w:t xml:space="preserve">refactor </w:t>
+      </w:r>
+      <w:r>
+        <w:t>commit</w:t>
+      </w:r>
+      <w:r>
+        <w:rPr>
+          <w:color w:val="000000"/>
+        </w:rPr>
+        <w:t>.</w:t>
+      </w:r>
+    </w:p>
+    <w:p>
+      <w:pPr>
+        <w:pStyle w:val="Normlnweb"/>
+        <w:rPr>
+          <w:color w:val="000000"/>
+        </w:rPr>
+      </w:pPr>
+      <w:r>
+        <w:rPr>
+          <w:color w:val="000000"/>
+        </w:rPr>
+        <w:t>Before the merge:</w:t>
+      </w:r>
+    </w:p>
+    <w:p>
+      <w:pPr>
+        <w:pStyle w:val="FormtovanvHTML"/>
+        <w:rPr>
+          <w:rStyle w:val="KdHTML"/>
+          <w:color w:val="000000"/>
+        </w:rPr>
+      </w:pPr>
+      <w:r>
+        <w:rPr>
+          <w:rStyle w:val="KdHTML"/>
+          <w:color w:val="000000"/>
+        </w:rPr>
+        <w:t xml:space="preserve">   refactor branch</w:t>
+      </w:r>
+    </w:p>
+    <w:p>
+      <w:pPr>
+        <w:pStyle w:val="FormtovanvHTML"/>
+        <w:rPr>
+          <w:rStyle w:val="KdHTML"/>
+          <w:color w:val="000000"/>
+        </w:rPr>
+      </w:pPr>
+      <w:r>
+        <w:rPr>
+          <w:rStyle w:val="KdHTML"/>
+          <w:color w:val="000000"/>
+        </w:rPr>
+        <w:t xml:space="preserve">             A --- B --- C</w:t>
+      </w:r>
+    </w:p>
+    <w:p>
+      <w:pPr>
+        <w:pStyle w:val="FormtovanvHTML"/>
+        <w:rPr>
+          <w:rStyle w:val="KdHTML"/>
+          <w:color w:val="000000"/>
+        </w:rPr>
+      </w:pPr>
+      <w:r>
+        <w:rPr>
+          <w:rStyle w:val="KdHTML"/>
+          <w:color w:val="000000"/>
+        </w:rPr>
+        <w:t xml:space="preserve">                          \</w:t>
+      </w:r>
+    </w:p>
+    <w:p>
+      <w:pPr>
+        <w:pStyle w:val="FormtovanvHTML"/>
+        <w:rPr>
+          <w:rStyle w:val="KdHTML"/>
+          <w:color w:val="000000"/>
+        </w:rPr>
+      </w:pPr>
+      <w:r>
+        <w:rPr>
+          <w:rStyle w:val="KdHTML"/>
+          <w:color w:val="000000"/>
+        </w:rPr>
+        <w:t xml:space="preserve">   feature branch          D --- E --- F</w:t>
+      </w:r>
+    </w:p>
+    <w:p>
+      <w:pPr>
+        <w:pStyle w:val="FormtovanvHTML"/>
+        <w:rPr>
+          <w:color w:val="000000"/>
+        </w:rPr>
+      </w:pPr>
+    </w:p>
+    <w:p>
+      <w:pPr>
+        <w:pStyle w:val="FormtovanvHTML"/>
+        <w:rPr>
+          <w:rFonts w:ascii="Times New Roman" w:hAnsi="Times New Roman" w:cs="Times New Roman"/>
+          <w:color w:val="000000"/>
+          <w:sz w:val="24"/>
+          <w:szCs w:val="24"/>
+        </w:rPr>
+      </w:pPr>
+      <w:r>
+        <w:rPr>
+          <w:rFonts w:ascii="Times New Roman" w:hAnsi="Times New Roman" w:cs="Times New Roman"/>
+          <w:color w:val="000000"/>
+          <w:sz w:val="24"/>
+          <w:szCs w:val="24"/>
+        </w:rPr>
+        <w:t>After the merg</w:t>
+      </w:r>
+      <w:r>
+        <w:rPr>
+          <w:rFonts w:ascii="Times New Roman" w:hAnsi="Times New Roman" w:cs="Times New Roman"/>
+          <w:color w:val="000000"/>
+          <w:sz w:val="24"/>
+          <w:szCs w:val="24"/>
+        </w:rPr>
+        <w:t>e</w:t>
+      </w:r>
+      <w:r>
+        <w:rPr>
+          <w:rFonts w:ascii="Times New Roman" w:hAnsi="Times New Roman" w:cs="Times New Roman"/>
+          <w:color w:val="000000"/>
+          <w:sz w:val="24"/>
+          <w:szCs w:val="24"/>
+        </w:rPr>
+        <w:t>:</w:t>
+      </w:r>
+    </w:p>
+    <w:p>
+      <w:pPr>
+        <w:pStyle w:val="FormtovanvHTML"/>
+        <w:rPr>
+          <w:rFonts w:ascii="Times New Roman" w:hAnsi="Times New Roman" w:cs="Times New Roman"/>
+          <w:color w:val="000000"/>
+          <w:sz w:val="24"/>
+          <w:szCs w:val="24"/>
+        </w:rPr>
+      </w:pPr>
+    </w:p>
+    <w:p>
+      <w:pPr>
+        <w:pStyle w:val="FormtovanvHTML"/>
+        <w:rPr>
+          <w:color w:val="000000"/>
+        </w:rPr>
+      </w:pPr>
+      <w:r>
+        <w:rPr>
+          <w:rStyle w:val="KdHTML"/>
+          <w:color w:val="000000"/>
+        </w:rPr>
+        <w:t xml:space="preserve">   refactor branch</w:t>
+      </w:r>
+    </w:p>
+    <w:p>
+      <w:pPr>
+        <w:pStyle w:val="FormtovanvHTML"/>
+        <w:rPr>
+          <w:rStyle w:val="KdHTML"/>
+          <w:color w:val="000000"/>
+        </w:rPr>
+      </w:pPr>
+      <w:r>
+        <w:rPr>
+          <w:rStyle w:val="KdHTML"/>
+          <w:color w:val="000000"/>
+        </w:rPr>
+        <w:t xml:space="preserve">             </w:t>
+      </w:r>
+      <w:r>
+        <w:rPr>
+          <w:rStyle w:val="KdHTML"/>
+          <w:color w:val="000000"/>
+        </w:rPr>
+        <w:t>A --- B --- C --- D' --- E' --- F'</w:t>
+      </w:r>
+    </w:p>
+    <w:p>
+      <w:pPr>
+        <w:pStyle w:val="Normlnweb"/>
+        <w:rPr>
+          <w:color w:val="000000"/>
+        </w:rPr>
+      </w:pPr>
+      <w:r>
+        <w:rPr>
+          <w:color w:val="000000"/>
+        </w:rPr>
+        <w:t>Notice the apostrophes. These are technically new commits with new hashes.</w:t>
+      </w:r>
+    </w:p>
+    <w:p>
+      <w:pPr>
+        <w:pStyle w:val="Nadpis3"/>
+        <w:rPr>
+          <w:color w:val="000000"/>
+        </w:rPr>
+      </w:pPr>
+      <w:r>
+        <w:rPr>
+          <w:color w:val="000000"/>
+        </w:rPr>
+        <w:t>Advantages</w:t>
+      </w:r>
+    </w:p>
+    <w:p>
+      <w:pPr>
+        <w:pStyle w:val="Normlnweb"/>
+        <w:numPr>
+          <w:ilvl w:val="0"/>
+          <w:numId w:val="21"/>
+        </w:numPr>
+        <w:rPr>
+          <w:color w:val="000000"/>
+        </w:rPr>
+      </w:pPr>
+      <w:r>
+        <w:rPr>
+          <w:color w:val="000000"/>
+        </w:rPr>
+        <w:lastRenderedPageBreak/>
+        <w:t>Perfectly linear history.</w:t>
+      </w:r>
+    </w:p>
+    <w:p>
+      <w:pPr>
+        <w:pStyle w:val="Normlnweb"/>
+        <w:numPr>
+          <w:ilvl w:val="0"/>
+          <w:numId w:val="21"/>
+        </w:numPr>
+        <w:rPr>
+          <w:color w:val="000000"/>
+        </w:rPr>
+      </w:pPr>
+      <w:r>
+        <w:rPr>
+          <w:color w:val="000000"/>
+        </w:rPr>
+        <w:t>Keeps individual commits.</w:t>
+      </w:r>
+    </w:p>
+    <w:p>
+      <w:pPr>
+        <w:pStyle w:val="Normlnweb"/>
+        <w:numPr>
+          <w:ilvl w:val="0"/>
+          <w:numId w:val="21"/>
+        </w:numPr>
+        <w:rPr>
+          <w:color w:val="000000"/>
+        </w:rPr>
+      </w:pPr>
+      <w:r>
+        <w:rPr>
+          <w:color w:val="000000"/>
+        </w:rPr>
+        <w:t>No merge commits.</w:t>
+      </w:r>
+    </w:p>
+    <w:p>
+      <w:pPr>
+        <w:pStyle w:val="Nadpis3"/>
+        <w:rPr>
+          <w:color w:val="000000"/>
+        </w:rPr>
+      </w:pPr>
+      <w:r>
+        <w:rPr>
+          <w:color w:val="000000"/>
+        </w:rPr>
+        <w:t>Disadvantages</w:t>
+      </w:r>
+    </w:p>
+    <w:p>
+      <w:pPr>
+        <w:pStyle w:val="Normlnweb"/>
+        <w:numPr>
+          <w:ilvl w:val="0"/>
+          <w:numId w:val="22"/>
+        </w:numPr>
+        <w:rPr>
+          <w:color w:val="000000"/>
+        </w:rPr>
+      </w:pPr>
+      <w:r>
+        <w:rPr>
+          <w:color w:val="000000"/>
+        </w:rPr>
+        <w:t>Rewrites commit history.</w:t>
+      </w:r>
+    </w:p>
+    <w:p>
+      <w:pPr>
+        <w:pStyle w:val="Normlnweb"/>
+        <w:numPr>
+          <w:ilvl w:val="0"/>
+          <w:numId w:val="22"/>
+        </w:numPr>
+        <w:rPr>
+          <w:color w:val="000000"/>
+        </w:rPr>
+      </w:pPr>
+      <w:r>
+        <w:rPr>
+          <w:color w:val="000000"/>
+        </w:rPr>
+        <w:t>Can be confusing if you're not comfortable with rebasing.</w:t>
+      </w:r>
+    </w:p>
+    <w:p/>
+    <w:p>
+      <w:pPr>
+        <w:pStyle w:val="Nadpis2"/>
+        <w:rPr>
+          <w:color w:val="000000"/>
+        </w:rPr>
+      </w:pPr>
+      <w:r>
+        <w:rPr>
+          <w:color w:val="000000"/>
+        </w:rPr>
+        <w:t>Which one should you use?</w:t>
+      </w:r>
+    </w:p>
+    <w:p>
+      <w:pPr>
+        <w:pStyle w:val="Normlnweb"/>
+        <w:rPr>
+          <w:color w:val="000000"/>
+        </w:rPr>
+      </w:pPr>
+      <w:r>
+        <w:rPr>
+          <w:color w:val="000000"/>
+        </w:rPr>
+        <w:t>For a small team or a 42 project</w:t>
+      </w:r>
+      <w:r>
+        <w:rPr>
+          <w:color w:val="000000"/>
+        </w:rPr>
+        <w:t xml:space="preserve"> </w:t>
+      </w:r>
+      <w:r>
+        <w:rPr>
+          <w:b/>
+          <w:bCs/>
+          <w:color w:val="000000"/>
+        </w:rPr>
+        <w:t>Squash and Merge</w:t>
+      </w:r>
+      <w:r>
+        <w:rPr>
+          <w:color w:val="000000"/>
+        </w:rPr>
+        <w:t xml:space="preserve"> </w:t>
+      </w:r>
+      <w:r>
+        <w:rPr>
+          <w:color w:val="000000"/>
+        </w:rPr>
+        <w:t>is usually the nicest option.</w:t>
+      </w:r>
+    </w:p>
+    <w:p>
+      <w:pPr>
+        <w:pStyle w:val="Normlnweb"/>
+        <w:spacing w:after="0" w:afterAutospacing="0"/>
+        <w:rPr>
+          <w:color w:val="000000"/>
+        </w:rPr>
+      </w:pPr>
+      <w:r>
+        <w:rPr>
+          <w:color w:val="000000"/>
+        </w:rPr>
+        <w:t>You get:</w:t>
+      </w:r>
+    </w:p>
+    <w:p>
+      <w:pPr>
+        <w:pStyle w:val="FormtovanvHTML"/>
+        <w:ind w:left="284"/>
+        <w:rPr>
+          <w:rStyle w:val="KdHTML"/>
+          <w:color w:val="000000"/>
+        </w:rPr>
+      </w:pPr>
+      <w:r>
+        <w:rPr>
+          <w:rStyle w:val="KdHTML"/>
+          <w:color w:val="000000"/>
+        </w:rPr>
+        <w:t>Add medium sorting algorithm</w:t>
+      </w:r>
+    </w:p>
+    <w:p>
+      <w:pPr>
+        <w:pStyle w:val="FormtovanvHTML"/>
+        <w:ind w:left="284"/>
+        <w:rPr>
+          <w:rStyle w:val="KdHTML"/>
+          <w:color w:val="000000"/>
+        </w:rPr>
+      </w:pPr>
+      <w:r>
+        <w:rPr>
+          <w:rStyle w:val="KdHTML"/>
+          <w:color w:val="000000"/>
+        </w:rPr>
+        <w:t>Fix parser validation</w:t>
+      </w:r>
+    </w:p>
+    <w:p>
+      <w:pPr>
+        <w:pStyle w:val="FormtovanvHTML"/>
+        <w:ind w:left="284"/>
+        <w:rPr>
+          <w:rStyle w:val="KdHTML"/>
+          <w:color w:val="000000"/>
+        </w:rPr>
+      </w:pPr>
+      <w:r>
+        <w:rPr>
+          <w:rStyle w:val="KdHTML"/>
+          <w:color w:val="000000"/>
+        </w:rPr>
+        <w:t>Implement flash storage module</w:t>
+      </w:r>
+    </w:p>
+    <w:p>
+      <w:pPr>
+        <w:pStyle w:val="Normlnweb"/>
+        <w:spacing w:before="0" w:beforeAutospacing="0"/>
+        <w:rPr>
+          <w:color w:val="000000"/>
+        </w:rPr>
+      </w:pPr>
+      <w:r>
+        <w:rPr>
+          <w:color w:val="000000"/>
+        </w:rPr>
+        <w:t>instead of dozens of tiny commits.</w:t>
+      </w:r>
+    </w:p>
+    <w:p>
+      <w:pPr>
+        <w:pStyle w:val="Nadpis3"/>
+        <w:spacing w:after="0" w:afterAutospacing="0"/>
+        <w:rPr>
+          <w:b w:val="0"/>
+          <w:bCs w:val="0"/>
+          <w:color w:val="000000"/>
+          <w:sz w:val="24"/>
+          <w:szCs w:val="24"/>
+        </w:rPr>
+      </w:pPr>
+      <w:r>
+        <w:rPr>
+          <w:color w:val="000000"/>
+          <w:sz w:val="24"/>
+          <w:szCs w:val="24"/>
+        </w:rPr>
+        <w:t>Merge Commit</w:t>
+      </w:r>
+      <w:r>
+        <w:rPr>
+          <w:b w:val="0"/>
+          <w:bCs w:val="0"/>
+          <w:color w:val="000000"/>
+          <w:sz w:val="24"/>
+          <w:szCs w:val="24"/>
+        </w:rPr>
+        <w:t xml:space="preserve"> </w:t>
+      </w:r>
+      <w:r>
+        <w:rPr>
+          <w:b w:val="0"/>
+          <w:bCs w:val="0"/>
+          <w:color w:val="000000"/>
+          <w:sz w:val="24"/>
+          <w:szCs w:val="24"/>
+        </w:rPr>
+        <w:t>is useful if:</w:t>
+      </w:r>
+    </w:p>
+    <w:p>
+      <w:pPr>
+        <w:pStyle w:val="Normlnweb"/>
+        <w:numPr>
+          <w:ilvl w:val="0"/>
+          <w:numId w:val="23"/>
+        </w:numPr>
+        <w:rPr>
+          <w:color w:val="000000"/>
+        </w:rPr>
+      </w:pPr>
+      <w:r>
+        <w:rPr>
+          <w:color w:val="000000"/>
+        </w:rPr>
+        <w:t>the feature branch has meaningful commit history,</w:t>
+      </w:r>
+    </w:p>
+    <w:p>
+      <w:pPr>
+        <w:pStyle w:val="Normlnweb"/>
+        <w:numPr>
+          <w:ilvl w:val="0"/>
+          <w:numId w:val="23"/>
+        </w:numPr>
+        <w:rPr>
+          <w:color w:val="000000"/>
+        </w:rPr>
+      </w:pPr>
+      <w:r>
+        <w:rPr>
+          <w:color w:val="000000"/>
+        </w:rPr>
+        <w:t>multiple developers worked on it,</w:t>
+      </w:r>
+    </w:p>
+    <w:p>
+      <w:pPr>
+        <w:pStyle w:val="Normlnweb"/>
+        <w:numPr>
+          <w:ilvl w:val="0"/>
+          <w:numId w:val="23"/>
+        </w:numPr>
+        <w:rPr>
+          <w:color w:val="000000"/>
+        </w:rPr>
+      </w:pPr>
+      <w:r>
+        <w:rPr>
+          <w:color w:val="000000"/>
+        </w:rPr>
+        <w:t>you want to preserve the exact development process.</w:t>
+      </w:r>
+    </w:p>
+    <w:p>
+      <w:pPr>
+        <w:pStyle w:val="Nadpis3"/>
+        <w:rPr>
+          <w:b w:val="0"/>
+          <w:bCs w:val="0"/>
+          <w:color w:val="000000"/>
+          <w:sz w:val="24"/>
+          <w:szCs w:val="24"/>
+        </w:rPr>
+      </w:pPr>
+      <w:r>
+        <w:rPr>
+          <w:color w:val="000000"/>
+          <w:sz w:val="24"/>
+          <w:szCs w:val="24"/>
+        </w:rPr>
+        <w:t>Rebase and Merge</w:t>
+      </w:r>
+      <w:r>
+        <w:rPr>
+          <w:b w:val="0"/>
+          <w:bCs w:val="0"/>
+          <w:color w:val="000000"/>
+          <w:sz w:val="24"/>
+          <w:szCs w:val="24"/>
+        </w:rPr>
+        <w:t xml:space="preserve"> </w:t>
+      </w:r>
+      <w:r>
+        <w:rPr>
+          <w:b w:val="0"/>
+          <w:bCs w:val="0"/>
+          <w:color w:val="000000"/>
+          <w:sz w:val="24"/>
+          <w:szCs w:val="24"/>
+        </w:rPr>
+        <w:t>is popular among experienced Git users who want a perfectly linear history and carefully curate their commits.</w:t>
+      </w:r>
+    </w:p>
+    <w:p>
+      <w:pPr>
+        <w:pStyle w:val="Normlnweb"/>
+        <w:rPr>
+          <w:color w:val="000000"/>
+        </w:rPr>
+      </w:pPr>
+      <w:r>
+        <w:rPr>
+          <w:color w:val="000000"/>
+        </w:rPr>
+        <w:t>A quick rule of thumb:</w:t>
+      </w:r>
+    </w:p>
+    <w:tbl>
+      <w:tblPr>
+        <w:tblStyle w:val="Svtlmkatabulky"/>
+        <w:tblW w:w="9752" w:type="dxa"/>
+        <w:tblInd w:w="-289" w:type="dxa"/>
+        <w:tblLook w:val="04A0" w:firstRow="1" w:lastRow="0" w:firstColumn="1" w:lastColumn="0" w:noHBand="0" w:noVBand="1"/>
+      </w:tblPr>
+      <w:tblGrid>
+        <w:gridCol w:w="2438"/>
+        <w:gridCol w:w="2438"/>
+        <w:gridCol w:w="2438"/>
+        <w:gridCol w:w="2438"/>
+      </w:tblGrid>
+      <w:tr>
+        <w:trPr>
+          <w:trHeight w:val="737"/>
+        </w:trPr>
+        <w:tc>
+          <w:tcPr>
+            <w:tcW w:w="2438" w:type="dxa"/>
+            <w:vAlign w:val="center"/>
+            <w:hideMark/>
+          </w:tcPr>
+          <w:p>
+            <w:pPr>
+              <w:jc w:val="center"/>
+              <w:rPr>
+                <w:b/>
+                <w:bCs/>
+                <w:color w:val="000000"/>
+              </w:rPr>
+            </w:pPr>
+            <w:r>
+              <w:rPr>
+                <w:b/>
+                <w:bCs/>
+                <w:color w:val="000000"/>
+              </w:rPr>
+              <w:t>Option</w:t>
+            </w:r>
+          </w:p>
+        </w:tc>
+        <w:tc>
+          <w:tcPr>
+            <w:tcW w:w="2438" w:type="dxa"/>
+            <w:vAlign w:val="center"/>
+            <w:hideMark/>
+          </w:tcPr>
+          <w:p>
+            <w:pPr>
+              <w:jc w:val="center"/>
+              <w:rPr>
+                <w:b/>
+                <w:bCs/>
+                <w:color w:val="000000"/>
+              </w:rPr>
+            </w:pPr>
+            <w:r>
+              <w:rPr>
+                <w:b/>
+                <w:bCs/>
+                <w:color w:val="000000"/>
+              </w:rPr>
+              <w:t>Keeps commits?</w:t>
+            </w:r>
+          </w:p>
+        </w:tc>
+        <w:tc>
+          <w:tcPr>
+            <w:tcW w:w="2438" w:type="dxa"/>
+            <w:vAlign w:val="center"/>
+            <w:hideMark/>
+          </w:tcPr>
+          <w:p>
+            <w:pPr>
+              <w:jc w:val="center"/>
+              <w:rPr>
+                <w:b/>
+                <w:bCs/>
+                <w:color w:val="000000"/>
+              </w:rPr>
+            </w:pPr>
+            <w:r>
+              <w:rPr>
+                <w:b/>
+                <w:bCs/>
+                <w:color w:val="000000"/>
+              </w:rPr>
+              <w:t>Creates merge commit?</w:t>
+            </w:r>
+          </w:p>
+        </w:tc>
+        <w:tc>
+          <w:tcPr>
+            <w:tcW w:w="2438" w:type="dxa"/>
+            <w:vAlign w:val="center"/>
+            <w:hideMark/>
+          </w:tcPr>
+          <w:p>
+            <w:pPr>
+              <w:jc w:val="center"/>
+              <w:rPr>
+                <w:b/>
+                <w:bCs/>
+                <w:color w:val="000000"/>
+              </w:rPr>
+            </w:pPr>
+            <w:r>
+              <w:rPr>
+                <w:b/>
+                <w:bCs/>
+                <w:color w:val="000000"/>
+              </w:rPr>
+              <w:t>Clean history?</w:t>
+            </w:r>
+          </w:p>
+        </w:tc>
+      </w:tr>
+      <w:tr>
+        <w:trPr>
+          <w:trHeight w:val="737"/>
+        </w:trPr>
+        <w:tc>
+          <w:tcPr>
+            <w:tcW w:w="2438" w:type="dxa"/>
+            <w:vAlign w:val="center"/>
+            <w:hideMark/>
+          </w:tcPr>
+          <w:p>
+            <w:pPr>
+              <w:jc w:val="center"/>
+              <w:rPr>
+                <w:color w:val="000000"/>
+              </w:rPr>
+            </w:pPr>
+            <w:r>
+              <w:rPr>
+                <w:color w:val="000000"/>
+              </w:rPr>
+              <w:t>Merge Pull Request</w:t>
+            </w:r>
+          </w:p>
+        </w:tc>
+        <w:tc>
+          <w:tcPr>
+            <w:tcW w:w="2438" w:type="dxa"/>
+            <w:vAlign w:val="center"/>
+            <w:hideMark/>
+          </w:tcPr>
+          <w:p>
+            <w:pPr>
+              <w:jc w:val="center"/>
+              <w:rPr>
+                <w:color w:val="000000"/>
+              </w:rPr>
+            </w:pPr>
+            <w:r>
+              <w:rPr>
+                <w:rFonts w:ascii="Apple Color Emoji" w:hAnsi="Apple Color Emoji" w:cs="Apple Color Emoji"/>
+                <w:color w:val="000000"/>
+              </w:rPr>
+              <w:t>✅</w:t>
+            </w:r>
+            <w:r>
+              <w:rPr>
+                <w:color w:val="000000"/>
+              </w:rPr>
+              <w:t xml:space="preserve"> Yes</w:t>
+            </w:r>
+          </w:p>
+        </w:tc>
+        <w:tc>
+          <w:tcPr>
+            <w:tcW w:w="2438" w:type="dxa"/>
+            <w:vAlign w:val="center"/>
+            <w:hideMark/>
+          </w:tcPr>
+          <w:p>
+            <w:pPr>
+              <w:jc w:val="center"/>
+              <w:rPr>
+                <w:color w:val="000000"/>
+              </w:rPr>
+            </w:pPr>
+            <w:r>
+              <w:rPr>
+                <w:rFonts w:ascii="Apple Color Emoji" w:hAnsi="Apple Color Emoji" w:cs="Apple Color Emoji"/>
+                <w:color w:val="000000"/>
+              </w:rPr>
+              <w:t>✅</w:t>
+            </w:r>
+            <w:r>
+              <w:rPr>
+                <w:color w:val="000000"/>
+              </w:rPr>
+              <w:t xml:space="preserve"> Yes</w:t>
+            </w:r>
+          </w:p>
+        </w:tc>
+        <w:tc>
+          <w:tcPr>
+            <w:tcW w:w="2438" w:type="dxa"/>
+            <w:vAlign w:val="center"/>
+            <w:hideMark/>
+          </w:tcPr>
+          <w:p>
+            <w:pPr>
+              <w:jc w:val="center"/>
+              <w:rPr>
+                <w:color w:val="000000"/>
+              </w:rPr>
+            </w:pPr>
+            <w:r>
+              <w:rPr>
+                <w:rFonts w:ascii="Apple Color Emoji" w:hAnsi="Apple Color Emoji" w:cs="Apple Color Emoji"/>
+                <w:color w:val="000000"/>
+              </w:rPr>
+              <w:t>❌</w:t>
+            </w:r>
+            <w:r>
+              <w:rPr>
+                <w:color w:val="000000"/>
+              </w:rPr>
+              <w:t xml:space="preserve"> Often noisy</w:t>
+            </w:r>
+          </w:p>
+        </w:tc>
+      </w:tr>
+      <w:tr>
+        <w:trPr>
+          <w:trHeight w:val="737"/>
+        </w:trPr>
+        <w:tc>
+          <w:tcPr>
+            <w:tcW w:w="2438" w:type="dxa"/>
+            <w:vAlign w:val="center"/>
+            <w:hideMark/>
+          </w:tcPr>
+          <w:p>
+            <w:pPr>
+              <w:jc w:val="center"/>
+              <w:rPr>
+                <w:color w:val="000000"/>
+              </w:rPr>
+            </w:pPr>
+            <w:r>
+              <w:rPr>
+                <w:color w:val="000000"/>
+              </w:rPr>
+              <w:t>Squash and Merge</w:t>
+            </w:r>
+          </w:p>
+        </w:tc>
+        <w:tc>
+          <w:tcPr>
+            <w:tcW w:w="2438" w:type="dxa"/>
+            <w:vAlign w:val="center"/>
+            <w:hideMark/>
+          </w:tcPr>
+          <w:p>
+            <w:pPr>
+              <w:jc w:val="center"/>
+              <w:rPr>
+                <w:color w:val="000000"/>
+              </w:rPr>
+            </w:pPr>
+            <w:r>
+              <w:rPr>
+                <w:rFonts w:ascii="Apple Color Emoji" w:hAnsi="Apple Color Emoji" w:cs="Apple Color Emoji"/>
+                <w:color w:val="000000"/>
+              </w:rPr>
+              <w:t>❌</w:t>
+            </w:r>
+            <w:r>
+              <w:rPr>
+                <w:color w:val="000000"/>
+              </w:rPr>
+              <w:t xml:space="preserve"> No </w:t>
+            </w:r>
+            <w:r>
+              <w:rPr>
+                <w:color w:val="000000"/>
+              </w:rPr>
+              <w:br/>
+            </w:r>
+            <w:r>
+              <w:rPr>
+                <w:color w:val="000000"/>
+                <w:sz w:val="18"/>
+                <w:szCs w:val="18"/>
+              </w:rPr>
+              <w:t>(1 commit remains)</w:t>
+            </w:r>
+          </w:p>
+        </w:tc>
+        <w:tc>
+          <w:tcPr>
+            <w:tcW w:w="2438" w:type="dxa"/>
+            <w:vAlign w:val="center"/>
+            <w:hideMark/>
+          </w:tcPr>
+          <w:p>
+            <w:pPr>
+              <w:jc w:val="center"/>
+              <w:rPr>
+                <w:color w:val="000000"/>
+              </w:rPr>
+            </w:pPr>
+            <w:r>
+              <w:rPr>
+                <w:rFonts w:ascii="Apple Color Emoji" w:hAnsi="Apple Color Emoji" w:cs="Apple Color Emoji"/>
+                <w:color w:val="000000"/>
+              </w:rPr>
+              <w:t>❌</w:t>
+            </w:r>
+            <w:r>
+              <w:rPr>
+                <w:color w:val="000000"/>
+              </w:rPr>
+              <w:t xml:space="preserve"> No</w:t>
+            </w:r>
+          </w:p>
+        </w:tc>
+        <w:tc>
+          <w:tcPr>
+            <w:tcW w:w="2438" w:type="dxa"/>
+            <w:vAlign w:val="center"/>
+            <w:hideMark/>
+          </w:tcPr>
+          <w:p>
+            <w:pPr>
+              <w:jc w:val="center"/>
+              <w:rPr>
+                <w:color w:val="000000"/>
+              </w:rPr>
+            </w:pPr>
+            <w:r>
+              <w:rPr>
+                <w:rFonts w:ascii="Apple Color Emoji" w:hAnsi="Apple Color Emoji" w:cs="Apple Color Emoji"/>
+                <w:color w:val="000000"/>
+              </w:rPr>
+              <w:t>✅</w:t>
+            </w:r>
+            <w:r>
+              <w:rPr>
+                <w:color w:val="000000"/>
+              </w:rPr>
+              <w:t xml:space="preserve"> Very clean</w:t>
+            </w:r>
+          </w:p>
+        </w:tc>
+      </w:tr>
+      <w:tr>
+        <w:trPr>
+          <w:trHeight w:val="737"/>
+        </w:trPr>
+        <w:tc>
+          <w:tcPr>
+            <w:tcW w:w="2438" w:type="dxa"/>
+            <w:vAlign w:val="center"/>
+            <w:hideMark/>
+          </w:tcPr>
+          <w:p>
+            <w:pPr>
+              <w:jc w:val="center"/>
+              <w:rPr>
+                <w:color w:val="000000"/>
+              </w:rPr>
+            </w:pPr>
+            <w:r>
+              <w:rPr>
+                <w:color w:val="000000"/>
+              </w:rPr>
+              <w:t>Rebase and Merge</w:t>
+            </w:r>
+          </w:p>
+        </w:tc>
+        <w:tc>
+          <w:tcPr>
+            <w:tcW w:w="2438" w:type="dxa"/>
+            <w:vAlign w:val="center"/>
+            <w:hideMark/>
+          </w:tcPr>
+          <w:p>
+            <w:pPr>
+              <w:jc w:val="center"/>
+              <w:rPr>
+                <w:color w:val="000000"/>
+              </w:rPr>
+            </w:pPr>
+            <w:r>
+              <w:rPr>
+                <w:rFonts w:ascii="Apple Color Emoji" w:hAnsi="Apple Color Emoji" w:cs="Apple Color Emoji"/>
+                <w:color w:val="000000"/>
+              </w:rPr>
+              <w:t>✅</w:t>
+            </w:r>
+            <w:r>
+              <w:rPr>
+                <w:color w:val="000000"/>
+              </w:rPr>
+              <w:t xml:space="preserve"> Yes</w:t>
+            </w:r>
+          </w:p>
+        </w:tc>
+        <w:tc>
+          <w:tcPr>
+            <w:tcW w:w="2438" w:type="dxa"/>
+            <w:vAlign w:val="center"/>
+            <w:hideMark/>
+          </w:tcPr>
+          <w:p>
+            <w:pPr>
+              <w:jc w:val="center"/>
+              <w:rPr>
+                <w:color w:val="000000"/>
+              </w:rPr>
+            </w:pPr>
+            <w:r>
+              <w:rPr>
+                <w:rFonts w:ascii="Apple Color Emoji" w:hAnsi="Apple Color Emoji" w:cs="Apple Color Emoji"/>
+                <w:color w:val="000000"/>
+              </w:rPr>
+              <w:t>❌</w:t>
+            </w:r>
+            <w:r>
+              <w:rPr>
+                <w:color w:val="000000"/>
+              </w:rPr>
+              <w:t xml:space="preserve"> No</w:t>
+            </w:r>
+          </w:p>
+        </w:tc>
+        <w:tc>
+          <w:tcPr>
+            <w:tcW w:w="2438" w:type="dxa"/>
+            <w:vAlign w:val="center"/>
+            <w:hideMark/>
+          </w:tcPr>
+          <w:p>
+            <w:pPr>
+              <w:jc w:val="center"/>
+              <w:rPr>
+                <w:color w:val="000000"/>
+              </w:rPr>
+            </w:pPr>
+            <w:r>
+              <w:rPr>
+                <w:rFonts w:ascii="Apple Color Emoji" w:hAnsi="Apple Color Emoji" w:cs="Apple Color Emoji"/>
+                <w:color w:val="000000"/>
+              </w:rPr>
+              <w:t>✅</w:t>
+            </w:r>
+            <w:r>
+              <w:rPr>
+                <w:color w:val="000000"/>
+              </w:rPr>
+              <w:t xml:space="preserve"> Clean</w:t>
+            </w:r>
+          </w:p>
+        </w:tc>
+      </w:tr>
+    </w:tbl>
+    <w:p>
+      <w:pPr>
+        <w:pStyle w:val="Normlnweb"/>
+        <w:rPr>
+          <w:color w:val="000000"/>
+        </w:rPr>
+      </w:pPr>
+      <w:r>
+        <w:rPr>
+          <w:color w:val="000000"/>
+        </w:rPr>
+        <w:t>For most student projects and many professional repositories,</w:t>
+      </w:r>
+      <w:r>
+        <w:rPr>
+          <w:rStyle w:val="apple-converted-space"/>
+          <w:color w:val="000000"/>
+        </w:rPr>
+        <w:t> </w:t>
+      </w:r>
+      <w:r>
+        <w:rPr>
+          <w:rStyle w:val="Siln"/>
+          <w:color w:val="000000"/>
+        </w:rPr>
+        <w:t>Squash and Merge</w:t>
+      </w:r>
+      <w:r>
+        <w:rPr>
+          <w:rStyle w:val="apple-converted-space"/>
+          <w:color w:val="000000"/>
+        </w:rPr>
+        <w:t> </w:t>
+      </w:r>
+      <w:r>
+        <w:rPr>
+          <w:color w:val="000000"/>
+        </w:rPr>
+        <w:t>is often the default choice because it keeps the main branch easy to read.</w:t>
       </w:r>
     </w:p>
     <w:p>
@@ -10558,7 +12990,6 @@
           <w:sz w:val="36"/>
           <w:szCs w:val="36"/>
         </w:rPr>
-        <w:lastRenderedPageBreak/>
         <w:t>Never Work Directly on Main</w:t>
       </w:r>
     </w:p>
@@ -11262,6 +13693,7 @@
           <w:noProof/>
           <w14:ligatures w14:val="standardContextual"/>
         </w:rPr>
+        <w:lastRenderedPageBreak/>
         <w:pict>
           <v:rect id="_x0000_i1026" alt="" style="width:453.6pt;height:.05pt;mso-width-percent:0;mso-height-percent:0;mso-width-percent:0;mso-height-percent:0" o:hralign="center" o:hrstd="t" o:hr="t" fillcolor="#a0a0a0" stroked="f"/>
         </w:pict>
@@ -12228,6 +14660,155 @@
     </w:lvl>
   </w:abstractNum>
   <w:abstractNum w:abstractNumId="1" w15:restartNumberingAfterBreak="0">
+    <w:nsid w:val="0A823F4C"/>
+    <w:multiLevelType w:val="multilevel"/>
+    <w:tmpl w:val="2CDC59FA"/>
+    <w:lvl w:ilvl="0">
+      <w:start w:val="1"/>
+      <w:numFmt w:val="bullet"/>
+      <w:lvlText w:val=""/>
+      <w:lvlJc w:val="left"/>
+      <w:pPr>
+        <w:tabs>
+          <w:tab w:val="num" w:pos="720"/>
+        </w:tabs>
+        <w:ind w:left="720" w:hanging="360"/>
+      </w:pPr>
+      <w:rPr>
+        <w:rFonts w:ascii="Symbol" w:hAnsi="Symbol" w:hint="default"/>
+        <w:sz w:val="20"/>
+      </w:rPr>
+    </w:lvl>
+    <w:lvl w:ilvl="1" w:tentative="1">
+      <w:start w:val="1"/>
+      <w:numFmt w:val="bullet"/>
+      <w:lvlText w:val="o"/>
+      <w:lvlJc w:val="left"/>
+      <w:pPr>
+        <w:tabs>
+          <w:tab w:val="num" w:pos="1440"/>
+        </w:tabs>
+        <w:ind w:left="1440" w:hanging="360"/>
+      </w:pPr>
+      <w:rPr>
+        <w:rFonts w:ascii="Courier New" w:hAnsi="Courier New" w:hint="default"/>
+        <w:sz w:val="20"/>
+      </w:rPr>
+    </w:lvl>
+    <w:lvl w:ilvl="2" w:tentative="1">
+      <w:start w:val="1"/>
+      <w:numFmt w:val="bullet"/>
+      <w:lvlText w:val=""/>
+      <w:lvlJc w:val="left"/>
+      <w:pPr>
+        <w:tabs>
+          <w:tab w:val="num" w:pos="2160"/>
+        </w:tabs>
+        <w:ind w:left="2160" w:hanging="360"/>
+      </w:pPr>
+      <w:rPr>
+        <w:rFonts w:ascii="Wingdings" w:hAnsi="Wingdings" w:hint="default"/>
+        <w:sz w:val="20"/>
+      </w:rPr>
+    </w:lvl>
+    <w:lvl w:ilvl="3" w:tentative="1">
+      <w:start w:val="1"/>
+      <w:numFmt w:val="bullet"/>
+      <w:lvlText w:val=""/>
+      <w:lvlJc w:val="left"/>
+      <w:pPr>
+        <w:tabs>
+          <w:tab w:val="num" w:pos="2880"/>
+        </w:tabs>
+        <w:ind w:left="2880" w:hanging="360"/>
+      </w:pPr>
+      <w:rPr>
+        <w:rFonts w:ascii="Wingdings" w:hAnsi="Wingdings" w:hint="default"/>
+        <w:sz w:val="20"/>
+      </w:rPr>
+    </w:lvl>
+    <w:lvl w:ilvl="4" w:tentative="1">
+      <w:start w:val="1"/>
+      <w:numFmt w:val="bullet"/>
+      <w:lvlText w:val=""/>
+      <w:lvlJc w:val="left"/>
+      <w:pPr>
+        <w:tabs>
+          <w:tab w:val="num" w:pos="3600"/>
+        </w:tabs>
+        <w:ind w:left="3600" w:hanging="360"/>
+      </w:pPr>
+      <w:rPr>
+        <w:rFonts w:ascii="Wingdings" w:hAnsi="Wingdings" w:hint="default"/>
+        <w:sz w:val="20"/>
+      </w:rPr>
+    </w:lvl>
+    <w:lvl w:ilvl="5" w:tentative="1">
+      <w:start w:val="1"/>
+      <w:numFmt w:val="bullet"/>
+      <w:lvlText w:val=""/>
+      <w:lvlJc w:val="left"/>
+      <w:pPr>
+        <w:tabs>
+          <w:tab w:val="num" w:pos="4320"/>
+        </w:tabs>
+        <w:ind w:left="4320" w:hanging="360"/>
+      </w:pPr>
+      <w:rPr>
+        <w:rFonts w:ascii="Wingdings" w:hAnsi="Wingdings" w:hint="default"/>
+        <w:sz w:val="20"/>
+      </w:rPr>
+    </w:lvl>
+    <w:lvl w:ilvl="6" w:tentative="1">
+      <w:start w:val="1"/>
+      <w:numFmt w:val="bullet"/>
+      <w:lvlText w:val=""/>
+      <w:lvlJc w:val="left"/>
+      <w:pPr>
+        <w:tabs>
+          <w:tab w:val="num" w:pos="5040"/>
+        </w:tabs>
+        <w:ind w:left="5040" w:hanging="360"/>
+      </w:pPr>
+      <w:rPr>
+        <w:rFonts w:ascii="Wingdings" w:hAnsi="Wingdings" w:hint="default"/>
+        <w:sz w:val="20"/>
+      </w:rPr>
+    </w:lvl>
+    <w:lvl w:ilvl="7" w:tentative="1">
+      <w:start w:val="1"/>
+      <w:numFmt w:val="bullet"/>
+      <w:lvlText w:val=""/>
+      <w:lvlJc w:val="left"/>
+      <w:pPr>
+        <w:tabs>
+          <w:tab w:val="num" w:pos="5760"/>
+        </w:tabs>
+        <w:ind w:left="5760" w:hanging="360"/>
+      </w:pPr>
+      <w:rPr>
+        <w:rFonts w:ascii="Wingdings" w:hAnsi="Wingdings" w:hint="default"/>
+        <w:sz w:val="20"/>
+      </w:rPr>
+    </w:lvl>
+    <w:lvl w:ilvl="8" w:tentative="1">
+      <w:start w:val="1"/>
+      <w:numFmt w:val="bullet"/>
+      <w:lvlText w:val=""/>
+      <w:lvlJc w:val="left"/>
+      <w:pPr>
+        <w:tabs>
+          <w:tab w:val="num" w:pos="6480"/>
+        </w:tabs>
+        <w:ind w:left="6480" w:hanging="360"/>
+      </w:pPr>
+      <w:rPr>
+        <w:rFonts w:ascii="Wingdings" w:hAnsi="Wingdings" w:hint="default"/>
+        <w:sz w:val="20"/>
+      </w:rPr>
+    </w:lvl>
+  </w:abstractNum>
+  <w:abstractNum w:abstractNumId="2" w15:restartNumberingAfterBreak="0">
     <w:nsid w:val="10A70BE2"/>
     <w:multiLevelType w:val="multilevel"/>
     <w:tmpl w:val="2ACAF39A"/>
@@ -12376,7 +14957,7 @@
       </w:rPr>
     </w:lvl>
   </w:abstractNum>
-  <w:abstractNum w:abstractNumId="2" w15:restartNumberingAfterBreak="0">
+  <w:abstractNum w:abstractNumId="3" w15:restartNumberingAfterBreak="0">
     <w:nsid w:val="17165D09"/>
     <w:multiLevelType w:val="multilevel"/>
     <w:tmpl w:val="C7C6A9B0"/>
@@ -12525,7 +15106,7 @@
       </w:rPr>
     </w:lvl>
   </w:abstractNum>
-  <w:abstractNum w:abstractNumId="3" w15:restartNumberingAfterBreak="0">
+  <w:abstractNum w:abstractNumId="4" w15:restartNumberingAfterBreak="0">
     <w:nsid w:val="1834253A"/>
     <w:multiLevelType w:val="multilevel"/>
     <w:tmpl w:val="CF86E46E"/>
@@ -12638,7 +15219,305 @@
       </w:pPr>
     </w:lvl>
   </w:abstractNum>
-  <w:abstractNum w:abstractNumId="4" w15:restartNumberingAfterBreak="0">
+  <w:abstractNum w:abstractNumId="5" w15:restartNumberingAfterBreak="0">
+    <w:nsid w:val="187E619A"/>
+    <w:multiLevelType w:val="multilevel"/>
+    <w:tmpl w:val="4B521024"/>
+    <w:lvl w:ilvl="0">
+      <w:start w:val="1"/>
+      <w:numFmt w:val="bullet"/>
+      <w:lvlText w:val=""/>
+      <w:lvlJc w:val="left"/>
+      <w:pPr>
+        <w:tabs>
+          <w:tab w:val="num" w:pos="720"/>
+        </w:tabs>
+        <w:ind w:left="720" w:hanging="360"/>
+      </w:pPr>
+      <w:rPr>
+        <w:rFonts w:ascii="Symbol" w:hAnsi="Symbol" w:hint="default"/>
+        <w:sz w:val="20"/>
+      </w:rPr>
+    </w:lvl>
+    <w:lvl w:ilvl="1" w:tentative="1">
+      <w:start w:val="1"/>
+      <w:numFmt w:val="bullet"/>
+      <w:lvlText w:val="o"/>
+      <w:lvlJc w:val="left"/>
+      <w:pPr>
+        <w:tabs>
+          <w:tab w:val="num" w:pos="1440"/>
+        </w:tabs>
+        <w:ind w:left="1440" w:hanging="360"/>
+      </w:pPr>
+      <w:rPr>
+        <w:rFonts w:ascii="Courier New" w:hAnsi="Courier New" w:hint="default"/>
+        <w:sz w:val="20"/>
+      </w:rPr>
+    </w:lvl>
+    <w:lvl w:ilvl="2" w:tentative="1">
+      <w:start w:val="1"/>
+      <w:numFmt w:val="bullet"/>
+      <w:lvlText w:val=""/>
+      <w:lvlJc w:val="left"/>
+      <w:pPr>
+        <w:tabs>
+          <w:tab w:val="num" w:pos="2160"/>
+        </w:tabs>
+        <w:ind w:left="2160" w:hanging="360"/>
+      </w:pPr>
+      <w:rPr>
+        <w:rFonts w:ascii="Wingdings" w:hAnsi="Wingdings" w:hint="default"/>
+        <w:sz w:val="20"/>
+      </w:rPr>
+    </w:lvl>
+    <w:lvl w:ilvl="3" w:tentative="1">
+      <w:start w:val="1"/>
+      <w:numFmt w:val="bullet"/>
+      <w:lvlText w:val=""/>
+      <w:lvlJc w:val="left"/>
+      <w:pPr>
+        <w:tabs>
+          <w:tab w:val="num" w:pos="2880"/>
+        </w:tabs>
+        <w:ind w:left="2880" w:hanging="360"/>
+      </w:pPr>
+      <w:rPr>
+        <w:rFonts w:ascii="Wingdings" w:hAnsi="Wingdings" w:hint="default"/>
+        <w:sz w:val="20"/>
+      </w:rPr>
+    </w:lvl>
+    <w:lvl w:ilvl="4" w:tentative="1">
+      <w:start w:val="1"/>
+      <w:numFmt w:val="bullet"/>
+      <w:lvlText w:val=""/>
+      <w:lvlJc w:val="left"/>
+      <w:pPr>
+        <w:tabs>
+          <w:tab w:val="num" w:pos="3600"/>
+        </w:tabs>
+        <w:ind w:left="3600" w:hanging="360"/>
+      </w:pPr>
+      <w:rPr>
+        <w:rFonts w:ascii="Wingdings" w:hAnsi="Wingdings" w:hint="default"/>
+        <w:sz w:val="20"/>
+      </w:rPr>
+    </w:lvl>
+    <w:lvl w:ilvl="5" w:tentative="1">
+      <w:start w:val="1"/>
+      <w:numFmt w:val="bullet"/>
+      <w:lvlText w:val=""/>
+      <w:lvlJc w:val="left"/>
+      <w:pPr>
+        <w:tabs>
+          <w:tab w:val="num" w:pos="4320"/>
+        </w:tabs>
+        <w:ind w:left="4320" w:hanging="360"/>
+      </w:pPr>
+      <w:rPr>
+        <w:rFonts w:ascii="Wingdings" w:hAnsi="Wingdings" w:hint="default"/>
+        <w:sz w:val="20"/>
+      </w:rPr>
+    </w:lvl>
+    <w:lvl w:ilvl="6" w:tentative="1">
+      <w:start w:val="1"/>
+      <w:numFmt w:val="bullet"/>
+      <w:lvlText w:val=""/>
+      <w:lvlJc w:val="left"/>
+      <w:pPr>
+        <w:tabs>
+          <w:tab w:val="num" w:pos="5040"/>
+        </w:tabs>
+        <w:ind w:left="5040" w:hanging="360"/>
+      </w:pPr>
+      <w:rPr>
+        <w:rFonts w:ascii="Wingdings" w:hAnsi="Wingdings" w:hint="default"/>
+        <w:sz w:val="20"/>
+      </w:rPr>
+    </w:lvl>
+    <w:lvl w:ilvl="7" w:tentative="1">
+      <w:start w:val="1"/>
+      <w:numFmt w:val="bullet"/>
+      <w:lvlText w:val=""/>
+      <w:lvlJc w:val="left"/>
+      <w:pPr>
+        <w:tabs>
+          <w:tab w:val="num" w:pos="5760"/>
+        </w:tabs>
+        <w:ind w:left="5760" w:hanging="360"/>
+      </w:pPr>
+      <w:rPr>
+        <w:rFonts w:ascii="Wingdings" w:hAnsi="Wingdings" w:hint="default"/>
+        <w:sz w:val="20"/>
+      </w:rPr>
+    </w:lvl>
+    <w:lvl w:ilvl="8" w:tentative="1">
+      <w:start w:val="1"/>
+      <w:numFmt w:val="bullet"/>
+      <w:lvlText w:val=""/>
+      <w:lvlJc w:val="left"/>
+      <w:pPr>
+        <w:tabs>
+          <w:tab w:val="num" w:pos="6480"/>
+        </w:tabs>
+        <w:ind w:left="6480" w:hanging="360"/>
+      </w:pPr>
+      <w:rPr>
+        <w:rFonts w:ascii="Wingdings" w:hAnsi="Wingdings" w:hint="default"/>
+        <w:sz w:val="20"/>
+      </w:rPr>
+    </w:lvl>
+  </w:abstractNum>
+  <w:abstractNum w:abstractNumId="6" w15:restartNumberingAfterBreak="0">
+    <w:nsid w:val="1D0C08DC"/>
+    <w:multiLevelType w:val="multilevel"/>
+    <w:tmpl w:val="25881E94"/>
+    <w:lvl w:ilvl="0">
+      <w:start w:val="1"/>
+      <w:numFmt w:val="bullet"/>
+      <w:lvlText w:val=""/>
+      <w:lvlJc w:val="left"/>
+      <w:pPr>
+        <w:tabs>
+          <w:tab w:val="num" w:pos="720"/>
+        </w:tabs>
+        <w:ind w:left="720" w:hanging="360"/>
+      </w:pPr>
+      <w:rPr>
+        <w:rFonts w:ascii="Symbol" w:hAnsi="Symbol" w:hint="default"/>
+        <w:sz w:val="20"/>
+      </w:rPr>
+    </w:lvl>
+    <w:lvl w:ilvl="1" w:tentative="1">
+      <w:start w:val="1"/>
+      <w:numFmt w:val="bullet"/>
+      <w:lvlText w:val="o"/>
+      <w:lvlJc w:val="left"/>
+      <w:pPr>
+        <w:tabs>
+          <w:tab w:val="num" w:pos="1440"/>
+        </w:tabs>
+        <w:ind w:left="1440" w:hanging="360"/>
+      </w:pPr>
+      <w:rPr>
+        <w:rFonts w:ascii="Courier New" w:hAnsi="Courier New" w:hint="default"/>
+        <w:sz w:val="20"/>
+      </w:rPr>
+    </w:lvl>
+    <w:lvl w:ilvl="2" w:tentative="1">
+      <w:start w:val="1"/>
+      <w:numFmt w:val="bullet"/>
+      <w:lvlText w:val=""/>
+      <w:lvlJc w:val="left"/>
+      <w:pPr>
+        <w:tabs>
+          <w:tab w:val="num" w:pos="2160"/>
+        </w:tabs>
+        <w:ind w:left="2160" w:hanging="360"/>
+      </w:pPr>
+      <w:rPr>
+        <w:rFonts w:ascii="Wingdings" w:hAnsi="Wingdings" w:hint="default"/>
+        <w:sz w:val="20"/>
+      </w:rPr>
+    </w:lvl>
+    <w:lvl w:ilvl="3" w:tentative="1">
+      <w:start w:val="1"/>
+      <w:numFmt w:val="bullet"/>
+      <w:lvlText w:val=""/>
+      <w:lvlJc w:val="left"/>
+      <w:pPr>
+        <w:tabs>
+          <w:tab w:val="num" w:pos="2880"/>
+        </w:tabs>
+        <w:ind w:left="2880" w:hanging="360"/>
+      </w:pPr>
+      <w:rPr>
+        <w:rFonts w:ascii="Wingdings" w:hAnsi="Wingdings" w:hint="default"/>
+        <w:sz w:val="20"/>
+      </w:rPr>
+    </w:lvl>
+    <w:lvl w:ilvl="4" w:tentative="1">
+      <w:start w:val="1"/>
+      <w:numFmt w:val="bullet"/>
+      <w:lvlText w:val=""/>
+      <w:lvlJc w:val="left"/>
+      <w:pPr>
+        <w:tabs>
+          <w:tab w:val="num" w:pos="3600"/>
+        </w:tabs>
+        <w:ind w:left="3600" w:hanging="360"/>
+      </w:pPr>
+      <w:rPr>
+        <w:rFonts w:ascii="Wingdings" w:hAnsi="Wingdings" w:hint="default"/>
+        <w:sz w:val="20"/>
+      </w:rPr>
+    </w:lvl>
+    <w:lvl w:ilvl="5" w:tentative="1">
+      <w:start w:val="1"/>
+      <w:numFmt w:val="bullet"/>
+      <w:lvlText w:val=""/>
+      <w:lvlJc w:val="left"/>
+      <w:pPr>
+        <w:tabs>
+          <w:tab w:val="num" w:pos="4320"/>
+        </w:tabs>
+        <w:ind w:left="4320" w:hanging="360"/>
+      </w:pPr>
+      <w:rPr>
+        <w:rFonts w:ascii="Wingdings" w:hAnsi="Wingdings" w:hint="default"/>
+        <w:sz w:val="20"/>
+      </w:rPr>
+    </w:lvl>
+    <w:lvl w:ilvl="6" w:tentative="1">
+      <w:start w:val="1"/>
+      <w:numFmt w:val="bullet"/>
+      <w:lvlText w:val=""/>
+      <w:lvlJc w:val="left"/>
+      <w:pPr>
+        <w:tabs>
+          <w:tab w:val="num" w:pos="5040"/>
+        </w:tabs>
+        <w:ind w:left="5040" w:hanging="360"/>
+      </w:pPr>
+      <w:rPr>
+        <w:rFonts w:ascii="Wingdings" w:hAnsi="Wingdings" w:hint="default"/>
+        <w:sz w:val="20"/>
+      </w:rPr>
+    </w:lvl>
+    <w:lvl w:ilvl="7" w:tentative="1">
+      <w:start w:val="1"/>
+      <w:numFmt w:val="bullet"/>
+      <w:lvlText w:val=""/>
+      <w:lvlJc w:val="left"/>
+      <w:pPr>
+        <w:tabs>
+          <w:tab w:val="num" w:pos="5760"/>
+        </w:tabs>
+        <w:ind w:left="5760" w:hanging="360"/>
+      </w:pPr>
+      <w:rPr>
+        <w:rFonts w:ascii="Wingdings" w:hAnsi="Wingdings" w:hint="default"/>
+        <w:sz w:val="20"/>
+      </w:rPr>
+    </w:lvl>
+    <w:lvl w:ilvl="8" w:tentative="1">
+      <w:start w:val="1"/>
+      <w:numFmt w:val="bullet"/>
+      <w:lvlText w:val=""/>
+      <w:lvlJc w:val="left"/>
+      <w:pPr>
+        <w:tabs>
+          <w:tab w:val="num" w:pos="6480"/>
+        </w:tabs>
+        <w:ind w:left="6480" w:hanging="360"/>
+      </w:pPr>
+      <w:rPr>
+        <w:rFonts w:ascii="Wingdings" w:hAnsi="Wingdings" w:hint="default"/>
+        <w:sz w:val="20"/>
+      </w:rPr>
+    </w:lvl>
+  </w:abstractNum>
+  <w:abstractNum w:abstractNumId="7" w15:restartNumberingAfterBreak="0">
     <w:nsid w:val="21F02AAE"/>
     <w:multiLevelType w:val="multilevel"/>
     <w:tmpl w:val="11984862"/>
@@ -12787,7 +15666,7 @@
       </w:rPr>
     </w:lvl>
   </w:abstractNum>
-  <w:abstractNum w:abstractNumId="5" w15:restartNumberingAfterBreak="0">
+  <w:abstractNum w:abstractNumId="8" w15:restartNumberingAfterBreak="0">
     <w:nsid w:val="30154975"/>
     <w:multiLevelType w:val="multilevel"/>
     <w:tmpl w:val="84E611A0"/>
@@ -12936,7 +15815,7 @@
       </w:rPr>
     </w:lvl>
   </w:abstractNum>
-  <w:abstractNum w:abstractNumId="6" w15:restartNumberingAfterBreak="0">
+  <w:abstractNum w:abstractNumId="9" w15:restartNumberingAfterBreak="0">
     <w:nsid w:val="319857C4"/>
     <w:multiLevelType w:val="multilevel"/>
     <w:tmpl w:val="A1281EFA"/>
@@ -13085,7 +15964,454 @@
       </w:rPr>
     </w:lvl>
   </w:abstractNum>
-  <w:abstractNum w:abstractNumId="7" w15:restartNumberingAfterBreak="0">
+  <w:abstractNum w:abstractNumId="10" w15:restartNumberingAfterBreak="0">
+    <w:nsid w:val="33905A79"/>
+    <w:multiLevelType w:val="multilevel"/>
+    <w:tmpl w:val="4E8A98A8"/>
+    <w:lvl w:ilvl="0">
+      <w:start w:val="1"/>
+      <w:numFmt w:val="bullet"/>
+      <w:lvlText w:val=""/>
+      <w:lvlJc w:val="left"/>
+      <w:pPr>
+        <w:tabs>
+          <w:tab w:val="num" w:pos="720"/>
+        </w:tabs>
+        <w:ind w:left="720" w:hanging="360"/>
+      </w:pPr>
+      <w:rPr>
+        <w:rFonts w:ascii="Symbol" w:hAnsi="Symbol" w:hint="default"/>
+        <w:sz w:val="20"/>
+      </w:rPr>
+    </w:lvl>
+    <w:lvl w:ilvl="1" w:tentative="1">
+      <w:start w:val="1"/>
+      <w:numFmt w:val="bullet"/>
+      <w:lvlText w:val="o"/>
+      <w:lvlJc w:val="left"/>
+      <w:pPr>
+        <w:tabs>
+          <w:tab w:val="num" w:pos="1440"/>
+        </w:tabs>
+        <w:ind w:left="1440" w:hanging="360"/>
+      </w:pPr>
+      <w:rPr>
+        <w:rFonts w:ascii="Courier New" w:hAnsi="Courier New" w:hint="default"/>
+        <w:sz w:val="20"/>
+      </w:rPr>
+    </w:lvl>
+    <w:lvl w:ilvl="2" w:tentative="1">
+      <w:start w:val="1"/>
+      <w:numFmt w:val="bullet"/>
+      <w:lvlText w:val=""/>
+      <w:lvlJc w:val="left"/>
+      <w:pPr>
+        <w:tabs>
+          <w:tab w:val="num" w:pos="2160"/>
+        </w:tabs>
+        <w:ind w:left="2160" w:hanging="360"/>
+      </w:pPr>
+      <w:rPr>
+        <w:rFonts w:ascii="Wingdings" w:hAnsi="Wingdings" w:hint="default"/>
+        <w:sz w:val="20"/>
+      </w:rPr>
+    </w:lvl>
+    <w:lvl w:ilvl="3" w:tentative="1">
+      <w:start w:val="1"/>
+      <w:numFmt w:val="bullet"/>
+      <w:lvlText w:val=""/>
+      <w:lvlJc w:val="left"/>
+      <w:pPr>
+        <w:tabs>
+          <w:tab w:val="num" w:pos="2880"/>
+        </w:tabs>
+        <w:ind w:left="2880" w:hanging="360"/>
+      </w:pPr>
+      <w:rPr>
+        <w:rFonts w:ascii="Wingdings" w:hAnsi="Wingdings" w:hint="default"/>
+        <w:sz w:val="20"/>
+      </w:rPr>
+    </w:lvl>
+    <w:lvl w:ilvl="4" w:tentative="1">
+      <w:start w:val="1"/>
+      <w:numFmt w:val="bullet"/>
+      <w:lvlText w:val=""/>
+      <w:lvlJc w:val="left"/>
+      <w:pPr>
+        <w:tabs>
+          <w:tab w:val="num" w:pos="3600"/>
+        </w:tabs>
+        <w:ind w:left="3600" w:hanging="360"/>
+      </w:pPr>
+      <w:rPr>
+        <w:rFonts w:ascii="Wingdings" w:hAnsi="Wingdings" w:hint="default"/>
+        <w:sz w:val="20"/>
+      </w:rPr>
+    </w:lvl>
+    <w:lvl w:ilvl="5" w:tentative="1">
+      <w:start w:val="1"/>
+      <w:numFmt w:val="bullet"/>
+      <w:lvlText w:val=""/>
+      <w:lvlJc w:val="left"/>
+      <w:pPr>
+        <w:tabs>
+          <w:tab w:val="num" w:pos="4320"/>
+        </w:tabs>
+        <w:ind w:left="4320" w:hanging="360"/>
+      </w:pPr>
+      <w:rPr>
+        <w:rFonts w:ascii="Wingdings" w:hAnsi="Wingdings" w:hint="default"/>
+        <w:sz w:val="20"/>
+      </w:rPr>
+    </w:lvl>
+    <w:lvl w:ilvl="6" w:tentative="1">
+      <w:start w:val="1"/>
+      <w:numFmt w:val="bullet"/>
+      <w:lvlText w:val=""/>
+      <w:lvlJc w:val="left"/>
+      <w:pPr>
+        <w:tabs>
+          <w:tab w:val="num" w:pos="5040"/>
+        </w:tabs>
+        <w:ind w:left="5040" w:hanging="360"/>
+      </w:pPr>
+      <w:rPr>
+        <w:rFonts w:ascii="Wingdings" w:hAnsi="Wingdings" w:hint="default"/>
+        <w:sz w:val="20"/>
+      </w:rPr>
+    </w:lvl>
+    <w:lvl w:ilvl="7" w:tentative="1">
+      <w:start w:val="1"/>
+      <w:numFmt w:val="bullet"/>
+      <w:lvlText w:val=""/>
+      <w:lvlJc w:val="left"/>
+      <w:pPr>
+        <w:tabs>
+          <w:tab w:val="num" w:pos="5760"/>
+        </w:tabs>
+        <w:ind w:left="5760" w:hanging="360"/>
+      </w:pPr>
+      <w:rPr>
+        <w:rFonts w:ascii="Wingdings" w:hAnsi="Wingdings" w:hint="default"/>
+        <w:sz w:val="20"/>
+      </w:rPr>
+    </w:lvl>
+    <w:lvl w:ilvl="8" w:tentative="1">
+      <w:start w:val="1"/>
+      <w:numFmt w:val="bullet"/>
+      <w:lvlText w:val=""/>
+      <w:lvlJc w:val="left"/>
+      <w:pPr>
+        <w:tabs>
+          <w:tab w:val="num" w:pos="6480"/>
+        </w:tabs>
+        <w:ind w:left="6480" w:hanging="360"/>
+      </w:pPr>
+      <w:rPr>
+        <w:rFonts w:ascii="Wingdings" w:hAnsi="Wingdings" w:hint="default"/>
+        <w:sz w:val="20"/>
+      </w:rPr>
+    </w:lvl>
+  </w:abstractNum>
+  <w:abstractNum w:abstractNumId="11" w15:restartNumberingAfterBreak="0">
+    <w:nsid w:val="36157700"/>
+    <w:multiLevelType w:val="multilevel"/>
+    <w:tmpl w:val="1CE6F274"/>
+    <w:lvl w:ilvl="0">
+      <w:start w:val="1"/>
+      <w:numFmt w:val="bullet"/>
+      <w:lvlText w:val=""/>
+      <w:lvlJc w:val="left"/>
+      <w:pPr>
+        <w:tabs>
+          <w:tab w:val="num" w:pos="720"/>
+        </w:tabs>
+        <w:ind w:left="720" w:hanging="360"/>
+      </w:pPr>
+      <w:rPr>
+        <w:rFonts w:ascii="Symbol" w:hAnsi="Symbol" w:hint="default"/>
+        <w:sz w:val="20"/>
+      </w:rPr>
+    </w:lvl>
+    <w:lvl w:ilvl="1" w:tentative="1">
+      <w:start w:val="1"/>
+      <w:numFmt w:val="bullet"/>
+      <w:lvlText w:val="o"/>
+      <w:lvlJc w:val="left"/>
+      <w:pPr>
+        <w:tabs>
+          <w:tab w:val="num" w:pos="1440"/>
+        </w:tabs>
+        <w:ind w:left="1440" w:hanging="360"/>
+      </w:pPr>
+      <w:rPr>
+        <w:rFonts w:ascii="Courier New" w:hAnsi="Courier New" w:hint="default"/>
+        <w:sz w:val="20"/>
+      </w:rPr>
+    </w:lvl>
+    <w:lvl w:ilvl="2" w:tentative="1">
+      <w:start w:val="1"/>
+      <w:numFmt w:val="bullet"/>
+      <w:lvlText w:val=""/>
+      <w:lvlJc w:val="left"/>
+      <w:pPr>
+        <w:tabs>
+          <w:tab w:val="num" w:pos="2160"/>
+        </w:tabs>
+        <w:ind w:left="2160" w:hanging="360"/>
+      </w:pPr>
+      <w:rPr>
+        <w:rFonts w:ascii="Wingdings" w:hAnsi="Wingdings" w:hint="default"/>
+        <w:sz w:val="20"/>
+      </w:rPr>
+    </w:lvl>
+    <w:lvl w:ilvl="3" w:tentative="1">
+      <w:start w:val="1"/>
+      <w:numFmt w:val="bullet"/>
+      <w:lvlText w:val=""/>
+      <w:lvlJc w:val="left"/>
+      <w:pPr>
+        <w:tabs>
+          <w:tab w:val="num" w:pos="2880"/>
+        </w:tabs>
+        <w:ind w:left="2880" w:hanging="360"/>
+      </w:pPr>
+      <w:rPr>
+        <w:rFonts w:ascii="Wingdings" w:hAnsi="Wingdings" w:hint="default"/>
+        <w:sz w:val="20"/>
+      </w:rPr>
+    </w:lvl>
+    <w:lvl w:ilvl="4" w:tentative="1">
+      <w:start w:val="1"/>
+      <w:numFmt w:val="bullet"/>
+      <w:lvlText w:val=""/>
+      <w:lvlJc w:val="left"/>
+      <w:pPr>
+        <w:tabs>
+          <w:tab w:val="num" w:pos="3600"/>
+        </w:tabs>
+        <w:ind w:left="3600" w:hanging="360"/>
+      </w:pPr>
+      <w:rPr>
+        <w:rFonts w:ascii="Wingdings" w:hAnsi="Wingdings" w:hint="default"/>
+        <w:sz w:val="20"/>
+      </w:rPr>
+    </w:lvl>
+    <w:lvl w:ilvl="5" w:tentative="1">
+      <w:start w:val="1"/>
+      <w:numFmt w:val="bullet"/>
+      <w:lvlText w:val=""/>
+      <w:lvlJc w:val="left"/>
+      <w:pPr>
+        <w:tabs>
+          <w:tab w:val="num" w:pos="4320"/>
+        </w:tabs>
+        <w:ind w:left="4320" w:hanging="360"/>
+      </w:pPr>
+      <w:rPr>
+        <w:rFonts w:ascii="Wingdings" w:hAnsi="Wingdings" w:hint="default"/>
+        <w:sz w:val="20"/>
+      </w:rPr>
+    </w:lvl>
+    <w:lvl w:ilvl="6" w:tentative="1">
+      <w:start w:val="1"/>
+      <w:numFmt w:val="bullet"/>
+      <w:lvlText w:val=""/>
+      <w:lvlJc w:val="left"/>
+      <w:pPr>
+        <w:tabs>
+          <w:tab w:val="num" w:pos="5040"/>
+        </w:tabs>
+        <w:ind w:left="5040" w:hanging="360"/>
+      </w:pPr>
+      <w:rPr>
+        <w:rFonts w:ascii="Wingdings" w:hAnsi="Wingdings" w:hint="default"/>
+        <w:sz w:val="20"/>
+      </w:rPr>
+    </w:lvl>
+    <w:lvl w:ilvl="7" w:tentative="1">
+      <w:start w:val="1"/>
+      <w:numFmt w:val="bullet"/>
+      <w:lvlText w:val=""/>
+      <w:lvlJc w:val="left"/>
+      <w:pPr>
+        <w:tabs>
+          <w:tab w:val="num" w:pos="5760"/>
+        </w:tabs>
+        <w:ind w:left="5760" w:hanging="360"/>
+      </w:pPr>
+      <w:rPr>
+        <w:rFonts w:ascii="Wingdings" w:hAnsi="Wingdings" w:hint="default"/>
+        <w:sz w:val="20"/>
+      </w:rPr>
+    </w:lvl>
+    <w:lvl w:ilvl="8" w:tentative="1">
+      <w:start w:val="1"/>
+      <w:numFmt w:val="bullet"/>
+      <w:lvlText w:val=""/>
+      <w:lvlJc w:val="left"/>
+      <w:pPr>
+        <w:tabs>
+          <w:tab w:val="num" w:pos="6480"/>
+        </w:tabs>
+        <w:ind w:left="6480" w:hanging="360"/>
+      </w:pPr>
+      <w:rPr>
+        <w:rFonts w:ascii="Wingdings" w:hAnsi="Wingdings" w:hint="default"/>
+        <w:sz w:val="20"/>
+      </w:rPr>
+    </w:lvl>
+  </w:abstractNum>
+  <w:abstractNum w:abstractNumId="12" w15:restartNumberingAfterBreak="0">
+    <w:nsid w:val="3FB37C26"/>
+    <w:multiLevelType w:val="multilevel"/>
+    <w:tmpl w:val="45C402F8"/>
+    <w:lvl w:ilvl="0">
+      <w:start w:val="1"/>
+      <w:numFmt w:val="bullet"/>
+      <w:lvlText w:val=""/>
+      <w:lvlJc w:val="left"/>
+      <w:pPr>
+        <w:tabs>
+          <w:tab w:val="num" w:pos="720"/>
+        </w:tabs>
+        <w:ind w:left="720" w:hanging="360"/>
+      </w:pPr>
+      <w:rPr>
+        <w:rFonts w:ascii="Symbol" w:hAnsi="Symbol" w:hint="default"/>
+        <w:sz w:val="20"/>
+      </w:rPr>
+    </w:lvl>
+    <w:lvl w:ilvl="1" w:tentative="1">
+      <w:start w:val="1"/>
+      <w:numFmt w:val="bullet"/>
+      <w:lvlText w:val="o"/>
+      <w:lvlJc w:val="left"/>
+      <w:pPr>
+        <w:tabs>
+          <w:tab w:val="num" w:pos="1440"/>
+        </w:tabs>
+        <w:ind w:left="1440" w:hanging="360"/>
+      </w:pPr>
+      <w:rPr>
+        <w:rFonts w:ascii="Courier New" w:hAnsi="Courier New" w:hint="default"/>
+        <w:sz w:val="20"/>
+      </w:rPr>
+    </w:lvl>
+    <w:lvl w:ilvl="2" w:tentative="1">
+      <w:start w:val="1"/>
+      <w:numFmt w:val="bullet"/>
+      <w:lvlText w:val=""/>
+      <w:lvlJc w:val="left"/>
+      <w:pPr>
+        <w:tabs>
+          <w:tab w:val="num" w:pos="2160"/>
+        </w:tabs>
+        <w:ind w:left="2160" w:hanging="360"/>
+      </w:pPr>
+      <w:rPr>
+        <w:rFonts w:ascii="Wingdings" w:hAnsi="Wingdings" w:hint="default"/>
+        <w:sz w:val="20"/>
+      </w:rPr>
+    </w:lvl>
+    <w:lvl w:ilvl="3" w:tentative="1">
+      <w:start w:val="1"/>
+      <w:numFmt w:val="bullet"/>
+      <w:lvlText w:val=""/>
+      <w:lvlJc w:val="left"/>
+      <w:pPr>
+        <w:tabs>
+          <w:tab w:val="num" w:pos="2880"/>
+        </w:tabs>
+        <w:ind w:left="2880" w:hanging="360"/>
+      </w:pPr>
+      <w:rPr>
+        <w:rFonts w:ascii="Wingdings" w:hAnsi="Wingdings" w:hint="default"/>
+        <w:sz w:val="20"/>
+      </w:rPr>
+    </w:lvl>
+    <w:lvl w:ilvl="4" w:tentative="1">
+      <w:start w:val="1"/>
+      <w:numFmt w:val="bullet"/>
+      <w:lvlText w:val=""/>
+      <w:lvlJc w:val="left"/>
+      <w:pPr>
+        <w:tabs>
+          <w:tab w:val="num" w:pos="3600"/>
+        </w:tabs>
+        <w:ind w:left="3600" w:hanging="360"/>
+      </w:pPr>
+      <w:rPr>
+        <w:rFonts w:ascii="Wingdings" w:hAnsi="Wingdings" w:hint="default"/>
+        <w:sz w:val="20"/>
+      </w:rPr>
+    </w:lvl>
+    <w:lvl w:ilvl="5" w:tentative="1">
+      <w:start w:val="1"/>
+      <w:numFmt w:val="bullet"/>
+      <w:lvlText w:val=""/>
+      <w:lvlJc w:val="left"/>
+      <w:pPr>
+        <w:tabs>
+          <w:tab w:val="num" w:pos="4320"/>
+        </w:tabs>
+        <w:ind w:left="4320" w:hanging="360"/>
+      </w:pPr>
+      <w:rPr>
+        <w:rFonts w:ascii="Wingdings" w:hAnsi="Wingdings" w:hint="default"/>
+        <w:sz w:val="20"/>
+      </w:rPr>
+    </w:lvl>
+    <w:lvl w:ilvl="6" w:tentative="1">
+      <w:start w:val="1"/>
+      <w:numFmt w:val="bullet"/>
+      <w:lvlText w:val=""/>
+      <w:lvlJc w:val="left"/>
+      <w:pPr>
+        <w:tabs>
+          <w:tab w:val="num" w:pos="5040"/>
+        </w:tabs>
+        <w:ind w:left="5040" w:hanging="360"/>
+      </w:pPr>
+      <w:rPr>
+        <w:rFonts w:ascii="Wingdings" w:hAnsi="Wingdings" w:hint="default"/>
+        <w:sz w:val="20"/>
+      </w:rPr>
+    </w:lvl>
+    <w:lvl w:ilvl="7" w:tentative="1">
+      <w:start w:val="1"/>
+      <w:numFmt w:val="bullet"/>
+      <w:lvlText w:val=""/>
+      <w:lvlJc w:val="left"/>
+      <w:pPr>
+        <w:tabs>
+          <w:tab w:val="num" w:pos="5760"/>
+        </w:tabs>
+        <w:ind w:left="5760" w:hanging="360"/>
+      </w:pPr>
+      <w:rPr>
+        <w:rFonts w:ascii="Wingdings" w:hAnsi="Wingdings" w:hint="default"/>
+        <w:sz w:val="20"/>
+      </w:rPr>
+    </w:lvl>
+    <w:lvl w:ilvl="8" w:tentative="1">
+      <w:start w:val="1"/>
+      <w:numFmt w:val="bullet"/>
+      <w:lvlText w:val=""/>
+      <w:lvlJc w:val="left"/>
+      <w:pPr>
+        <w:tabs>
+          <w:tab w:val="num" w:pos="6480"/>
+        </w:tabs>
+        <w:ind w:left="6480" w:hanging="360"/>
+      </w:pPr>
+      <w:rPr>
+        <w:rFonts w:ascii="Wingdings" w:hAnsi="Wingdings" w:hint="default"/>
+        <w:sz w:val="20"/>
+      </w:rPr>
+    </w:lvl>
+  </w:abstractNum>
+  <w:abstractNum w:abstractNumId="13" w15:restartNumberingAfterBreak="0">
     <w:nsid w:val="42AD30F7"/>
     <w:multiLevelType w:val="multilevel"/>
     <w:tmpl w:val="52ACE54E"/>
@@ -13234,7 +16560,7 @@
       </w:rPr>
     </w:lvl>
   </w:abstractNum>
-  <w:abstractNum w:abstractNumId="8" w15:restartNumberingAfterBreak="0">
+  <w:abstractNum w:abstractNumId="14" w15:restartNumberingAfterBreak="0">
     <w:nsid w:val="43A67E29"/>
     <w:multiLevelType w:val="multilevel"/>
     <w:tmpl w:val="63D66ACC"/>
@@ -13383,7 +16709,7 @@
       </w:rPr>
     </w:lvl>
   </w:abstractNum>
-  <w:abstractNum w:abstractNumId="9" w15:restartNumberingAfterBreak="0">
+  <w:abstractNum w:abstractNumId="15" w15:restartNumberingAfterBreak="0">
     <w:nsid w:val="4D2C5492"/>
     <w:multiLevelType w:val="multilevel"/>
     <w:tmpl w:val="45567942"/>
@@ -13532,7 +16858,7 @@
       </w:rPr>
     </w:lvl>
   </w:abstractNum>
-  <w:abstractNum w:abstractNumId="10" w15:restartNumberingAfterBreak="0">
+  <w:abstractNum w:abstractNumId="16" w15:restartNumberingAfterBreak="0">
     <w:nsid w:val="55446516"/>
     <w:multiLevelType w:val="multilevel"/>
     <w:tmpl w:val="B922DF9E"/>
@@ -13681,7 +17007,7 @@
       </w:rPr>
     </w:lvl>
   </w:abstractNum>
-  <w:abstractNum w:abstractNumId="11" w15:restartNumberingAfterBreak="0">
+  <w:abstractNum w:abstractNumId="17" w15:restartNumberingAfterBreak="0">
     <w:nsid w:val="55904237"/>
     <w:multiLevelType w:val="multilevel"/>
     <w:tmpl w:val="12BADA70"/>
@@ -13830,7 +17156,7 @@
       </w:rPr>
     </w:lvl>
   </w:abstractNum>
-  <w:abstractNum w:abstractNumId="12" w15:restartNumberingAfterBreak="0">
+  <w:abstractNum w:abstractNumId="18" w15:restartNumberingAfterBreak="0">
     <w:nsid w:val="5BAD4098"/>
     <w:multiLevelType w:val="multilevel"/>
     <w:tmpl w:val="80769DCC"/>
@@ -13943,7 +17269,7 @@
       </w:pPr>
     </w:lvl>
   </w:abstractNum>
-  <w:abstractNum w:abstractNumId="13" w15:restartNumberingAfterBreak="0">
+  <w:abstractNum w:abstractNumId="19" w15:restartNumberingAfterBreak="0">
     <w:nsid w:val="5CFF691B"/>
     <w:multiLevelType w:val="multilevel"/>
     <w:tmpl w:val="DC16CEE6"/>
@@ -14092,7 +17418,7 @@
       </w:rPr>
     </w:lvl>
   </w:abstractNum>
-  <w:abstractNum w:abstractNumId="14" w15:restartNumberingAfterBreak="0">
+  <w:abstractNum w:abstractNumId="20" w15:restartNumberingAfterBreak="0">
     <w:nsid w:val="6E1F6E4C"/>
     <w:multiLevelType w:val="multilevel"/>
     <w:tmpl w:val="5E48611C"/>
@@ -14241,7 +17567,156 @@
       </w:rPr>
     </w:lvl>
   </w:abstractNum>
-  <w:abstractNum w:abstractNumId="15" w15:restartNumberingAfterBreak="0">
+  <w:abstractNum w:abstractNumId="21" w15:restartNumberingAfterBreak="0">
+    <w:nsid w:val="78C5671A"/>
+    <w:multiLevelType w:val="multilevel"/>
+    <w:tmpl w:val="23A848A6"/>
+    <w:lvl w:ilvl="0">
+      <w:start w:val="1"/>
+      <w:numFmt w:val="bullet"/>
+      <w:lvlText w:val=""/>
+      <w:lvlJc w:val="left"/>
+      <w:pPr>
+        <w:tabs>
+          <w:tab w:val="num" w:pos="720"/>
+        </w:tabs>
+        <w:ind w:left="720" w:hanging="360"/>
+      </w:pPr>
+      <w:rPr>
+        <w:rFonts w:ascii="Symbol" w:hAnsi="Symbol" w:hint="default"/>
+        <w:sz w:val="20"/>
+      </w:rPr>
+    </w:lvl>
+    <w:lvl w:ilvl="1" w:tentative="1">
+      <w:start w:val="1"/>
+      <w:numFmt w:val="bullet"/>
+      <w:lvlText w:val="o"/>
+      <w:lvlJc w:val="left"/>
+      <w:pPr>
+        <w:tabs>
+          <w:tab w:val="num" w:pos="1440"/>
+        </w:tabs>
+        <w:ind w:left="1440" w:hanging="360"/>
+      </w:pPr>
+      <w:rPr>
+        <w:rFonts w:ascii="Courier New" w:hAnsi="Courier New" w:hint="default"/>
+        <w:sz w:val="20"/>
+      </w:rPr>
+    </w:lvl>
+    <w:lvl w:ilvl="2" w:tentative="1">
+      <w:start w:val="1"/>
+      <w:numFmt w:val="bullet"/>
+      <w:lvlText w:val=""/>
+      <w:lvlJc w:val="left"/>
+      <w:pPr>
+        <w:tabs>
+          <w:tab w:val="num" w:pos="2160"/>
+        </w:tabs>
+        <w:ind w:left="2160" w:hanging="360"/>
+      </w:pPr>
+      <w:rPr>
+        <w:rFonts w:ascii="Wingdings" w:hAnsi="Wingdings" w:hint="default"/>
+        <w:sz w:val="20"/>
+      </w:rPr>
+    </w:lvl>
+    <w:lvl w:ilvl="3" w:tentative="1">
+      <w:start w:val="1"/>
+      <w:numFmt w:val="bullet"/>
+      <w:lvlText w:val=""/>
+      <w:lvlJc w:val="left"/>
+      <w:pPr>
+        <w:tabs>
+          <w:tab w:val="num" w:pos="2880"/>
+        </w:tabs>
+        <w:ind w:left="2880" w:hanging="360"/>
+      </w:pPr>
+      <w:rPr>
+        <w:rFonts w:ascii="Wingdings" w:hAnsi="Wingdings" w:hint="default"/>
+        <w:sz w:val="20"/>
+      </w:rPr>
+    </w:lvl>
+    <w:lvl w:ilvl="4" w:tentative="1">
+      <w:start w:val="1"/>
+      <w:numFmt w:val="bullet"/>
+      <w:lvlText w:val=""/>
+      <w:lvlJc w:val="left"/>
+      <w:pPr>
+        <w:tabs>
+          <w:tab w:val="num" w:pos="3600"/>
+        </w:tabs>
+        <w:ind w:left="3600" w:hanging="360"/>
+      </w:pPr>
+      <w:rPr>
+        <w:rFonts w:ascii="Wingdings" w:hAnsi="Wingdings" w:hint="default"/>
+        <w:sz w:val="20"/>
+      </w:rPr>
+    </w:lvl>
+    <w:lvl w:ilvl="5" w:tentative="1">
+      <w:start w:val="1"/>
+      <w:numFmt w:val="bullet"/>
+      <w:lvlText w:val=""/>
+      <w:lvlJc w:val="left"/>
+      <w:pPr>
+        <w:tabs>
+          <w:tab w:val="num" w:pos="4320"/>
+        </w:tabs>
+        <w:ind w:left="4320" w:hanging="360"/>
+      </w:pPr>
+      <w:rPr>
+        <w:rFonts w:ascii="Wingdings" w:hAnsi="Wingdings" w:hint="default"/>
+        <w:sz w:val="20"/>
+      </w:rPr>
+    </w:lvl>
+    <w:lvl w:ilvl="6" w:tentative="1">
+      <w:start w:val="1"/>
+      <w:numFmt w:val="bullet"/>
+      <w:lvlText w:val=""/>
+      <w:lvlJc w:val="left"/>
+      <w:pPr>
+        <w:tabs>
+          <w:tab w:val="num" w:pos="5040"/>
+        </w:tabs>
+        <w:ind w:left="5040" w:hanging="360"/>
+      </w:pPr>
+      <w:rPr>
+        <w:rFonts w:ascii="Wingdings" w:hAnsi="Wingdings" w:hint="default"/>
+        <w:sz w:val="20"/>
+      </w:rPr>
+    </w:lvl>
+    <w:lvl w:ilvl="7" w:tentative="1">
+      <w:start w:val="1"/>
+      <w:numFmt w:val="bullet"/>
+      <w:lvlText w:val=""/>
+      <w:lvlJc w:val="left"/>
+      <w:pPr>
+        <w:tabs>
+          <w:tab w:val="num" w:pos="5760"/>
+        </w:tabs>
+        <w:ind w:left="5760" w:hanging="360"/>
+      </w:pPr>
+      <w:rPr>
+        <w:rFonts w:ascii="Wingdings" w:hAnsi="Wingdings" w:hint="default"/>
+        <w:sz w:val="20"/>
+      </w:rPr>
+    </w:lvl>
+    <w:lvl w:ilvl="8" w:tentative="1">
+      <w:start w:val="1"/>
+      <w:numFmt w:val="bullet"/>
+      <w:lvlText w:val=""/>
+      <w:lvlJc w:val="left"/>
+      <w:pPr>
+        <w:tabs>
+          <w:tab w:val="num" w:pos="6480"/>
+        </w:tabs>
+        <w:ind w:left="6480" w:hanging="360"/>
+      </w:pPr>
+      <w:rPr>
+        <w:rFonts w:ascii="Wingdings" w:hAnsi="Wingdings" w:hint="default"/>
+        <w:sz w:val="20"/>
+      </w:rPr>
+    </w:lvl>
+  </w:abstractNum>
+  <w:abstractNum w:abstractNumId="22" w15:restartNumberingAfterBreak="0">
     <w:nsid w:val="7A641D98"/>
     <w:multiLevelType w:val="hybridMultilevel"/>
     <w:tmpl w:val="C45CB6F2"/>
@@ -14334,49 +17809,70 @@
     <w:abstractNumId w:val="0"/>
   </w:num>
   <w:num w:numId="2" w16cid:durableId="819615453">
+    <w:abstractNumId w:val="15"/>
+  </w:num>
+  <w:num w:numId="3" w16cid:durableId="1529876881">
     <w:abstractNumId w:val="9"/>
   </w:num>
-  <w:num w:numId="3" w16cid:durableId="1529876881">
+  <w:num w:numId="4" w16cid:durableId="256251990">
+    <w:abstractNumId w:val="2"/>
+  </w:num>
+  <w:num w:numId="5" w16cid:durableId="432669033">
+    <w:abstractNumId w:val="16"/>
+  </w:num>
+  <w:num w:numId="6" w16cid:durableId="843864044">
+    <w:abstractNumId w:val="8"/>
+  </w:num>
+  <w:num w:numId="7" w16cid:durableId="1246576682">
+    <w:abstractNumId w:val="14"/>
+  </w:num>
+  <w:num w:numId="8" w16cid:durableId="1310285969">
+    <w:abstractNumId w:val="13"/>
+  </w:num>
+  <w:num w:numId="9" w16cid:durableId="1813252098">
+    <w:abstractNumId w:val="20"/>
+  </w:num>
+  <w:num w:numId="10" w16cid:durableId="1747995714">
+    <w:abstractNumId w:val="19"/>
+  </w:num>
+  <w:num w:numId="11" w16cid:durableId="646082709">
+    <w:abstractNumId w:val="22"/>
+  </w:num>
+  <w:num w:numId="12" w16cid:durableId="1565677331">
+    <w:abstractNumId w:val="17"/>
+  </w:num>
+  <w:num w:numId="13" w16cid:durableId="960263906">
+    <w:abstractNumId w:val="3"/>
+  </w:num>
+  <w:num w:numId="14" w16cid:durableId="460422398">
+    <w:abstractNumId w:val="18"/>
+  </w:num>
+  <w:num w:numId="15" w16cid:durableId="1825272573">
+    <w:abstractNumId w:val="4"/>
+  </w:num>
+  <w:num w:numId="16" w16cid:durableId="491411117">
+    <w:abstractNumId w:val="7"/>
+  </w:num>
+  <w:num w:numId="17" w16cid:durableId="911702037">
     <w:abstractNumId w:val="6"/>
   </w:num>
-  <w:num w:numId="4" w16cid:durableId="256251990">
+  <w:num w:numId="18" w16cid:durableId="459079884">
     <w:abstractNumId w:val="1"/>
   </w:num>
-  <w:num w:numId="5" w16cid:durableId="432669033">
-    <w:abstractNumId w:val="10"/>
+  <w:num w:numId="19" w16cid:durableId="158079699">
+    <w:abstractNumId w:val="11"/>
   </w:num>
-  <w:num w:numId="6" w16cid:durableId="843864044">
+  <w:num w:numId="20" w16cid:durableId="584000680">
+    <w:abstractNumId w:val="12"/>
+  </w:num>
+  <w:num w:numId="21" w16cid:durableId="764424018">
+    <w:abstractNumId w:val="21"/>
+  </w:num>
+  <w:num w:numId="22" w16cid:durableId="1473214593">
     <w:abstractNumId w:val="5"/>
   </w:num>
-  <w:num w:numId="7" w16cid:durableId="1246576682">
-    <w:abstractNumId w:val="8"/>
-  </w:num>
-  <w:num w:numId="8" w16cid:durableId="1310285969">
-    <w:abstractNumId w:val="7"/>
-  </w:num>
-  <w:num w:numId="9" w16cid:durableId="1813252098">
-    <w:abstractNumId w:val="14"/>
-  </w:num>
-  <w:num w:numId="10" w16cid:durableId="1747995714">
-    <w:abstractNumId w:val="13"/>
-  </w:num>
-  <w:num w:numId="11" w16cid:durableId="646082709">
-    <w:abstractNumId w:val="15"/>
-  </w:num>
-  <w:num w:numId="12" w16cid:durableId="1565677331">
-    <w:abstractNumId w:val="11"/>
-  </w:num>
-  <w:num w:numId="13" w16cid:durableId="960263906">
-    <w:abstractNumId w:val="2"/>
-  </w:num>
-  <w:num w:numId="14" w16cid:durableId="460422398">
-    <w:abstractNumId w:val="12"/>
-  </w:num>
-  <w:num w:numId="15" w16cid:durableId="1825272573">
-    <w:abstractNumId w:val="3"/>
-  </w:num>
-  <w:num w:numId="16" w16cid:durableId="491411117">
-    <w:abstractNumId w:val="4"/>
+  <w:num w:numId="23" w16cid:durableId="1850370940">
+    <w:abstractNumId w:val="10"/>
   </w:num>
 </w:numbering>
 </file>
@@ -14777,7 +18273,7 @@
   <w:style w:type="paragraph" w:default="1" w:styleId="Normln">
     <w:name w:val="Normal"/>
     <w:qFormat/>
-    <w:rsid w:val="00630C39"/>
+    <w:rsid w:val="001264B2"/>
     <w:rPr>
       <w:rFonts w:ascii="Times New Roman" w:eastAsia="Times New Roman" w:hAnsi="Times New Roman" w:cs="Times New Roman"/>
       <w:kern w:val="0"/>
@@ -14843,7 +18339,6 @@
   <w:style w:type="character" w:default="1" w:styleId="Standardnpsmoodstavce">
     <w:name w:val="Default Paragraph Font"/>
     <w:uiPriority w:val="1"/>
-    <w:semiHidden/>
     <w:unhideWhenUsed/>
   </w:style>
   <w:style w:type="table" w:default="1" w:styleId="Normlntabulka">
@@ -15063,6 +18558,22 @@
     <w:name w:val="ͼk"/>
     <w:basedOn w:val="Standardnpsmoodstavce"/>
     <w:rsid w:val="00F1641D"/>
+  </w:style>
+  <w:style w:type="table" w:styleId="Svtlmkatabulky">
+    <w:name w:val="Grid Table Light"/>
+    <w:basedOn w:val="Normlntabulka"/>
+    <w:uiPriority w:val="40"/>
+    <w:rsid w:val="008E347D"/>
+    <w:tblPr>
+      <w:tblBorders>
+        <w:top w:val="single" w:sz="4" w:space="0" w:color="BFBFBF" w:themeColor="background1" w:themeShade="BF"/>
+        <w:left w:val="single" w:sz="4" w:space="0" w:color="BFBFBF" w:themeColor="background1" w:themeShade="BF"/>
+        <w:bottom w:val="single" w:sz="4" w:space="0" w:color="BFBFBF" w:themeColor="background1" w:themeShade="BF"/>
+        <w:right w:val="single" w:sz="4" w:space="0" w:color="BFBFBF" w:themeColor="background1" w:themeShade="BF"/>
+        <w:insideH w:val="single" w:sz="4" w:space="0" w:color="BFBFBF" w:themeColor="background1" w:themeShade="BF"/>
+        <w:insideV w:val="single" w:sz="4" w:space="0" w:color="BFBFBF" w:themeColor="background1" w:themeShade="BF"/>
+      </w:tblBorders>
+    </w:tblPr>
   </w:style>
 </w:styles>
 </file>

</xml_diff>